<commit_message>
Expand LonghornERP industrial architecture and modules
</commit_message>
<xml_diff>
--- a/projects/LonghornERP/01-strategic-vision/LonghornERP_PRD.docx
+++ b/projects/LonghornERP/01-strategic-vision/LonghornERP_PRD.docx
@@ -1862,7 +1862,7 @@
     </w:p>
     <w:bookmarkEnd w:id="40"/>
     <w:bookmarkEnd w:id="41"/>
-    <w:bookmarkStart w:id="47" w:name="module-overview"/>
+    <w:bookmarkStart w:id="48" w:name="module-overview"/>
     <w:p>
       <w:pPr>
         <w:pStyle w:val="Heading1"/>
@@ -1885,17 +1885,17 @@
         <w:pStyle w:val="FirstParagraph"/>
       </w:pPr>
       <w:r>
-        <w:t xml:space="preserve">All modules are universal. Localisation behaviour — country-specific tax rules, statutory integrations, currency handling, regulatory workflows, and chart of accounts defaults — is determined by the tenant's configuration profile, not by module variants. A Ugandan manufacturer and a Kenyan NGO activate modules from the same codebase; their statutory and currency behaviour differs because their localisation profiles differ.</w:t>
+        <w:t xml:space="preserve">All modules are universal. Localisation behaviour - country-specific tax rules, statutory integrations, currency handling, regulatory workflows, and chart of accounts defaults - is determined by the tenant's configuration profile, not by module variants. A Ugandan manufacturer and a Kenyan NGO activate modules from the same codebase; their statutory and currency behaviour differs because their localisation profiles differ.</w:t>
       </w:r>
     </w:p>
     <w:bookmarkEnd w:id="42"/>
-    <w:bookmarkStart w:id="43" w:name="Xac84ef527eb1afe589a0ffbb1c99b9622df5d0f"/>
+    <w:bookmarkStart w:id="43" w:name="X5a4534ca97991910ffad6b8328119e3bfecd783"/>
     <w:p>
       <w:pPr>
         <w:pStyle w:val="Heading2"/>
       </w:pPr>
       <w:r>
-        <w:t xml:space="preserve">Core Modules (Always Active — Cannot Be Disabled)</w:t>
+        <w:t xml:space="preserve">Core Modules (Always Active - Cannot Be Disabled)</w:t>
       </w:r>
     </w:p>
     <w:tbl>
@@ -2306,7 +2306,7 @@
               <w:pStyle w:val="Compact"/>
             </w:pPr>
             <w:r>
-              <w:t xml:space="preserve">Bill of Materials (BOM) with versions, production orders, raw material issue, Work in Progress (WIP), yield/variance, by-products, QC checkpoints, scrap, overhead absorption, production costing</w:t>
+              <w:t xml:space="preserve">Bill of Materials (BOM) with versions, routings, work centres, production orders, raw material issue, Work in Progress (WIP), operation tracking, genealogy, in-process quality, rework, downtime capture, Overall Equipment Effectiveness (OEE), yield/variance, by-products, scrap, overhead absorption, production costing</w:t>
             </w:r>
           </w:p>
         </w:tc>
@@ -2610,20 +2610,143 @@
               <w:pStyle w:val="Compact"/>
             </w:pPr>
             <w:r>
-              <w:t xml:space="preserve">Asset register, depreciation (straight-line/reducing-balance), revaluation, disposal with gain/loss, transfer, maintenance scheduling, insurance, QR/barcode tagging, physical verification</w:t>
+              <w:t xml:space="preserve">Asset register, depreciation (straight-line/reducing-balance), revaluation, disposal with gain/loss, transfer, maintenance scheduling, insurance, QR/barcode tagging, physical verification, and vehicle capital-asset control. Transport dispatch and live fleet operations are handled in</w:t>
+            </w:r>
+            <w:r>
+              <w:t xml:space="preserve"> </w:t>
+            </w:r>
+            <w:r>
+              <w:rPr>
+                <w:rStyle w:val="VerbatimChar"/>
+              </w:rPr>
+              <w:t xml:space="preserve">TRANSPORTATION</w:t>
+            </w:r>
+          </w:p>
+        </w:tc>
+      </w:tr>
+      <w:tr>
+        <w:tc>
+          <w:tcPr/>
+          <w:p>
+            <w:pPr>
+              <w:pStyle w:val="Compact"/>
+            </w:pPr>
+            <w:r>
+              <w:rPr>
+                <w:rStyle w:val="VerbatimChar"/>
+              </w:rPr>
+              <w:t xml:space="preserve">AI_INTELLIGENCE</w:t>
+            </w:r>
+          </w:p>
+        </w:tc>
+        <w:tc>
+          <w:tcPr/>
+          <w:p>
+            <w:pPr>
+              <w:pStyle w:val="Compact"/>
+            </w:pPr>
+            <w:r>
+              <w:t xml:space="preserve">AI Intelligence</w:t>
+            </w:r>
+          </w:p>
+        </w:tc>
+        <w:tc>
+          <w:tcPr/>
+          <w:p>
+            <w:pPr>
+              <w:pStyle w:val="Compact"/>
+            </w:pPr>
+            <w:r>
+              <w:t xml:space="preserve">Cash flow forecasting, GL anomaly detection, demand forecasting, debtor risk scoring, and narrative financial reports. Paid add-on available on Professional plans and above; off by default</w:t>
+            </w:r>
+          </w:p>
+        </w:tc>
+      </w:tr>
+      <w:tr>
+        <w:tc>
+          <w:tcPr/>
+          <w:p>
+            <w:pPr>
+              <w:pStyle w:val="Compact"/>
+            </w:pPr>
+            <w:r>
+              <w:rPr>
+                <w:rStyle w:val="VerbatimChar"/>
+              </w:rPr>
+              <w:t xml:space="preserve">PLM</w:t>
+            </w:r>
+          </w:p>
+        </w:tc>
+        <w:tc>
+          <w:tcPr/>
+          <w:p>
+            <w:pPr>
+              <w:pStyle w:val="Compact"/>
+            </w:pPr>
+            <w:r>
+              <w:t xml:space="preserve">Product Lifecycle Management</w:t>
+            </w:r>
+          </w:p>
+        </w:tc>
+        <w:tc>
+          <w:tcPr/>
+          <w:p>
+            <w:pPr>
+              <w:pStyle w:val="Compact"/>
+            </w:pPr>
+            <w:r>
+              <w:t xml:space="preserve">Engineering item master, revision control, EBOM/MBOM governance, engineering change workflow, effectivity control, NPI stage gates, document control, compliance evidence, and digital-thread release to downstream modules</w:t>
+            </w:r>
+          </w:p>
+        </w:tc>
+      </w:tr>
+      <w:tr>
+        <w:tc>
+          <w:tcPr/>
+          <w:p>
+            <w:pPr>
+              <w:pStyle w:val="Compact"/>
+            </w:pPr>
+            <w:r>
+              <w:rPr>
+                <w:rStyle w:val="VerbatimChar"/>
+              </w:rPr>
+              <w:t xml:space="preserve">TRANSPORTATION</w:t>
+            </w:r>
+          </w:p>
+        </w:tc>
+        <w:tc>
+          <w:tcPr/>
+          <w:p>
+            <w:pPr>
+              <w:pStyle w:val="Compact"/>
+            </w:pPr>
+            <w:r>
+              <w:t xml:space="preserve">Transportation &amp; Fleet Operations</w:t>
+            </w:r>
+          </w:p>
+        </w:tc>
+        <w:tc>
+          <w:tcPr/>
+          <w:p>
+            <w:pPr>
+              <w:pStyle w:val="Compact"/>
+            </w:pPr>
+            <w:r>
+              <w:t xml:space="preserve">Shipment planning, route and load planning, dispatch, carrier or internal-fleet assignment, ETA and milestone visibility, proof of delivery, exception management, freight audit, transport analytics, driver assignment, and telematics-ready fleet operations</w:t>
             </w:r>
           </w:p>
         </w:tc>
       </w:tr>
     </w:tbl>
     <w:bookmarkEnd w:id="44"/>
-    <w:bookmarkStart w:id="45" w:name="Xf1d2ce79e8029ea2712f267be7e62730f7d5d27"/>
+    <w:bookmarkStart w:id="45" w:name="X602ef97051035c3448bb3919fae3805b65883f8"/>
     <w:p>
       <w:pPr>
         <w:pStyle w:val="Heading2"/>
       </w:pPr>
       <w:r>
-        <w:t xml:space="preserve">Platform Services (Always Active — Not User-Facing Modules)</w:t>
+        <w:t xml:space="preserve">Platform Services (Always Active - Not User-Facing Modules)</w:t>
       </w:r>
     </w:p>
     <w:p>
@@ -2716,7 +2839,7 @@
               <w:pStyle w:val="Compact"/>
             </w:pPr>
             <w:r>
-              <w:t xml:space="preserve">Configuration-driven localisation: currency, language, tax, statutory, Chart of Accounts (COA) starter, address format, invoice legal text, mobile money gateway — per tenant, no code changes per market</w:t>
+              <w:t xml:space="preserve">Configuration-driven localisation: currency, language, tax, statutory, Chart of Accounts (COA) starter, address format, invoice legal text, mobile money gateway - per tenant, no code changes per market</w:t>
             </w:r>
           </w:p>
         </w:tc>
@@ -2830,7 +2953,7 @@
               <w:pStyle w:val="Compact"/>
             </w:pPr>
             <w:r>
-              <w:t xml:space="preserve">Subscription plans, a-la-carte add-ons, annual billing, payment via card/bank/MTN MoMo/M-Pesa, tenant lifecycle management (Trial → Active → Overdue → Suspended → Archived)</w:t>
+              <w:t xml:space="preserve">Subscription plans, a-la-carte add-ons, annual billing, payment via card/bank/MTN MoMo/M-Pesa, tenant lifecycle management (Trial -&gt; Active -&gt; Overdue -&gt; Suspended -&gt; Archived)</w:t>
             </w:r>
           </w:p>
         </w:tc>
@@ -2926,7 +3049,7 @@
               <w:pStyle w:val="Compact"/>
             </w:pPr>
             <w:r>
-              <w:t xml:space="preserve">10</w:t>
+              <w:t xml:space="preserve">13</w:t>
             </w:r>
           </w:p>
         </w:tc>
@@ -2982,15 +3105,104 @@
                 <w:b/>
                 <w:bCs/>
               </w:rPr>
-              <w:t xml:space="preserve">20</w:t>
+              <w:t xml:space="preserve">23</w:t>
             </w:r>
           </w:p>
         </w:tc>
       </w:tr>
     </w:tbl>
     <w:bookmarkEnd w:id="46"/>
+    <w:bookmarkStart w:id="47" w:name="strategic-depth-note"/>
+    <w:p>
+      <w:pPr>
+        <w:pStyle w:val="Heading2"/>
+      </w:pPr>
+      <w:r>
+        <w:t xml:space="preserve">Strategic Depth Note</w:t>
+      </w:r>
+    </w:p>
+    <w:p>
+      <w:pPr>
+        <w:pStyle w:val="FirstParagraph"/>
+      </w:pPr>
+      <w:r>
+        <w:t xml:space="preserve">Longhorn ERP is intended to compete credibly for both small and large African organisations that make, move, and service physical goods. For that reason, three capability boundaries are explicit in the product architecture:</w:t>
+      </w:r>
+    </w:p>
+    <w:p>
+      <w:pPr>
+        <w:pStyle w:val="Compact"/>
+        <w:numPr>
+          <w:ilvl w:val="0"/>
+          <w:numId w:val="1003"/>
+        </w:numPr>
+      </w:pPr>
+      <w:r>
+        <w:rPr>
+          <w:rStyle w:val="VerbatimChar"/>
+        </w:rPr>
+        <w:t xml:space="preserve">PLM</w:t>
+      </w:r>
+      <w:r>
+        <w:t xml:space="preserve"> </w:t>
+      </w:r>
+      <w:r>
+        <w:t xml:space="preserve">owns engineering truth: released revisions, engineering changes, technical documents, effectivity, and product lifecycle governance.</w:t>
+      </w:r>
+    </w:p>
+    <w:p>
+      <w:pPr>
+        <w:pStyle w:val="Compact"/>
+        <w:numPr>
+          <w:ilvl w:val="0"/>
+          <w:numId w:val="1003"/>
+        </w:numPr>
+      </w:pPr>
+      <w:r>
+        <w:rPr>
+          <w:rStyle w:val="VerbatimChar"/>
+        </w:rPr>
+        <w:t xml:space="preserve">MANUFACTURING</w:t>
+      </w:r>
+      <w:r>
+        <w:t xml:space="preserve"> </w:t>
+      </w:r>
+      <w:r>
+        <w:t xml:space="preserve">owns production planning, shop-floor execution, costing, quality execution, and operational performance.</w:t>
+      </w:r>
+    </w:p>
+    <w:p>
+      <w:pPr>
+        <w:pStyle w:val="Compact"/>
+        <w:numPr>
+          <w:ilvl w:val="0"/>
+          <w:numId w:val="1003"/>
+        </w:numPr>
+      </w:pPr>
+      <w:r>
+        <w:rPr>
+          <w:rStyle w:val="VerbatimChar"/>
+        </w:rPr>
+        <w:t xml:space="preserve">TRANSPORTATION</w:t>
+      </w:r>
+      <w:r>
+        <w:t xml:space="preserve"> </w:t>
+      </w:r>
+      <w:r>
+        <w:t xml:space="preserve">owns shipment planning, dispatch, route execution, transport visibility, and live fleet operations.</w:t>
+      </w:r>
+    </w:p>
+    <w:p>
+      <w:pPr>
+        <w:pStyle w:val="FirstParagraph"/>
+      </w:pPr>
+      <w:r>
+        <w:t xml:space="preserve">These boundaries are deliberate. They prevent engineering control, shop-floor execution, and transport operations from collapsing into one oversized module with weak governance.</w:t>
+      </w:r>
+    </w:p>
     <w:bookmarkEnd w:id="47"/>
-    <w:bookmarkStart w:id="56" w:name="competitive-positioning"/>
+    <w:bookmarkEnd w:id="48"/>
+    <w:bookmarkStart w:id="57" w:name="competitive-positioning"/>
     <w:p>
       <w:pPr>
         <w:pStyle w:val="Heading1"/>
@@ -2999,7 +3211,7 @@
         <w:t xml:space="preserve">Competitive Positioning</w:t>
       </w:r>
     </w:p>
-    <w:bookmarkStart w:id="48" w:name="market-context"/>
+    <w:bookmarkStart w:id="49" w:name="market-context"/>
     <w:p>
       <w:pPr>
         <w:pStyle w:val="Heading2"/>
@@ -3024,8 +3236,8 @@
         <w:t xml:space="preserve">The full cost comparison table appears in Section 2. The following analysis expands on the five key competitive advantages.</w:t>
       </w:r>
     </w:p>
-    <w:bookmarkEnd w:id="48"/>
-    <w:bookmarkStart w:id="54" w:name="X76c8c33d32d5c0e3360f8ab11a513094d3223d5"/>
+    <w:bookmarkEnd w:id="49"/>
+    <w:bookmarkStart w:id="55" w:name="X76c8c33d32d5c0e3360f8ab11a513094d3223d5"/>
     <w:p>
       <w:pPr>
         <w:pStyle w:val="Heading2"/>
@@ -3034,7 +3246,7 @@
         <w:t xml:space="preserve">5 Key Competitive Advantages</w:t>
       </w:r>
     </w:p>
-    <w:bookmarkStart w:id="49" w:name="X46c69c95a0b55c263e712b76e07e6245d46b018"/>
+    <w:bookmarkStart w:id="50" w:name="X46c69c95a0b55c263e712b76e07e6245d46b018"/>
     <w:p>
       <w:pPr>
         <w:pStyle w:val="Heading3"/>
@@ -3051,8 +3263,8 @@
         <w:t xml:space="preserve">Longhorn ERP is priced in Ugandan Shillings. Competitors bill in USD or EUR, exposing clients to exchange rate fluctuation. For a Ugandan organisation with UGX revenue, a USD-denominated SaaS subscription is a currency risk as well as a cost. Longhorn ERP removes this entirely.</w:t>
       </w:r>
     </w:p>
-    <w:bookmarkEnd w:id="49"/>
-    <w:bookmarkStart w:id="50" w:name="X71f737682fe7201dc17de9580c7b5d6a20f0a69"/>
+    <w:bookmarkEnd w:id="50"/>
+    <w:bookmarkStart w:id="51" w:name="X71f737682fe7201dc17de9580c7b5d6a20f0a69"/>
     <w:p>
       <w:pPr>
         <w:pStyle w:val="Heading3"/>
@@ -3069,8 +3281,8 @@
         <w:t xml:space="preserve">Every subscription tier covers the entire organisation at a flat monthly rate. A company adding its 16th user pays nothing more than a company with 15. This is the primary structural differentiator versus Odoo, Dynamics, and NetSuite, all of which charge per named user. An organisation growing from 15 to 30 employees on Longhorn ERP sees zero incremental cost until it crosses a tier threshold.</w:t>
       </w:r>
     </w:p>
-    <w:bookmarkEnd w:id="50"/>
-    <w:bookmarkStart w:id="51" w:name="X8b49be4ded8a60af879d601a7d09652a6133cee"/>
+    <w:bookmarkEnd w:id="51"/>
+    <w:bookmarkStart w:id="52" w:name="X8b49be4ded8a60af879d601a7d09652a6133cee"/>
     <w:p>
       <w:pPr>
         <w:pStyle w:val="Heading3"/>
@@ -3087,8 +3299,8 @@
         <w:t xml:space="preserve">The Golden Rule governs every interface design decision. No onboarding consultant, no training day, and no user manual is required before a new employee can perform their role in the system. This is enforced through a ≥ 85% unassisted task success rate requirement on 5 benchmark tasks. Competitors with complex configuration UIs, multi-step wizards, and role-based menus that require administrator setup cannot make this claim.</w:t>
       </w:r>
     </w:p>
-    <w:bookmarkEnd w:id="51"/>
-    <w:bookmarkStart w:id="52" w:name="Xddf462855bdb8a79e019aa4bfa067b53af6097b"/>
+    <w:bookmarkEnd w:id="52"/>
+    <w:bookmarkStart w:id="53" w:name="Xddf462855bdb8a79e019aa4bfa067b53af6097b"/>
     <w:p>
       <w:pPr>
         <w:pStyle w:val="Heading3"/>
@@ -3105,8 +3317,8 @@
         <w:t xml:space="preserve">Longhorn ERP ships with native integrations for EFRIS (Uganda VAT invoicing), MTN MoMo (Uganda, Rwanda), Airtel Money (Uganda, Kenya, Tanzania), and M-Pesa Daraja B2C (Kenya, Tanzania). No international competitor offers these integrations out of the box. A Ugandan organisation using SAP or NetSuite must build or buy these integrations separately.</w:t>
       </w:r>
     </w:p>
-    <w:bookmarkEnd w:id="52"/>
-    <w:bookmarkStart w:id="53" w:name="X6c74a3168e57cc811916e793323e24e67ba5808"/>
+    <w:bookmarkEnd w:id="53"/>
+    <w:bookmarkStart w:id="54" w:name="X6c74a3168e57cc811916e793323e24e67ba5808"/>
     <w:p>
       <w:pPr>
         <w:pStyle w:val="Heading3"/>
@@ -3123,9 +3335,9 @@
         <w:t xml:space="preserve">Longhorn ERP is a fully managed SaaS platform. There is no on-premise installation, no server procurement, no database configuration, and no implementation project. A new tenant is provisioned and live in ≤ 10 minutes. The total cost from purchase decision to first live transaction is one subscription payment.</w:t>
       </w:r>
     </w:p>
-    <w:bookmarkEnd w:id="53"/>
     <w:bookmarkEnd w:id="54"/>
-    <w:bookmarkStart w:id="55" w:name="positioning-summary"/>
+    <w:bookmarkEnd w:id="55"/>
+    <w:bookmarkStart w:id="56" w:name="positioning-summary"/>
     <w:p>
       <w:pPr>
         <w:pStyle w:val="Heading2"/>
@@ -3472,9 +3684,9 @@
         </w:tc>
       </w:tr>
     </w:tbl>
-    <w:bookmarkEnd w:id="55"/>
     <w:bookmarkEnd w:id="56"/>
-    <w:bookmarkStart w:id="64" w:name="revenue-model"/>
+    <w:bookmarkEnd w:id="57"/>
+    <w:bookmarkStart w:id="65" w:name="revenue-model"/>
     <w:p>
       <w:pPr>
         <w:pStyle w:val="Heading1"/>
@@ -3483,7 +3695,7 @@
         <w:t xml:space="preserve">Revenue Model</w:t>
       </w:r>
     </w:p>
-    <w:bookmarkStart w:id="57" w:name="subscription-tiers"/>
+    <w:bookmarkStart w:id="58" w:name="subscription-tiers"/>
     <w:p>
       <w:pPr>
         <w:pStyle w:val="Heading2"/>
@@ -3950,8 +4162,8 @@
         <w:t xml:space="preserve">Starter locks out all add-on modules. Upgrade to Small Business or above to activate add-ons.</w:t>
       </w:r>
     </w:p>
-    <w:bookmarkEnd w:id="57"/>
-    <w:bookmarkStart w:id="58" w:name="annual-billing-incentive"/>
+    <w:bookmarkEnd w:id="58"/>
+    <w:bookmarkStart w:id="59" w:name="annual-billing-incentive"/>
     <w:p>
       <w:pPr>
         <w:pStyle w:val="Heading2"/>
@@ -4088,8 +4300,8 @@
         </w:tc>
       </w:tr>
     </w:tbl>
-    <w:bookmarkEnd w:id="58"/>
-    <w:bookmarkStart w:id="59" w:name="a-la-carte-add-on-pricing"/>
+    <w:bookmarkEnd w:id="59"/>
+    <w:bookmarkStart w:id="60" w:name="a-la-carte-add-on-pricing"/>
     <w:p>
       <w:pPr>
         <w:pStyle w:val="Heading2"/>
@@ -4506,8 +4718,8 @@
         </w:tc>
       </w:tr>
     </w:tbl>
-    <w:bookmarkEnd w:id="59"/>
-    <w:bookmarkStart w:id="60" w:name="add-on-stacking-upgrade-trigger"/>
+    <w:bookmarkEnd w:id="60"/>
+    <w:bookmarkStart w:id="61" w:name="add-on-stacking-upgrade-trigger"/>
     <w:p>
       <w:pPr>
         <w:pStyle w:val="Heading2"/>
@@ -4522,68 +4734,6 @@
       </w:pPr>
       <w:r>
         <w:t xml:space="preserve">A Professional plan tenant activating all 10 add-ons would pay:</w:t>
-      </w:r>
-    </w:p>
-    <w:p>
-      <w:pPr>
-        <w:pStyle w:val="Compact"/>
-        <w:numPr>
-          <w:ilvl w:val="0"/>
-          <w:numId w:val="1003"/>
-        </w:numPr>
-      </w:pPr>
-      <w:r>
-        <w:t xml:space="preserve">Professional base: UGX 1,000,000/month</w:t>
-      </w:r>
-    </w:p>
-    <w:p>
-      <w:pPr>
-        <w:pStyle w:val="Compact"/>
-        <w:numPr>
-          <w:ilvl w:val="0"/>
-          <w:numId w:val="1003"/>
-        </w:numPr>
-      </w:pPr>
-      <w:r>
-        <w:t xml:space="preserve">All add-ons (POS counted as 1 terminal): UGX 1,490,000/month</w:t>
-      </w:r>
-    </w:p>
-    <w:p>
-      <w:pPr>
-        <w:pStyle w:val="Compact"/>
-        <w:numPr>
-          <w:ilvl w:val="0"/>
-          <w:numId w:val="1003"/>
-        </w:numPr>
-      </w:pPr>
-      <w:r>
-        <w:t xml:space="preserve">Total: UGX 2,490,000/month</w:t>
-      </w:r>
-    </w:p>
-    <w:p>
-      <w:pPr>
-        <w:pStyle w:val="FirstParagraph"/>
-      </w:pPr>
-      <w:r>
-        <w:t xml:space="preserve">This is UGX 10,000 below the Enterprise plan price of UGX 2,500,000/month. The system shall detect when a tenant's combined subscription cost (base + add-ons) reaches ≥ 95% of the next tier price and display a contextual upgrade prompt offering the higher tier for the price difference, with the benefit of unlimited users, unlimited branches, dedicated onboarding, and priority support.</w:t>
-      </w:r>
-    </w:p>
-    <w:bookmarkEnd w:id="60"/>
-    <w:bookmarkStart w:id="61" w:name="payment-methods"/>
-    <w:p>
-      <w:pPr>
-        <w:pStyle w:val="Heading2"/>
-      </w:pPr>
-      <w:r>
-        <w:t xml:space="preserve">Payment Methods</w:t>
-      </w:r>
-    </w:p>
-    <w:p>
-      <w:pPr>
-        <w:pStyle w:val="FirstParagraph"/>
-      </w:pPr>
-      <w:r>
-        <w:t xml:space="preserve">The system shall accept payment via:</w:t>
       </w:r>
     </w:p>
     <w:p>
@@ -4595,7 +4745,7 @@
         </w:numPr>
       </w:pPr>
       <w:r>
-        <w:t xml:space="preserve">Credit and debit card (Visa, Mastercard)</w:t>
+        <w:t xml:space="preserve">Professional base: UGX 1,000,000/month</w:t>
       </w:r>
     </w:p>
     <w:p>
@@ -4607,7 +4757,7 @@
         </w:numPr>
       </w:pPr>
       <w:r>
-        <w:t xml:space="preserve">Bank transfer (Uganda Shillings)</w:t>
+        <w:t xml:space="preserve">All add-ons (POS counted as 1 terminal): UGX 1,490,000/month</w:t>
       </w:r>
     </w:p>
     <w:p>
@@ -4619,7 +4769,33 @@
         </w:numPr>
       </w:pPr>
       <w:r>
-        <w:t xml:space="preserve">MTN Mobile Money (Uganda, Rwanda)</w:t>
+        <w:t xml:space="preserve">Total: UGX 2,490,000/month</w:t>
+      </w:r>
+    </w:p>
+    <w:p>
+      <w:pPr>
+        <w:pStyle w:val="FirstParagraph"/>
+      </w:pPr>
+      <w:r>
+        <w:t xml:space="preserve">This is UGX 10,000 below the Enterprise plan price of UGX 2,500,000/month. The system shall detect when a tenant's combined subscription cost (base + add-ons) reaches ≥ 95% of the next tier price and display a contextual upgrade prompt offering the higher tier for the price difference, with the benefit of unlimited users, unlimited branches, dedicated onboarding, and priority support.</w:t>
+      </w:r>
+    </w:p>
+    <w:bookmarkEnd w:id="61"/>
+    <w:bookmarkStart w:id="62" w:name="payment-methods"/>
+    <w:p>
+      <w:pPr>
+        <w:pStyle w:val="Heading2"/>
+      </w:pPr>
+      <w:r>
+        <w:t xml:space="preserve">Payment Methods</w:t>
+      </w:r>
+    </w:p>
+    <w:p>
+      <w:pPr>
+        <w:pStyle w:val="FirstParagraph"/>
+      </w:pPr>
+      <w:r>
+        <w:t xml:space="preserve">The system shall accept payment via:</w:t>
       </w:r>
     </w:p>
     <w:p>
@@ -4627,15 +4803,51 @@
         <w:pStyle w:val="Compact"/>
         <w:numPr>
           <w:ilvl w:val="0"/>
-          <w:numId w:val="1004"/>
+          <w:numId w:val="1005"/>
         </w:numPr>
       </w:pPr>
       <w:r>
+        <w:t xml:space="preserve">Credit and debit card (Visa, Mastercard)</w:t>
+      </w:r>
+    </w:p>
+    <w:p>
+      <w:pPr>
+        <w:pStyle w:val="Compact"/>
+        <w:numPr>
+          <w:ilvl w:val="0"/>
+          <w:numId w:val="1005"/>
+        </w:numPr>
+      </w:pPr>
+      <w:r>
+        <w:t xml:space="preserve">Bank transfer (Uganda Shillings)</w:t>
+      </w:r>
+    </w:p>
+    <w:p>
+      <w:pPr>
+        <w:pStyle w:val="Compact"/>
+        <w:numPr>
+          <w:ilvl w:val="0"/>
+          <w:numId w:val="1005"/>
+        </w:numPr>
+      </w:pPr>
+      <w:r>
+        <w:t xml:space="preserve">MTN Mobile Money (Uganda, Rwanda)</w:t>
+      </w:r>
+    </w:p>
+    <w:p>
+      <w:pPr>
+        <w:pStyle w:val="Compact"/>
+        <w:numPr>
+          <w:ilvl w:val="0"/>
+          <w:numId w:val="1005"/>
+        </w:numPr>
+      </w:pPr>
+      <w:r>
         <w:t xml:space="preserve">M-Pesa (Kenya, Tanzania)</w:t>
       </w:r>
     </w:p>
-    <w:bookmarkEnd w:id="61"/>
-    <w:bookmarkStart w:id="62" w:name="revenue-milestones"/>
+    <w:bookmarkEnd w:id="62"/>
+    <w:bookmarkStart w:id="63" w:name="revenue-milestones"/>
     <w:p>
       <w:pPr>
         <w:pStyle w:val="Heading2"/>
@@ -4890,8 +5102,8 @@
         </w:tc>
       </w:tr>
     </w:tbl>
-    <w:bookmarkEnd w:id="62"/>
-    <w:bookmarkStart w:id="63" w:name="revenue-model-summary"/>
+    <w:bookmarkEnd w:id="63"/>
+    <w:bookmarkStart w:id="64" w:name="revenue-model-summary"/>
     <w:p>
       <w:pPr>
         <w:pStyle w:val="Heading2"/>
@@ -4908,9 +5120,9 @@
         <w:t xml:space="preserve">Longhorn ERP is a pure SaaS subscription business. There are no implementation fees, no licence fees, no module purchase costs, and no support contracts sold separately. Revenue is generated entirely from monthly or annual subscription payments. Add-on a-la-carte revenue supplements base subscription revenue and is structured to create natural upgrade paths to higher tiers.</w:t>
       </w:r>
     </w:p>
-    <w:bookmarkEnd w:id="63"/>
     <w:bookmarkEnd w:id="64"/>
-    <w:bookmarkStart w:id="71" w:name="success-metrics"/>
+    <w:bookmarkEnd w:id="65"/>
+    <w:bookmarkStart w:id="72" w:name="success-metrics"/>
     <w:p>
       <w:pPr>
         <w:pStyle w:val="Heading1"/>
@@ -4927,7 +5139,7 @@
         <w:t xml:space="preserve">All metrics below are measurable thresholds. Each constitutes a pass/fail criterion that must be verified before the Phase 1 launch gate is approved.</w:t>
       </w:r>
     </w:p>
-    <w:bookmarkStart w:id="65" w:name="usability-unassisted-task-success-rate"/>
+    <w:bookmarkStart w:id="66" w:name="usability-unassisted-task-success-rate"/>
     <w:p>
       <w:pPr>
         <w:pStyle w:val="Heading2"/>
@@ -5213,8 +5425,8 @@
         <w:t xml:space="preserve">Failure definition: participant requests verbal guidance, or navigates to a dead end and requires backtracking more than once.</w:t>
       </w:r>
     </w:p>
-    <w:bookmarkEnd w:id="65"/>
-    <w:bookmarkStart w:id="66" w:name="performance-page-response-time"/>
+    <w:bookmarkEnd w:id="66"/>
+    <w:bookmarkStart w:id="67" w:name="performance-page-response-time"/>
     <w:p>
       <w:pPr>
         <w:pStyle w:val="Heading2"/>
@@ -5353,8 +5565,8 @@
         <w:t xml:space="preserve">Measurement method: load testing tool (e.g., k6 or Apache JMeter) simulating 100 concurrent users performing mixed read/write operations over a 10-minute sustained run.</w:t>
       </w:r>
     </w:p>
-    <w:bookmarkEnd w:id="66"/>
-    <w:bookmarkStart w:id="67" w:name="availability-platform-uptime"/>
+    <w:bookmarkEnd w:id="67"/>
+    <w:bookmarkStart w:id="68" w:name="availability-platform-uptime"/>
     <w:p>
       <w:pPr>
         <w:pStyle w:val="Heading2"/>
@@ -5537,8 +5749,8 @@
         <w:t xml:space="preserve">Measurement method: external uptime monitoring service polling the application health endpoint at 1-minute intervals.</w:t>
       </w:r>
     </w:p>
-    <w:bookmarkEnd w:id="67"/>
-    <w:bookmarkStart w:id="68" w:name="tenant-provisioning-time"/>
+    <w:bookmarkEnd w:id="68"/>
+    <w:bookmarkStart w:id="69" w:name="tenant-provisioning-time"/>
     <w:p>
       <w:pPr>
         <w:pStyle w:val="Heading2"/>
@@ -5653,8 +5865,8 @@
         <w:t xml:space="preserve">Measurement method: automated provisioning test run at each deployment; time recorded from payment webhook receipt to successful first login.</w:t>
       </w:r>
     </w:p>
-    <w:bookmarkEnd w:id="68"/>
-    <w:bookmarkStart w:id="69" w:name="revenue-milestones-1"/>
+    <w:bookmarkEnd w:id="69"/>
+    <w:bookmarkStart w:id="70" w:name="revenue-milestones-1"/>
     <w:p>
       <w:pPr>
         <w:pStyle w:val="Heading2"/>
@@ -5977,8 +6189,8 @@
         <w:t xml:space="preserve">Revenue milestones are gate criteria for market expansion phases. Phase 2 development budget is not released until Phase 1 MRR target is achieved for two consecutive months.</w:t>
       </w:r>
     </w:p>
-    <w:bookmarkEnd w:id="69"/>
-    <w:bookmarkStart w:id="70" w:name="security-and-compliance"/>
+    <w:bookmarkEnd w:id="70"/>
+    <w:bookmarkStart w:id="71" w:name="security-and-compliance"/>
     <w:p>
       <w:pPr>
         <w:pStyle w:val="Heading2"/>
@@ -6097,9 +6309,9 @@
         </w:tc>
       </w:tr>
     </w:tbl>
-    <w:bookmarkEnd w:id="70"/>
     <w:bookmarkEnd w:id="71"/>
-    <w:bookmarkStart w:id="76" w:name="open-questions--internal-decision-gaps"/>
+    <w:bookmarkEnd w:id="72"/>
+    <w:bookmarkStart w:id="77" w:name="open-questions--internal-decision-gaps"/>
     <w:p>
       <w:pPr>
         <w:pStyle w:val="Heading1"/>
@@ -6123,7 +6335,7 @@
         </w:pict>
       </w:r>
     </w:p>
-    <w:bookmarkStart w:id="72" w:name="gap-015-white-labelling-policy"/>
+    <w:bookmarkStart w:id="73" w:name="gap-015-white-labelling-policy"/>
     <w:p>
       <w:pPr>
         <w:pStyle w:val="Heading2"/>
@@ -6185,7 +6397,7 @@
         <w:pStyle w:val="Compact"/>
         <w:numPr>
           <w:ilvl w:val="0"/>
-          <w:numId w:val="1005"/>
+          <w:numId w:val="1006"/>
         </w:numPr>
       </w:pPr>
       <w:r>
@@ -6197,7 +6409,7 @@
         <w:pStyle w:val="Compact"/>
         <w:numPr>
           <w:ilvl w:val="0"/>
-          <w:numId w:val="1005"/>
+          <w:numId w:val="1006"/>
         </w:numPr>
       </w:pPr>
       <w:r>
@@ -6209,7 +6421,7 @@
         <w:pStyle w:val="Compact"/>
         <w:numPr>
           <w:ilvl w:val="0"/>
-          <w:numId w:val="1005"/>
+          <w:numId w:val="1006"/>
         </w:numPr>
       </w:pPr>
       <w:r>
@@ -6253,8 +6465,8 @@
         </w:pict>
       </w:r>
     </w:p>
-    <w:bookmarkEnd w:id="72"/>
-    <w:bookmarkStart w:id="73" w:name="gap-016-hospitality-module-scope"/>
+    <w:bookmarkEnd w:id="73"/>
+    <w:bookmarkStart w:id="74" w:name="gap-016-hospitality-module-scope"/>
     <w:p>
       <w:pPr>
         <w:pStyle w:val="Heading2"/>
@@ -6325,7 +6537,7 @@
         <w:pStyle w:val="Compact"/>
         <w:numPr>
           <w:ilvl w:val="0"/>
-          <w:numId w:val="1006"/>
+          <w:numId w:val="1007"/>
         </w:numPr>
       </w:pPr>
       <w:r>
@@ -6337,7 +6549,7 @@
         <w:pStyle w:val="Compact"/>
         <w:numPr>
           <w:ilvl w:val="0"/>
-          <w:numId w:val="1006"/>
+          <w:numId w:val="1007"/>
         </w:numPr>
       </w:pPr>
       <w:r>
@@ -6349,7 +6561,7 @@
         <w:pStyle w:val="Compact"/>
         <w:numPr>
           <w:ilvl w:val="0"/>
-          <w:numId w:val="1006"/>
+          <w:numId w:val="1007"/>
         </w:numPr>
       </w:pPr>
       <w:r>
@@ -6390,8 +6602,8 @@
         </w:pict>
       </w:r>
     </w:p>
-    <w:bookmarkEnd w:id="73"/>
-    <w:bookmarkStart w:id="74" w:name="Xa1dd700d3e7c29a6b86db3cd21562eacf4be287"/>
+    <w:bookmarkEnd w:id="74"/>
+    <w:bookmarkStart w:id="75" w:name="Xa1dd700d3e7c29a6b86db3cd21562eacf4be287"/>
     <w:p>
       <w:pPr>
         <w:pStyle w:val="Heading2"/>
@@ -6453,7 +6665,7 @@
         <w:pStyle w:val="Compact"/>
         <w:numPr>
           <w:ilvl w:val="0"/>
-          <w:numId w:val="1007"/>
+          <w:numId w:val="1008"/>
         </w:numPr>
       </w:pPr>
       <w:r>
@@ -6474,7 +6686,7 @@
         <w:pStyle w:val="Compact"/>
         <w:numPr>
           <w:ilvl w:val="0"/>
-          <w:numId w:val="1007"/>
+          <w:numId w:val="1008"/>
         </w:numPr>
       </w:pPr>
       <w:r>
@@ -6486,7 +6698,7 @@
         <w:pStyle w:val="Compact"/>
         <w:numPr>
           <w:ilvl w:val="0"/>
-          <w:numId w:val="1007"/>
+          <w:numId w:val="1008"/>
         </w:numPr>
       </w:pPr>
       <w:r>
@@ -6533,8 +6745,8 @@
         </w:pict>
       </w:r>
     </w:p>
-    <w:bookmarkEnd w:id="74"/>
-    <w:bookmarkStart w:id="75" w:name="gap-018-source-code-strategy"/>
+    <w:bookmarkEnd w:id="75"/>
+    <w:bookmarkStart w:id="76" w:name="gap-018-source-code-strategy"/>
     <w:p>
       <w:pPr>
         <w:pStyle w:val="Heading2"/>
@@ -6596,7 +6808,7 @@
         <w:pStyle w:val="Compact"/>
         <w:numPr>
           <w:ilvl w:val="0"/>
-          <w:numId w:val="1008"/>
+          <w:numId w:val="1009"/>
         </w:numPr>
       </w:pPr>
       <w:r>
@@ -6608,7 +6820,7 @@
         <w:pStyle w:val="Compact"/>
         <w:numPr>
           <w:ilvl w:val="0"/>
-          <w:numId w:val="1008"/>
+          <w:numId w:val="1009"/>
         </w:numPr>
       </w:pPr>
       <w:r>
@@ -6620,7 +6832,7 @@
         <w:pStyle w:val="Compact"/>
         <w:numPr>
           <w:ilvl w:val="0"/>
-          <w:numId w:val="1008"/>
+          <w:numId w:val="1009"/>
         </w:numPr>
       </w:pPr>
       <w:r>
@@ -6664,9 +6876,9 @@
         <w:t xml:space="preserve">All 4 gaps above must be reviewed and signed off by Peter Bamuhigire before the documents they block are submitted for phase-gate approval.</w:t>
       </w:r>
     </w:p>
-    <w:bookmarkEnd w:id="75"/>
     <w:bookmarkEnd w:id="76"/>
-    <w:bookmarkStart w:id="84" w:name="Xb38158efe5c70268bffb632872174aebaaeea8e"/>
+    <w:bookmarkEnd w:id="77"/>
+    <w:bookmarkStart w:id="85" w:name="Xb38158efe5c70268bffb632872174aebaaeea8e"/>
     <w:p>
       <w:pPr>
         <w:pStyle w:val="Heading1"/>
@@ -6675,7 +6887,7 @@
         <w:t xml:space="preserve">AI Intelligence Module — Intelligent Business Add-On</w:t>
       </w:r>
     </w:p>
-    <w:bookmarkStart w:id="77" w:name="positioning"/>
+    <w:bookmarkStart w:id="78" w:name="positioning"/>
     <w:p>
       <w:pPr>
         <w:pStyle w:val="Heading2"/>
@@ -6730,8 +6942,8 @@
         </w:pict>
       </w:r>
     </w:p>
-    <w:bookmarkEnd w:id="77"/>
-    <w:bookmarkStart w:id="78" w:name="X55e2a79977ea7a1d8ff12997b8b5425d3f10854"/>
+    <w:bookmarkEnd w:id="78"/>
+    <w:bookmarkStart w:id="79" w:name="X55e2a79977ea7a1d8ff12997b8b5425d3f10854"/>
     <w:p>
       <w:pPr>
         <w:pStyle w:val="Heading2"/>
@@ -6855,8 +7067,8 @@
         </w:pict>
       </w:r>
     </w:p>
-    <w:bookmarkEnd w:id="78"/>
-    <w:bookmarkStart w:id="79" w:name="Xb20f5f86fc741c1035dac928e5245ecd5fe83da"/>
+    <w:bookmarkEnd w:id="79"/>
+    <w:bookmarkStart w:id="80" w:name="Xb20f5f86fc741c1035dac928e5245ecd5fe83da"/>
     <w:p>
       <w:pPr>
         <w:pStyle w:val="Heading2"/>
@@ -6980,8 +7192,8 @@
         </w:pict>
       </w:r>
     </w:p>
-    <w:bookmarkEnd w:id="79"/>
-    <w:bookmarkStart w:id="80" w:name="X6ee0b7705dc9348be3351465ebb1fbd1e778047"/>
+    <w:bookmarkEnd w:id="80"/>
+    <w:bookmarkStart w:id="81" w:name="X6ee0b7705dc9348be3351465ebb1fbd1e778047"/>
     <w:p>
       <w:pPr>
         <w:pStyle w:val="Heading2"/>
@@ -7105,8 +7317,8 @@
         </w:pict>
       </w:r>
     </w:p>
-    <w:bookmarkEnd w:id="80"/>
-    <w:bookmarkStart w:id="81" w:name="Xfb33015a467edff35a6f4c58b1a60d7813b1fa7"/>
+    <w:bookmarkEnd w:id="81"/>
+    <w:bookmarkStart w:id="82" w:name="Xfb33015a467edff35a6f4c58b1a60d7813b1fa7"/>
     <w:p>
       <w:pPr>
         <w:pStyle w:val="Heading2"/>
@@ -7230,8 +7442,8 @@
         </w:pict>
       </w:r>
     </w:p>
-    <w:bookmarkEnd w:id="81"/>
-    <w:bookmarkStart w:id="82" w:name="Xf899a5ad0e538e65599cf5dd64375d3e3dbbf43"/>
+    <w:bookmarkEnd w:id="82"/>
+    <w:bookmarkStart w:id="83" w:name="Xf899a5ad0e538e65599cf5dd64375d3e3dbbf43"/>
     <w:p>
       <w:pPr>
         <w:pStyle w:val="Heading2"/>
@@ -7355,8 +7567,8 @@
         </w:pict>
       </w:r>
     </w:p>
-    <w:bookmarkEnd w:id="82"/>
-    <w:bookmarkStart w:id="83" w:name="ai-intelligence-module-packaging-summary"/>
+    <w:bookmarkEnd w:id="83"/>
+    <w:bookmarkStart w:id="84" w:name="ai-intelligence-module-packaging-summary"/>
     <w:p>
       <w:pPr>
         <w:pStyle w:val="Heading2"/>
@@ -7688,8 +7900,735 @@
         <w:t xml:space="preserve">.</w:t>
       </w:r>
     </w:p>
-    <w:bookmarkEnd w:id="83"/>
     <w:bookmarkEnd w:id="84"/>
+    <w:bookmarkEnd w:id="85"/>
+    <w:bookmarkStart w:id="92" w:name="Xf8227227ae81cf775b96b824b0c2b3d248f77e6"/>
+    <w:p>
+      <w:pPr>
+        <w:pStyle w:val="Heading1"/>
+      </w:pPr>
+      <w:r>
+        <w:t xml:space="preserve">Industrial Lifecycle, Manufacturing Execution, and Transportation Depth</w:t>
+      </w:r>
+    </w:p>
+    <w:bookmarkStart w:id="86" w:name="positioning-1"/>
+    <w:p>
+      <w:pPr>
+        <w:pStyle w:val="Heading2"/>
+      </w:pPr>
+      <w:r>
+        <w:t xml:space="preserve">Positioning</w:t>
+      </w:r>
+    </w:p>
+    <w:p>
+      <w:pPr>
+        <w:pStyle w:val="FirstParagraph"/>
+      </w:pPr>
+      <w:r>
+        <w:t xml:space="preserve">Longhorn ERP shall be positioned as an African ERP that can serve both growing SMEs and larger, operationally complex organisations without forcing them to leave the platform once they outgrow basic accounting and inventory controls. That means Longhorn ERP must not stop at financial ERP depth. It must also govern how products are designed, how factories execute work, and how goods move through transport networks.</w:t>
+      </w:r>
+    </w:p>
+    <w:p>
+      <w:pPr>
+        <w:pStyle w:val="BodyText"/>
+      </w:pPr>
+      <w:r>
+        <w:t xml:space="preserve">This strategic extension introduces three explicit capability layers:</w:t>
+      </w:r>
+    </w:p>
+    <w:p>
+      <w:pPr>
+        <w:pStyle w:val="Compact"/>
+        <w:numPr>
+          <w:ilvl w:val="0"/>
+          <w:numId w:val="1010"/>
+        </w:numPr>
+      </w:pPr>
+      <w:r>
+        <w:rPr>
+          <w:b/>
+          <w:bCs/>
+        </w:rPr>
+        <w:t xml:space="preserve">Product Lifecycle Management (PLM)</w:t>
+      </w:r>
+      <w:r>
+        <w:t xml:space="preserve"> </w:t>
+      </w:r>
+      <w:r>
+        <w:t xml:space="preserve">- engineering truth, revision control, engineering change, effectivity, and NPI governance</w:t>
+      </w:r>
+    </w:p>
+    <w:p>
+      <w:pPr>
+        <w:pStyle w:val="Compact"/>
+        <w:numPr>
+          <w:ilvl w:val="0"/>
+          <w:numId w:val="1010"/>
+        </w:numPr>
+      </w:pPr>
+      <w:r>
+        <w:rPr>
+          <w:b/>
+          <w:bCs/>
+        </w:rPr>
+        <w:t xml:space="preserve">MES-grade Manufacturing Execution</w:t>
+      </w:r>
+      <w:r>
+        <w:t xml:space="preserve"> </w:t>
+      </w:r>
+      <w:r>
+        <w:t xml:space="preserve">- routings, work centres, operation tracking, genealogy, in-process quality, downtime, and OEE</w:t>
+      </w:r>
+    </w:p>
+    <w:p>
+      <w:pPr>
+        <w:pStyle w:val="Compact"/>
+        <w:numPr>
+          <w:ilvl w:val="0"/>
+          <w:numId w:val="1010"/>
+        </w:numPr>
+      </w:pPr>
+      <w:r>
+        <w:rPr>
+          <w:b/>
+          <w:bCs/>
+        </w:rPr>
+        <w:t xml:space="preserve">Transportation and Fleet Operations</w:t>
+      </w:r>
+      <w:r>
+        <w:t xml:space="preserve"> </w:t>
+      </w:r>
+      <w:r>
+        <w:t xml:space="preserve">- shipment planning, dispatch, route execution, ETA visibility, freight audit, and fleet operations control</w:t>
+      </w:r>
+    </w:p>
+    <w:p>
+      <w:pPr>
+        <w:pStyle w:val="FirstParagraph"/>
+      </w:pPr>
+      <w:r>
+        <w:t xml:space="preserve">These capabilities are modular. A small company can activate only the layers it needs. A large manufacturer or distributor can activate all of them and run one coherent digital operating system inside Longhorn ERP.</w:t>
+      </w:r>
+    </w:p>
+    <w:p>
+      <w:r>
+        <w:pict>
+          <v:rect style="width:0;height:1.5pt" o:hralign="center" o:hrstd="t" o:hr="t"/>
+        </w:pict>
+      </w:r>
+    </w:p>
+    <w:bookmarkEnd w:id="86"/>
+    <w:bookmarkStart w:id="87" w:name="Xd0b0d03c0071c3f3e0e467c5dd714c3d98adad1"/>
+    <w:p>
+      <w:pPr>
+        <w:pStyle w:val="Heading2"/>
+      </w:pPr>
+      <w:r>
+        <w:t xml:space="preserve">Capability 1: Product Lifecycle Management (PLM)</w:t>
+      </w:r>
+    </w:p>
+    <w:p>
+      <w:pPr>
+        <w:pStyle w:val="FirstParagraph"/>
+      </w:pPr>
+      <w:r>
+        <w:rPr>
+          <w:b/>
+          <w:bCs/>
+        </w:rPr>
+        <w:t xml:space="preserve">Who benefits:</w:t>
+      </w:r>
+      <w:r>
+        <w:t xml:space="preserve"> </w:t>
+      </w:r>
+      <w:r>
+        <w:t xml:space="preserve">Engineering managers, product development teams, quality managers, compliance officers, operations leaders.</w:t>
+      </w:r>
+    </w:p>
+    <w:p>
+      <w:pPr>
+        <w:pStyle w:val="BodyText"/>
+      </w:pPr>
+      <w:r>
+        <w:rPr>
+          <w:b/>
+          <w:bCs/>
+        </w:rPr>
+        <w:t xml:space="preserve">The problem it solves:</w:t>
+      </w:r>
+      <w:r>
+        <w:t xml:space="preserve"> </w:t>
+      </w:r>
+      <w:r>
+        <w:t xml:space="preserve">Many manufacturers lose control long before production starts. The wrong drawing is emailed to procurement. A BOM is changed informally. A plant builds to an obsolete revision. A compliance certificate expires and nobody notices until an audit or customer complaint. Inventory and production systems can only execute correctly if engineering truth is governed first.</w:t>
+      </w:r>
+    </w:p>
+    <w:p>
+      <w:pPr>
+        <w:pStyle w:val="BodyText"/>
+      </w:pPr>
+      <w:r>
+        <w:rPr>
+          <w:b/>
+          <w:bCs/>
+        </w:rPr>
+        <w:t xml:space="preserve">What it does:</w:t>
+      </w:r>
+      <w:r>
+        <w:t xml:space="preserve"> </w:t>
+      </w:r>
+      <w:r>
+        <w:t xml:space="preserve">The PLM module maintains a controlled engineering item master with revision status, engineering BOMs, document control, engineering change workflows, effectivity rules, stage-gate progression, and compliance evidence. Only released and effective structures are published downstream for procurement, inventory, and manufacturing use.</w:t>
+      </w:r>
+    </w:p>
+    <w:p>
+      <w:pPr>
+        <w:pStyle w:val="BodyText"/>
+      </w:pPr>
+      <w:r>
+        <w:rPr>
+          <w:b/>
+          <w:bCs/>
+        </w:rPr>
+        <w:t xml:space="preserve">Why owners pay for it:</w:t>
+      </w:r>
+      <w:r>
+        <w:t xml:space="preserve"> </w:t>
+      </w:r>
+      <w:r>
+        <w:t xml:space="preserve">Fewer engineering errors, fewer wrong-build incidents, faster NPI cycles, stronger audit readiness, and lower cost of change across product lines.</w:t>
+      </w:r>
+    </w:p>
+    <w:p>
+      <w:pPr>
+        <w:pStyle w:val="BodyText"/>
+      </w:pPr>
+      <w:r>
+        <w:rPr>
+          <w:b/>
+          <w:bCs/>
+        </w:rPr>
+        <w:t xml:space="preserve">Pricing tier:</w:t>
+      </w:r>
+      <w:r>
+        <w:t xml:space="preserve"> </w:t>
+      </w:r>
+      <w:r>
+        <w:t xml:space="preserve">Packaging and standalone pricing to be finalised.</w:t>
+      </w:r>
+    </w:p>
+    <w:p>
+      <w:pPr>
+        <w:pStyle w:val="BodyText"/>
+      </w:pPr>
+      <w:r>
+        <w:rPr>
+          <w:b/>
+          <w:bCs/>
+        </w:rPr>
+        <w:t xml:space="preserve">FR-PLM-001 to FR-PLM-006</w:t>
+      </w:r>
+      <w:r>
+        <w:t xml:space="preserve"> </w:t>
+      </w:r>
+      <w:r>
+        <w:t xml:space="preserve">- see SRS Module 16 for full technical specification.</w:t>
+      </w:r>
+    </w:p>
+    <w:p>
+      <w:r>
+        <w:pict>
+          <v:rect style="width:0;height:1.5pt" o:hralign="center" o:hrstd="t" o:hr="t"/>
+        </w:pict>
+      </w:r>
+    </w:p>
+    <w:bookmarkEnd w:id="87"/>
+    <w:bookmarkStart w:id="88" w:name="X13f49fd4699712dbe2b9c2d929fcd469a871e88"/>
+    <w:p>
+      <w:pPr>
+        <w:pStyle w:val="Heading2"/>
+      </w:pPr>
+      <w:r>
+        <w:t xml:space="preserve">Capability 2: MES-Grade Manufacturing Execution</w:t>
+      </w:r>
+    </w:p>
+    <w:p>
+      <w:pPr>
+        <w:pStyle w:val="FirstParagraph"/>
+      </w:pPr>
+      <w:r>
+        <w:rPr>
+          <w:b/>
+          <w:bCs/>
+        </w:rPr>
+        <w:t xml:space="preserve">Who benefits:</w:t>
+      </w:r>
+      <w:r>
+        <w:t xml:space="preserve"> </w:t>
+      </w:r>
+      <w:r>
+        <w:t xml:space="preserve">Plant managers, production supervisors, quality leads, operations directors, cost accountants.</w:t>
+      </w:r>
+    </w:p>
+    <w:p>
+      <w:pPr>
+        <w:pStyle w:val="BodyText"/>
+      </w:pPr>
+      <w:r>
+        <w:rPr>
+          <w:b/>
+          <w:bCs/>
+        </w:rPr>
+        <w:t xml:space="preserve">The problem it solves:</w:t>
+      </w:r>
+      <w:r>
+        <w:t xml:space="preserve"> </w:t>
+      </w:r>
+      <w:r>
+        <w:t xml:space="preserve">A production order may exist in ERP, but that does not mean the plant is under control. Without operation-level dispatch, material validation, genealogy, in-process quality, downtime capture, and governed rework, management only sees results after waste, delay, or nonconformance has already occurred.</w:t>
+      </w:r>
+    </w:p>
+    <w:p>
+      <w:pPr>
+        <w:pStyle w:val="BodyText"/>
+      </w:pPr>
+      <w:r>
+        <w:rPr>
+          <w:b/>
+          <w:bCs/>
+        </w:rPr>
+        <w:t xml:space="preserve">What it does:</w:t>
+      </w:r>
+      <w:r>
+        <w:t xml:space="preserve"> </w:t>
+      </w:r>
+      <w:r>
+        <w:t xml:space="preserve">The Manufacturing module is extended beyond planning and costing into execution discipline. It governs routings, work centres, operation start and completion, lot-level material traceability, stage-specific quality checks, rework loops, downtime classification, and OEE-style performance reporting.</w:t>
+      </w:r>
+    </w:p>
+    <w:p>
+      <w:pPr>
+        <w:pStyle w:val="BodyText"/>
+      </w:pPr>
+      <w:r>
+        <w:rPr>
+          <w:b/>
+          <w:bCs/>
+        </w:rPr>
+        <w:t xml:space="preserve">Why owners pay for it:</w:t>
+      </w:r>
+      <w:r>
+        <w:t xml:space="preserve"> </w:t>
+      </w:r>
+      <w:r>
+        <w:t xml:space="preserve">Better plant visibility, lower scrap, faster root-cause analysis, stronger traceability for food, agro-processing, and industrial manufacturers, and more reliable production costing.</w:t>
+      </w:r>
+    </w:p>
+    <w:p>
+      <w:pPr>
+        <w:pStyle w:val="BodyText"/>
+      </w:pPr>
+      <w:r>
+        <w:rPr>
+          <w:b/>
+          <w:bCs/>
+        </w:rPr>
+        <w:t xml:space="preserve">Pricing tier:</w:t>
+      </w:r>
+      <w:r>
+        <w:t xml:space="preserve"> </w:t>
+      </w:r>
+      <w:r>
+        <w:t xml:space="preserve">Manufacturing add-on; detailed packaging to be refined as MES-grade capabilities are staged into release waves.</w:t>
+      </w:r>
+    </w:p>
+    <w:p>
+      <w:pPr>
+        <w:pStyle w:val="BodyText"/>
+      </w:pPr>
+      <w:r>
+        <w:rPr>
+          <w:b/>
+          <w:bCs/>
+        </w:rPr>
+        <w:t xml:space="preserve">FR-MFG-MES</w:t>
+      </w:r>
+      <w:r>
+        <w:t xml:space="preserve"> </w:t>
+      </w:r>
+      <w:r>
+        <w:t xml:space="preserve">- detailed requirements uplift to be added into the Manufacturing SRS stream.</w:t>
+      </w:r>
+    </w:p>
+    <w:p>
+      <w:r>
+        <w:pict>
+          <v:rect style="width:0;height:1.5pt" o:hralign="center" o:hrstd="t" o:hr="t"/>
+        </w:pict>
+      </w:r>
+    </w:p>
+    <w:bookmarkEnd w:id="88"/>
+    <w:bookmarkStart w:id="89" w:name="Xa22881436a94f03bf8d5882337a9f7298ad818a"/>
+    <w:p>
+      <w:pPr>
+        <w:pStyle w:val="Heading2"/>
+      </w:pPr>
+      <w:r>
+        <w:t xml:space="preserve">Capability 3: Transportation Planning and Dispatch</w:t>
+      </w:r>
+    </w:p>
+    <w:p>
+      <w:pPr>
+        <w:pStyle w:val="FirstParagraph"/>
+      </w:pPr>
+      <w:r>
+        <w:rPr>
+          <w:b/>
+          <w:bCs/>
+        </w:rPr>
+        <w:t xml:space="preserve">Who benefits:</w:t>
+      </w:r>
+      <w:r>
+        <w:t xml:space="preserve"> </w:t>
+      </w:r>
+      <w:r>
+        <w:t xml:space="preserve">Transport managers, logistics planners, dispatch teams, branch managers, operations directors.</w:t>
+      </w:r>
+    </w:p>
+    <w:p>
+      <w:pPr>
+        <w:pStyle w:val="BodyText"/>
+      </w:pPr>
+      <w:r>
+        <w:rPr>
+          <w:b/>
+          <w:bCs/>
+        </w:rPr>
+        <w:t xml:space="preserve">The problem it solves:</w:t>
+      </w:r>
+      <w:r>
+        <w:t xml:space="preserve"> </w:t>
+      </w:r>
+      <w:r>
+        <w:t xml:space="preserve">A delivery note records that goods left a warehouse. It does not decide how to consolidate loads, which route to use, which vehicle or carrier to assign, how to recover from a late shipment, or how to control freight cost. Businesses moving goods at scale need transport operations, not just shipping records.</w:t>
+      </w:r>
+    </w:p>
+    <w:p>
+      <w:pPr>
+        <w:pStyle w:val="BodyText"/>
+      </w:pPr>
+      <w:r>
+        <w:rPr>
+          <w:b/>
+          <w:bCs/>
+        </w:rPr>
+        <w:t xml:space="preserve">What it does:</w:t>
+      </w:r>
+      <w:r>
+        <w:t xml:space="preserve"> </w:t>
+      </w:r>
+      <w:r>
+        <w:t xml:space="preserve">The Transportation module creates shipment orders from sales, procurement, and stock-transfer demand; plans routes and loads; assigns internal fleet or third-party carriers; manages dispatch; tracks milestones and ETA; and raises exceptions when execution deviates from plan.</w:t>
+      </w:r>
+    </w:p>
+    <w:p>
+      <w:pPr>
+        <w:pStyle w:val="BodyText"/>
+      </w:pPr>
+      <w:r>
+        <w:rPr>
+          <w:b/>
+          <w:bCs/>
+        </w:rPr>
+        <w:t xml:space="preserve">Why owners pay for it:</w:t>
+      </w:r>
+      <w:r>
+        <w:t xml:space="preserve"> </w:t>
+      </w:r>
+      <w:r>
+        <w:t xml:space="preserve">Lower freight cost, fewer delivery failures, tighter branch coordination, better customer service, and a single control tower for physical movement.</w:t>
+      </w:r>
+    </w:p>
+    <w:p>
+      <w:pPr>
+        <w:pStyle w:val="BodyText"/>
+      </w:pPr>
+      <w:r>
+        <w:rPr>
+          <w:b/>
+          <w:bCs/>
+        </w:rPr>
+        <w:t xml:space="preserve">Pricing tier:</w:t>
+      </w:r>
+      <w:r>
+        <w:t xml:space="preserve"> </w:t>
+      </w:r>
+      <w:r>
+        <w:t xml:space="preserve">Packaging and standalone pricing to be finalised.</w:t>
+      </w:r>
+    </w:p>
+    <w:p>
+      <w:pPr>
+        <w:pStyle w:val="BodyText"/>
+      </w:pPr>
+      <w:r>
+        <w:rPr>
+          <w:b/>
+          <w:bCs/>
+        </w:rPr>
+        <w:t xml:space="preserve">FR-TMS-001 to FR-TMS-006</w:t>
+      </w:r>
+      <w:r>
+        <w:t xml:space="preserve"> </w:t>
+      </w:r>
+      <w:r>
+        <w:t xml:space="preserve">- see SRS Module 17 for full technical specification.</w:t>
+      </w:r>
+    </w:p>
+    <w:p>
+      <w:r>
+        <w:pict>
+          <v:rect style="width:0;height:1.5pt" o:hralign="center" o:hrstd="t" o:hr="t"/>
+        </w:pict>
+      </w:r>
+    </w:p>
+    <w:bookmarkEnd w:id="89"/>
+    <w:bookmarkStart w:id="90" w:name="capability-4-fleet-operations-control"/>
+    <w:p>
+      <w:pPr>
+        <w:pStyle w:val="Heading2"/>
+      </w:pPr>
+      <w:r>
+        <w:t xml:space="preserve">Capability 4: Fleet Operations Control</w:t>
+      </w:r>
+    </w:p>
+    <w:p>
+      <w:pPr>
+        <w:pStyle w:val="FirstParagraph"/>
+      </w:pPr>
+      <w:r>
+        <w:rPr>
+          <w:b/>
+          <w:bCs/>
+        </w:rPr>
+        <w:t xml:space="preserve">Who benefits:</w:t>
+      </w:r>
+      <w:r>
+        <w:t xml:space="preserve"> </w:t>
+      </w:r>
+      <w:r>
+        <w:t xml:space="preserve">Fleet managers, transport coordinators, driver supervisors, finance teams tracking vehicle utilisation.</w:t>
+      </w:r>
+    </w:p>
+    <w:p>
+      <w:pPr>
+        <w:pStyle w:val="BodyText"/>
+      </w:pPr>
+      <w:r>
+        <w:rPr>
+          <w:b/>
+          <w:bCs/>
+        </w:rPr>
+        <w:t xml:space="preserve">The problem it solves:</w:t>
+      </w:r>
+      <w:r>
+        <w:t xml:space="preserve"> </w:t>
+      </w:r>
+      <w:r>
+        <w:t xml:space="preserve">Asset registers can tell the business what a vehicle cost and when it is due for service. They do not manage live dispatch, route adherence, driver assignment, trip closure, or telematics events. When fleet operations are handled in spreadsheets and calls, service quality and utilisation both degrade.</w:t>
+      </w:r>
+    </w:p>
+    <w:p>
+      <w:pPr>
+        <w:pStyle w:val="BodyText"/>
+      </w:pPr>
+      <w:r>
+        <w:rPr>
+          <w:b/>
+          <w:bCs/>
+        </w:rPr>
+        <w:t xml:space="preserve">What it does:</w:t>
+      </w:r>
+      <w:r>
+        <w:t xml:space="preserve"> </w:t>
+      </w:r>
+      <w:r>
+        <w:t xml:space="preserve">Transportation extends fleet management into daily operations: vehicle and driver availability checks, trip assignment, proof of pickup and delivery capture, route deviation handling, fuel-event reconciliation, and telematics-ready ingestion of location and status signals.</w:t>
+      </w:r>
+    </w:p>
+    <w:p>
+      <w:pPr>
+        <w:pStyle w:val="BodyText"/>
+      </w:pPr>
+      <w:r>
+        <w:rPr>
+          <w:b/>
+          <w:bCs/>
+        </w:rPr>
+        <w:t xml:space="preserve">Why owners pay for it:</w:t>
+      </w:r>
+      <w:r>
+        <w:t xml:space="preserve"> </w:t>
+      </w:r>
+      <w:r>
+        <w:t xml:space="preserve">Better asset utilisation, fewer unauthorised trips, stronger delivery execution, and better linkage between operational fleet use and financial fleet ownership.</w:t>
+      </w:r>
+    </w:p>
+    <w:p>
+      <w:pPr>
+        <w:pStyle w:val="BodyText"/>
+      </w:pPr>
+      <w:r>
+        <w:rPr>
+          <w:b/>
+          <w:bCs/>
+        </w:rPr>
+        <w:t xml:space="preserve">Pricing tier:</w:t>
+      </w:r>
+      <w:r>
+        <w:t xml:space="preserve"> </w:t>
+      </w:r>
+      <w:r>
+        <w:t xml:space="preserve">Included within Transportation and Fleet Operations packaging.</w:t>
+      </w:r>
+    </w:p>
+    <w:p>
+      <w:pPr>
+        <w:pStyle w:val="BodyText"/>
+      </w:pPr>
+      <w:r>
+        <w:rPr>
+          <w:b/>
+          <w:bCs/>
+        </w:rPr>
+        <w:t xml:space="preserve">FR-TMS-003 to FR-TMS-005</w:t>
+      </w:r>
+      <w:r>
+        <w:t xml:space="preserve"> </w:t>
+      </w:r>
+      <w:r>
+        <w:t xml:space="preserve">- see SRS Module 17 for full technical specification.</w:t>
+      </w:r>
+    </w:p>
+    <w:p>
+      <w:r>
+        <w:pict>
+          <v:rect style="width:0;height:1.5pt" o:hralign="center" o:hrstd="t" o:hr="t"/>
+        </w:pict>
+      </w:r>
+    </w:p>
+    <w:bookmarkEnd w:id="90"/>
+    <w:bookmarkStart w:id="91" w:name="product-boundary-rule"/>
+    <w:p>
+      <w:pPr>
+        <w:pStyle w:val="Heading2"/>
+      </w:pPr>
+      <w:r>
+        <w:t xml:space="preserve">Product Boundary Rule</w:t>
+      </w:r>
+    </w:p>
+    <w:p>
+      <w:pPr>
+        <w:pStyle w:val="FirstParagraph"/>
+      </w:pPr>
+      <w:r>
+        <w:t xml:space="preserve">Longhorn ERP uses the following boundary rule to remain world-class rather than bloated:</w:t>
+      </w:r>
+    </w:p>
+    <w:p>
+      <w:pPr>
+        <w:pStyle w:val="Compact"/>
+        <w:numPr>
+          <w:ilvl w:val="0"/>
+          <w:numId w:val="1011"/>
+        </w:numPr>
+      </w:pPr>
+      <w:r>
+        <w:rPr>
+          <w:rStyle w:val="VerbatimChar"/>
+        </w:rPr>
+        <w:t xml:space="preserve">PLM</w:t>
+      </w:r>
+      <w:r>
+        <w:t xml:space="preserve"> </w:t>
+      </w:r>
+      <w:r>
+        <w:t xml:space="preserve">owns engineering truth.</w:t>
+      </w:r>
+    </w:p>
+    <w:p>
+      <w:pPr>
+        <w:pStyle w:val="Compact"/>
+        <w:numPr>
+          <w:ilvl w:val="0"/>
+          <w:numId w:val="1011"/>
+        </w:numPr>
+      </w:pPr>
+      <w:r>
+        <w:rPr>
+          <w:rStyle w:val="VerbatimChar"/>
+        </w:rPr>
+        <w:t xml:space="preserve">MANUFACTURING</w:t>
+      </w:r>
+      <w:r>
+        <w:t xml:space="preserve"> </w:t>
+      </w:r>
+      <w:r>
+        <w:t xml:space="preserve">owns plant execution and production economics.</w:t>
+      </w:r>
+    </w:p>
+    <w:p>
+      <w:pPr>
+        <w:pStyle w:val="Compact"/>
+        <w:numPr>
+          <w:ilvl w:val="0"/>
+          <w:numId w:val="1011"/>
+        </w:numPr>
+      </w:pPr>
+      <w:r>
+        <w:rPr>
+          <w:rStyle w:val="VerbatimChar"/>
+        </w:rPr>
+        <w:t xml:space="preserve">TRANSPORTATION</w:t>
+      </w:r>
+      <w:r>
+        <w:t xml:space="preserve"> </w:t>
+      </w:r>
+      <w:r>
+        <w:t xml:space="preserve">owns shipment and fleet operations.</w:t>
+      </w:r>
+    </w:p>
+    <w:p>
+      <w:pPr>
+        <w:pStyle w:val="Compact"/>
+        <w:numPr>
+          <w:ilvl w:val="0"/>
+          <w:numId w:val="1011"/>
+        </w:numPr>
+      </w:pPr>
+      <w:r>
+        <w:rPr>
+          <w:rStyle w:val="VerbatimChar"/>
+        </w:rPr>
+        <w:t xml:space="preserve">ASSETS</w:t>
+      </w:r>
+      <w:r>
+        <w:t xml:space="preserve"> </w:t>
+      </w:r>
+      <w:r>
+        <w:t xml:space="preserve">owns vehicle capital-asset accounting and maintenance history.</w:t>
+      </w:r>
+    </w:p>
+    <w:p>
+      <w:pPr>
+        <w:pStyle w:val="FirstParagraph"/>
+      </w:pPr>
+      <w:r>
+        <w:t xml:space="preserve">This separation keeps decision rights clear while still giving the customer one integrated ERP platform.</w:t>
+      </w:r>
+    </w:p>
+    <w:bookmarkEnd w:id="91"/>
+    <w:bookmarkEnd w:id="92"/>
     <w:sectPr>
       <w:footerReference r:id="rId9" w:type="default"/>
       <w:headerReference r:id="rId10" w:type="default"/>
@@ -8194,6 +9133,15 @@
     <w:abstractNumId w:val="991"/>
   </w:num>
   <w:num w:numId="1008">
+    <w:abstractNumId w:val="991"/>
+  </w:num>
+  <w:num w:numId="1009">
+    <w:abstractNumId w:val="991"/>
+  </w:num>
+  <w:num w:numId="1010">
+    <w:abstractNumId w:val="991"/>
+  </w:num>
+  <w:num w:numId="1011">
     <w:abstractNumId w:val="991"/>
   </w:num>
 </w:numbering>

</xml_diff>

<commit_message>
Deepen LonghornERP finance architecture and controls
</commit_message>
<xml_diff>
--- a/projects/LonghornERP/01-strategic-vision/LonghornERP_PRD.docx
+++ b/projects/LonghornERP/01-strategic-vision/LonghornERP_PRD.docx
@@ -1862,7 +1862,7 @@
     </w:p>
     <w:bookmarkEnd w:id="40"/>
     <w:bookmarkEnd w:id="41"/>
-    <w:bookmarkStart w:id="48" w:name="module-overview"/>
+    <w:bookmarkStart w:id="49" w:name="module-overview"/>
     <w:p>
       <w:pPr>
         <w:pStyle w:val="Heading1"/>
@@ -1980,7 +1980,7 @@
               <w:pStyle w:val="Compact"/>
             </w:pPr>
             <w:r>
-              <w:t xml:space="preserve">Double-entry General Ledger (GL), IFRS-compliant financial statements, AP, AR, bank reconciliation, multi-currency, VAT/WHT, budgets</w:t>
+              <w:t xml:space="preserve">Double-entry General Ledger (GL), IFRS-compliant financial statements, AP, AR, bank reconciliation, multi-currency, VAT/WHT, budgets, record-to-report discipline, close orchestration, consolidation-ready group structures, finance controls/workflow/approvals, and reporting foundations for management, statutory, and investor-grade analytics</w:t>
             </w:r>
           </w:p>
         </w:tc>
@@ -3201,8 +3201,132 @@
       </w:r>
     </w:p>
     <w:bookmarkEnd w:id="47"/>
+    <w:bookmarkStart w:id="48" w:name="finance-excellence-note"/>
+    <w:p>
+      <w:pPr>
+        <w:pStyle w:val="Heading2"/>
+      </w:pPr>
+      <w:r>
+        <w:t xml:space="preserve">Finance Excellence Note</w:t>
+      </w:r>
+    </w:p>
+    <w:p>
+      <w:pPr>
+        <w:pStyle w:val="FirstParagraph"/>
+      </w:pPr>
+      <w:r>
+        <w:t xml:space="preserve">Longhorn ERP treats</w:t>
+      </w:r>
+      <w:r>
+        <w:t xml:space="preserve"> </w:t>
+      </w:r>
+      <w:r>
+        <w:rPr>
+          <w:rStyle w:val="VerbatimChar"/>
+        </w:rPr>
+        <w:t xml:space="preserve">ACCOUNTING</w:t>
+      </w:r>
+      <w:r>
+        <w:t xml:space="preserve"> </w:t>
+      </w:r>
+      <w:r>
+        <w:t xml:space="preserve">as the financial system of record, not a basic bookkeeping add-on. The module is positioned to support both growing SMEs and larger multi-entity organisations that need disciplined finance operations without buying a separate finance stack.</w:t>
+      </w:r>
+    </w:p>
+    <w:p>
+      <w:pPr>
+        <w:pStyle w:val="BodyText"/>
+      </w:pPr>
+      <w:r>
+        <w:t xml:space="preserve">World-class finance capability in Longhorn ERP means:</w:t>
+      </w:r>
+    </w:p>
+    <w:p>
+      <w:pPr>
+        <w:pStyle w:val="Compact"/>
+        <w:numPr>
+          <w:ilvl w:val="0"/>
+          <w:numId w:val="1004"/>
+        </w:numPr>
+      </w:pPr>
+      <w:r>
+        <w:t xml:space="preserve">record-to-report discipline with controlled journal entry, subledger reconciliation, accounting periods, and audit-ready close evidence</w:t>
+      </w:r>
+    </w:p>
+    <w:p>
+      <w:pPr>
+        <w:pStyle w:val="Compact"/>
+        <w:numPr>
+          <w:ilvl w:val="0"/>
+          <w:numId w:val="1004"/>
+        </w:numPr>
+      </w:pPr>
+      <w:r>
+        <w:t xml:space="preserve">close orchestration with checklists, task ownership, dependency tracking, review steps, and exception visibility</w:t>
+      </w:r>
+    </w:p>
+    <w:p>
+      <w:pPr>
+        <w:pStyle w:val="Compact"/>
+        <w:numPr>
+          <w:ilvl w:val="0"/>
+          <w:numId w:val="1004"/>
+        </w:numPr>
+      </w:pPr>
+      <w:r>
+        <w:t xml:space="preserve">consolidation foundations with legal-entity structures, intercompany readiness, elimination support, and group reporting preparation</w:t>
+      </w:r>
+    </w:p>
+    <w:p>
+      <w:pPr>
+        <w:pStyle w:val="Compact"/>
+        <w:numPr>
+          <w:ilvl w:val="0"/>
+          <w:numId w:val="1004"/>
+        </w:numPr>
+      </w:pPr>
+      <w:r>
+        <w:t xml:space="preserve">finance controls, workflow, and approvals with maker-checker patterns, approval thresholds, segregation of duties, and policy-enforced posting controls</w:t>
+      </w:r>
+    </w:p>
+    <w:p>
+      <w:pPr>
+        <w:pStyle w:val="Compact"/>
+        <w:numPr>
+          <w:ilvl w:val="0"/>
+          <w:numId w:val="1004"/>
+        </w:numPr>
+      </w:pPr>
+      <w:r>
+        <w:t xml:space="preserve">reporting foundations with trusted dimensional reporting, management packs, statutory statements, board reporting, and analytics-ready finance data</w:t>
+      </w:r>
+    </w:p>
+    <w:p>
+      <w:pPr>
+        <w:pStyle w:val="FirstParagraph"/>
+      </w:pPr>
+      <w:r>
+        <w:t xml:space="preserve">This positioning is deliberate.</w:t>
+      </w:r>
+      <w:r>
+        <w:t xml:space="preserve"> </w:t>
+      </w:r>
+      <w:r>
+        <w:rPr>
+          <w:rStyle w:val="VerbatimChar"/>
+        </w:rPr>
+        <w:t xml:space="preserve">ACCOUNTING</w:t>
+      </w:r>
+      <w:r>
+        <w:t xml:space="preserve"> </w:t>
+      </w:r>
+      <w:r>
+        <w:t xml:space="preserve">remains the core module, while advanced finance excellence is delivered as depth within the same bounded capability so Longhorn ERP can scale from small African businesses to regional enterprise groups without fragmenting the finance operating model.</w:t>
+      </w:r>
+    </w:p>
     <w:bookmarkEnd w:id="48"/>
-    <w:bookmarkStart w:id="57" w:name="competitive-positioning"/>
+    <w:bookmarkEnd w:id="49"/>
+    <w:bookmarkStart w:id="58" w:name="competitive-positioning"/>
     <w:p>
       <w:pPr>
         <w:pStyle w:val="Heading1"/>
@@ -3211,7 +3335,7 @@
         <w:t xml:space="preserve">Competitive Positioning</w:t>
       </w:r>
     </w:p>
-    <w:bookmarkStart w:id="49" w:name="market-context"/>
+    <w:bookmarkStart w:id="50" w:name="market-context"/>
     <w:p>
       <w:pPr>
         <w:pStyle w:val="Heading2"/>
@@ -3236,8 +3360,8 @@
         <w:t xml:space="preserve">The full cost comparison table appears in Section 2. The following analysis expands on the five key competitive advantages.</w:t>
       </w:r>
     </w:p>
-    <w:bookmarkEnd w:id="49"/>
-    <w:bookmarkStart w:id="55" w:name="X76c8c33d32d5c0e3360f8ab11a513094d3223d5"/>
+    <w:bookmarkEnd w:id="50"/>
+    <w:bookmarkStart w:id="56" w:name="X76c8c33d32d5c0e3360f8ab11a513094d3223d5"/>
     <w:p>
       <w:pPr>
         <w:pStyle w:val="Heading2"/>
@@ -3246,7 +3370,7 @@
         <w:t xml:space="preserve">5 Key Competitive Advantages</w:t>
       </w:r>
     </w:p>
-    <w:bookmarkStart w:id="50" w:name="X46c69c95a0b55c263e712b76e07e6245d46b018"/>
+    <w:bookmarkStart w:id="51" w:name="X46c69c95a0b55c263e712b76e07e6245d46b018"/>
     <w:p>
       <w:pPr>
         <w:pStyle w:val="Heading3"/>
@@ -3263,8 +3387,8 @@
         <w:t xml:space="preserve">Longhorn ERP is priced in Ugandan Shillings. Competitors bill in USD or EUR, exposing clients to exchange rate fluctuation. For a Ugandan organisation with UGX revenue, a USD-denominated SaaS subscription is a currency risk as well as a cost. Longhorn ERP removes this entirely.</w:t>
       </w:r>
     </w:p>
-    <w:bookmarkEnd w:id="50"/>
-    <w:bookmarkStart w:id="51" w:name="X71f737682fe7201dc17de9580c7b5d6a20f0a69"/>
+    <w:bookmarkEnd w:id="51"/>
+    <w:bookmarkStart w:id="52" w:name="X71f737682fe7201dc17de9580c7b5d6a20f0a69"/>
     <w:p>
       <w:pPr>
         <w:pStyle w:val="Heading3"/>
@@ -3281,8 +3405,8 @@
         <w:t xml:space="preserve">Every subscription tier covers the entire organisation at a flat monthly rate. A company adding its 16th user pays nothing more than a company with 15. This is the primary structural differentiator versus Odoo, Dynamics, and NetSuite, all of which charge per named user. An organisation growing from 15 to 30 employees on Longhorn ERP sees zero incremental cost until it crosses a tier threshold.</w:t>
       </w:r>
     </w:p>
-    <w:bookmarkEnd w:id="51"/>
-    <w:bookmarkStart w:id="52" w:name="X8b49be4ded8a60af879d601a7d09652a6133cee"/>
+    <w:bookmarkEnd w:id="52"/>
+    <w:bookmarkStart w:id="53" w:name="X8b49be4ded8a60af879d601a7d09652a6133cee"/>
     <w:p>
       <w:pPr>
         <w:pStyle w:val="Heading3"/>
@@ -3299,8 +3423,8 @@
         <w:t xml:space="preserve">The Golden Rule governs every interface design decision. No onboarding consultant, no training day, and no user manual is required before a new employee can perform their role in the system. This is enforced through a ≥ 85% unassisted task success rate requirement on 5 benchmark tasks. Competitors with complex configuration UIs, multi-step wizards, and role-based menus that require administrator setup cannot make this claim.</w:t>
       </w:r>
     </w:p>
-    <w:bookmarkEnd w:id="52"/>
-    <w:bookmarkStart w:id="53" w:name="Xddf462855bdb8a79e019aa4bfa067b53af6097b"/>
+    <w:bookmarkEnd w:id="53"/>
+    <w:bookmarkStart w:id="54" w:name="Xddf462855bdb8a79e019aa4bfa067b53af6097b"/>
     <w:p>
       <w:pPr>
         <w:pStyle w:val="Heading3"/>
@@ -3317,8 +3441,8 @@
         <w:t xml:space="preserve">Longhorn ERP ships with native integrations for EFRIS (Uganda VAT invoicing), MTN MoMo (Uganda, Rwanda), Airtel Money (Uganda, Kenya, Tanzania), and M-Pesa Daraja B2C (Kenya, Tanzania). No international competitor offers these integrations out of the box. A Ugandan organisation using SAP or NetSuite must build or buy these integrations separately.</w:t>
       </w:r>
     </w:p>
-    <w:bookmarkEnd w:id="53"/>
-    <w:bookmarkStart w:id="54" w:name="X6c74a3168e57cc811916e793323e24e67ba5808"/>
+    <w:bookmarkEnd w:id="54"/>
+    <w:bookmarkStart w:id="55" w:name="X6c74a3168e57cc811916e793323e24e67ba5808"/>
     <w:p>
       <w:pPr>
         <w:pStyle w:val="Heading3"/>
@@ -3335,9 +3459,9 @@
         <w:t xml:space="preserve">Longhorn ERP is a fully managed SaaS platform. There is no on-premise installation, no server procurement, no database configuration, and no implementation project. A new tenant is provisioned and live in ≤ 10 minutes. The total cost from purchase decision to first live transaction is one subscription payment.</w:t>
       </w:r>
     </w:p>
-    <w:bookmarkEnd w:id="54"/>
     <w:bookmarkEnd w:id="55"/>
-    <w:bookmarkStart w:id="56" w:name="positioning-summary"/>
+    <w:bookmarkEnd w:id="56"/>
+    <w:bookmarkStart w:id="57" w:name="positioning-summary"/>
     <w:p>
       <w:pPr>
         <w:pStyle w:val="Heading2"/>
@@ -3684,9 +3808,9 @@
         </w:tc>
       </w:tr>
     </w:tbl>
-    <w:bookmarkEnd w:id="56"/>
     <w:bookmarkEnd w:id="57"/>
-    <w:bookmarkStart w:id="65" w:name="revenue-model"/>
+    <w:bookmarkEnd w:id="58"/>
+    <w:bookmarkStart w:id="66" w:name="revenue-model"/>
     <w:p>
       <w:pPr>
         <w:pStyle w:val="Heading1"/>
@@ -3695,7 +3819,7 @@
         <w:t xml:space="preserve">Revenue Model</w:t>
       </w:r>
     </w:p>
-    <w:bookmarkStart w:id="58" w:name="subscription-tiers"/>
+    <w:bookmarkStart w:id="59" w:name="subscription-tiers"/>
     <w:p>
       <w:pPr>
         <w:pStyle w:val="Heading2"/>
@@ -4162,8 +4286,8 @@
         <w:t xml:space="preserve">Starter locks out all add-on modules. Upgrade to Small Business or above to activate add-ons.</w:t>
       </w:r>
     </w:p>
-    <w:bookmarkEnd w:id="58"/>
-    <w:bookmarkStart w:id="59" w:name="annual-billing-incentive"/>
+    <w:bookmarkEnd w:id="59"/>
+    <w:bookmarkStart w:id="60" w:name="annual-billing-incentive"/>
     <w:p>
       <w:pPr>
         <w:pStyle w:val="Heading2"/>
@@ -4300,8 +4424,8 @@
         </w:tc>
       </w:tr>
     </w:tbl>
-    <w:bookmarkEnd w:id="59"/>
-    <w:bookmarkStart w:id="60" w:name="a-la-carte-add-on-pricing"/>
+    <w:bookmarkEnd w:id="60"/>
+    <w:bookmarkStart w:id="61" w:name="a-la-carte-add-on-pricing"/>
     <w:p>
       <w:pPr>
         <w:pStyle w:val="Heading2"/>
@@ -4718,8 +4842,8 @@
         </w:tc>
       </w:tr>
     </w:tbl>
-    <w:bookmarkEnd w:id="60"/>
-    <w:bookmarkStart w:id="61" w:name="add-on-stacking-upgrade-trigger"/>
+    <w:bookmarkEnd w:id="61"/>
+    <w:bookmarkStart w:id="62" w:name="add-on-stacking-upgrade-trigger"/>
     <w:p>
       <w:pPr>
         <w:pStyle w:val="Heading2"/>
@@ -4734,68 +4858,6 @@
       </w:pPr>
       <w:r>
         <w:t xml:space="preserve">A Professional plan tenant activating all 10 add-ons would pay:</w:t>
-      </w:r>
-    </w:p>
-    <w:p>
-      <w:pPr>
-        <w:pStyle w:val="Compact"/>
-        <w:numPr>
-          <w:ilvl w:val="0"/>
-          <w:numId w:val="1004"/>
-        </w:numPr>
-      </w:pPr>
-      <w:r>
-        <w:t xml:space="preserve">Professional base: UGX 1,000,000/month</w:t>
-      </w:r>
-    </w:p>
-    <w:p>
-      <w:pPr>
-        <w:pStyle w:val="Compact"/>
-        <w:numPr>
-          <w:ilvl w:val="0"/>
-          <w:numId w:val="1004"/>
-        </w:numPr>
-      </w:pPr>
-      <w:r>
-        <w:t xml:space="preserve">All add-ons (POS counted as 1 terminal): UGX 1,490,000/month</w:t>
-      </w:r>
-    </w:p>
-    <w:p>
-      <w:pPr>
-        <w:pStyle w:val="Compact"/>
-        <w:numPr>
-          <w:ilvl w:val="0"/>
-          <w:numId w:val="1004"/>
-        </w:numPr>
-      </w:pPr>
-      <w:r>
-        <w:t xml:space="preserve">Total: UGX 2,490,000/month</w:t>
-      </w:r>
-    </w:p>
-    <w:p>
-      <w:pPr>
-        <w:pStyle w:val="FirstParagraph"/>
-      </w:pPr>
-      <w:r>
-        <w:t xml:space="preserve">This is UGX 10,000 below the Enterprise plan price of UGX 2,500,000/month. The system shall detect when a tenant's combined subscription cost (base + add-ons) reaches ≥ 95% of the next tier price and display a contextual upgrade prompt offering the higher tier for the price difference, with the benefit of unlimited users, unlimited branches, dedicated onboarding, and priority support.</w:t>
-      </w:r>
-    </w:p>
-    <w:bookmarkEnd w:id="61"/>
-    <w:bookmarkStart w:id="62" w:name="payment-methods"/>
-    <w:p>
-      <w:pPr>
-        <w:pStyle w:val="Heading2"/>
-      </w:pPr>
-      <w:r>
-        <w:t xml:space="preserve">Payment Methods</w:t>
-      </w:r>
-    </w:p>
-    <w:p>
-      <w:pPr>
-        <w:pStyle w:val="FirstParagraph"/>
-      </w:pPr>
-      <w:r>
-        <w:t xml:space="preserve">The system shall accept payment via:</w:t>
       </w:r>
     </w:p>
     <w:p>
@@ -4807,7 +4869,7 @@
         </w:numPr>
       </w:pPr>
       <w:r>
-        <w:t xml:space="preserve">Credit and debit card (Visa, Mastercard)</w:t>
+        <w:t xml:space="preserve">Professional base: UGX 1,000,000/month</w:t>
       </w:r>
     </w:p>
     <w:p>
@@ -4819,7 +4881,7 @@
         </w:numPr>
       </w:pPr>
       <w:r>
-        <w:t xml:space="preserve">Bank transfer (Uganda Shillings)</w:t>
+        <w:t xml:space="preserve">All add-ons (POS counted as 1 terminal): UGX 1,490,000/month</w:t>
       </w:r>
     </w:p>
     <w:p>
@@ -4831,7 +4893,33 @@
         </w:numPr>
       </w:pPr>
       <w:r>
-        <w:t xml:space="preserve">MTN Mobile Money (Uganda, Rwanda)</w:t>
+        <w:t xml:space="preserve">Total: UGX 2,490,000/month</w:t>
+      </w:r>
+    </w:p>
+    <w:p>
+      <w:pPr>
+        <w:pStyle w:val="FirstParagraph"/>
+      </w:pPr>
+      <w:r>
+        <w:t xml:space="preserve">This is UGX 10,000 below the Enterprise plan price of UGX 2,500,000/month. The system shall detect when a tenant's combined subscription cost (base + add-ons) reaches ≥ 95% of the next tier price and display a contextual upgrade prompt offering the higher tier for the price difference, with the benefit of unlimited users, unlimited branches, dedicated onboarding, and priority support.</w:t>
+      </w:r>
+    </w:p>
+    <w:bookmarkEnd w:id="62"/>
+    <w:bookmarkStart w:id="63" w:name="payment-methods"/>
+    <w:p>
+      <w:pPr>
+        <w:pStyle w:val="Heading2"/>
+      </w:pPr>
+      <w:r>
+        <w:t xml:space="preserve">Payment Methods</w:t>
+      </w:r>
+    </w:p>
+    <w:p>
+      <w:pPr>
+        <w:pStyle w:val="FirstParagraph"/>
+      </w:pPr>
+      <w:r>
+        <w:t xml:space="preserve">The system shall accept payment via:</w:t>
       </w:r>
     </w:p>
     <w:p>
@@ -4839,15 +4927,51 @@
         <w:pStyle w:val="Compact"/>
         <w:numPr>
           <w:ilvl w:val="0"/>
-          <w:numId w:val="1005"/>
+          <w:numId w:val="1006"/>
         </w:numPr>
       </w:pPr>
       <w:r>
+        <w:t xml:space="preserve">Credit and debit card (Visa, Mastercard)</w:t>
+      </w:r>
+    </w:p>
+    <w:p>
+      <w:pPr>
+        <w:pStyle w:val="Compact"/>
+        <w:numPr>
+          <w:ilvl w:val="0"/>
+          <w:numId w:val="1006"/>
+        </w:numPr>
+      </w:pPr>
+      <w:r>
+        <w:t xml:space="preserve">Bank transfer (Uganda Shillings)</w:t>
+      </w:r>
+    </w:p>
+    <w:p>
+      <w:pPr>
+        <w:pStyle w:val="Compact"/>
+        <w:numPr>
+          <w:ilvl w:val="0"/>
+          <w:numId w:val="1006"/>
+        </w:numPr>
+      </w:pPr>
+      <w:r>
+        <w:t xml:space="preserve">MTN Mobile Money (Uganda, Rwanda)</w:t>
+      </w:r>
+    </w:p>
+    <w:p>
+      <w:pPr>
+        <w:pStyle w:val="Compact"/>
+        <w:numPr>
+          <w:ilvl w:val="0"/>
+          <w:numId w:val="1006"/>
+        </w:numPr>
+      </w:pPr>
+      <w:r>
         <w:t xml:space="preserve">M-Pesa (Kenya, Tanzania)</w:t>
       </w:r>
     </w:p>
-    <w:bookmarkEnd w:id="62"/>
-    <w:bookmarkStart w:id="63" w:name="revenue-milestones"/>
+    <w:bookmarkEnd w:id="63"/>
+    <w:bookmarkStart w:id="64" w:name="revenue-milestones"/>
     <w:p>
       <w:pPr>
         <w:pStyle w:val="Heading2"/>
@@ -5102,8 +5226,8 @@
         </w:tc>
       </w:tr>
     </w:tbl>
-    <w:bookmarkEnd w:id="63"/>
-    <w:bookmarkStart w:id="64" w:name="revenue-model-summary"/>
+    <w:bookmarkEnd w:id="64"/>
+    <w:bookmarkStart w:id="65" w:name="revenue-model-summary"/>
     <w:p>
       <w:pPr>
         <w:pStyle w:val="Heading2"/>
@@ -5120,9 +5244,9 @@
         <w:t xml:space="preserve">Longhorn ERP is a pure SaaS subscription business. There are no implementation fees, no licence fees, no module purchase costs, and no support contracts sold separately. Revenue is generated entirely from monthly or annual subscription payments. Add-on a-la-carte revenue supplements base subscription revenue and is structured to create natural upgrade paths to higher tiers.</w:t>
       </w:r>
     </w:p>
-    <w:bookmarkEnd w:id="64"/>
     <w:bookmarkEnd w:id="65"/>
-    <w:bookmarkStart w:id="72" w:name="success-metrics"/>
+    <w:bookmarkEnd w:id="66"/>
+    <w:bookmarkStart w:id="73" w:name="success-metrics"/>
     <w:p>
       <w:pPr>
         <w:pStyle w:val="Heading1"/>
@@ -5139,7 +5263,7 @@
         <w:t xml:space="preserve">All metrics below are measurable thresholds. Each constitutes a pass/fail criterion that must be verified before the Phase 1 launch gate is approved.</w:t>
       </w:r>
     </w:p>
-    <w:bookmarkStart w:id="66" w:name="usability-unassisted-task-success-rate"/>
+    <w:bookmarkStart w:id="67" w:name="usability-unassisted-task-success-rate"/>
     <w:p>
       <w:pPr>
         <w:pStyle w:val="Heading2"/>
@@ -5425,8 +5549,8 @@
         <w:t xml:space="preserve">Failure definition: participant requests verbal guidance, or navigates to a dead end and requires backtracking more than once.</w:t>
       </w:r>
     </w:p>
-    <w:bookmarkEnd w:id="66"/>
-    <w:bookmarkStart w:id="67" w:name="performance-page-response-time"/>
+    <w:bookmarkEnd w:id="67"/>
+    <w:bookmarkStart w:id="68" w:name="performance-page-response-time"/>
     <w:p>
       <w:pPr>
         <w:pStyle w:val="Heading2"/>
@@ -5565,8 +5689,8 @@
         <w:t xml:space="preserve">Measurement method: load testing tool (e.g., k6 or Apache JMeter) simulating 100 concurrent users performing mixed read/write operations over a 10-minute sustained run.</w:t>
       </w:r>
     </w:p>
-    <w:bookmarkEnd w:id="67"/>
-    <w:bookmarkStart w:id="68" w:name="availability-platform-uptime"/>
+    <w:bookmarkEnd w:id="68"/>
+    <w:bookmarkStart w:id="69" w:name="availability-platform-uptime"/>
     <w:p>
       <w:pPr>
         <w:pStyle w:val="Heading2"/>
@@ -5749,8 +5873,8 @@
         <w:t xml:space="preserve">Measurement method: external uptime monitoring service polling the application health endpoint at 1-minute intervals.</w:t>
       </w:r>
     </w:p>
-    <w:bookmarkEnd w:id="68"/>
-    <w:bookmarkStart w:id="69" w:name="tenant-provisioning-time"/>
+    <w:bookmarkEnd w:id="69"/>
+    <w:bookmarkStart w:id="70" w:name="tenant-provisioning-time"/>
     <w:p>
       <w:pPr>
         <w:pStyle w:val="Heading2"/>
@@ -5865,8 +5989,8 @@
         <w:t xml:space="preserve">Measurement method: automated provisioning test run at each deployment; time recorded from payment webhook receipt to successful first login.</w:t>
       </w:r>
     </w:p>
-    <w:bookmarkEnd w:id="69"/>
-    <w:bookmarkStart w:id="70" w:name="revenue-milestones-1"/>
+    <w:bookmarkEnd w:id="70"/>
+    <w:bookmarkStart w:id="71" w:name="revenue-milestones-1"/>
     <w:p>
       <w:pPr>
         <w:pStyle w:val="Heading2"/>
@@ -6189,8 +6313,8 @@
         <w:t xml:space="preserve">Revenue milestones are gate criteria for market expansion phases. Phase 2 development budget is not released until Phase 1 MRR target is achieved for two consecutive months.</w:t>
       </w:r>
     </w:p>
-    <w:bookmarkEnd w:id="70"/>
-    <w:bookmarkStart w:id="71" w:name="security-and-compliance"/>
+    <w:bookmarkEnd w:id="71"/>
+    <w:bookmarkStart w:id="72" w:name="security-and-compliance"/>
     <w:p>
       <w:pPr>
         <w:pStyle w:val="Heading2"/>
@@ -6309,9 +6433,9 @@
         </w:tc>
       </w:tr>
     </w:tbl>
-    <w:bookmarkEnd w:id="71"/>
     <w:bookmarkEnd w:id="72"/>
-    <w:bookmarkStart w:id="77" w:name="open-questions--internal-decision-gaps"/>
+    <w:bookmarkEnd w:id="73"/>
+    <w:bookmarkStart w:id="78" w:name="open-questions--internal-decision-gaps"/>
     <w:p>
       <w:pPr>
         <w:pStyle w:val="Heading1"/>
@@ -6335,7 +6459,7 @@
         </w:pict>
       </w:r>
     </w:p>
-    <w:bookmarkStart w:id="73" w:name="gap-015-white-labelling-policy"/>
+    <w:bookmarkStart w:id="74" w:name="gap-015-white-labelling-policy"/>
     <w:p>
       <w:pPr>
         <w:pStyle w:val="Heading2"/>
@@ -6397,7 +6521,7 @@
         <w:pStyle w:val="Compact"/>
         <w:numPr>
           <w:ilvl w:val="0"/>
-          <w:numId w:val="1006"/>
+          <w:numId w:val="1007"/>
         </w:numPr>
       </w:pPr>
       <w:r>
@@ -6409,7 +6533,7 @@
         <w:pStyle w:val="Compact"/>
         <w:numPr>
           <w:ilvl w:val="0"/>
-          <w:numId w:val="1006"/>
+          <w:numId w:val="1007"/>
         </w:numPr>
       </w:pPr>
       <w:r>
@@ -6421,7 +6545,7 @@
         <w:pStyle w:val="Compact"/>
         <w:numPr>
           <w:ilvl w:val="0"/>
-          <w:numId w:val="1006"/>
+          <w:numId w:val="1007"/>
         </w:numPr>
       </w:pPr>
       <w:r>
@@ -6465,8 +6589,8 @@
         </w:pict>
       </w:r>
     </w:p>
-    <w:bookmarkEnd w:id="73"/>
-    <w:bookmarkStart w:id="74" w:name="gap-016-hospitality-module-scope"/>
+    <w:bookmarkEnd w:id="74"/>
+    <w:bookmarkStart w:id="75" w:name="gap-016-hospitality-module-scope"/>
     <w:p>
       <w:pPr>
         <w:pStyle w:val="Heading2"/>
@@ -6537,7 +6661,7 @@
         <w:pStyle w:val="Compact"/>
         <w:numPr>
           <w:ilvl w:val="0"/>
-          <w:numId w:val="1007"/>
+          <w:numId w:val="1008"/>
         </w:numPr>
       </w:pPr>
       <w:r>
@@ -6549,7 +6673,7 @@
         <w:pStyle w:val="Compact"/>
         <w:numPr>
           <w:ilvl w:val="0"/>
-          <w:numId w:val="1007"/>
+          <w:numId w:val="1008"/>
         </w:numPr>
       </w:pPr>
       <w:r>
@@ -6561,7 +6685,7 @@
         <w:pStyle w:val="Compact"/>
         <w:numPr>
           <w:ilvl w:val="0"/>
-          <w:numId w:val="1007"/>
+          <w:numId w:val="1008"/>
         </w:numPr>
       </w:pPr>
       <w:r>
@@ -6602,8 +6726,8 @@
         </w:pict>
       </w:r>
     </w:p>
-    <w:bookmarkEnd w:id="74"/>
-    <w:bookmarkStart w:id="75" w:name="Xa1dd700d3e7c29a6b86db3cd21562eacf4be287"/>
+    <w:bookmarkEnd w:id="75"/>
+    <w:bookmarkStart w:id="76" w:name="Xa1dd700d3e7c29a6b86db3cd21562eacf4be287"/>
     <w:p>
       <w:pPr>
         <w:pStyle w:val="Heading2"/>
@@ -6665,7 +6789,7 @@
         <w:pStyle w:val="Compact"/>
         <w:numPr>
           <w:ilvl w:val="0"/>
-          <w:numId w:val="1008"/>
+          <w:numId w:val="1009"/>
         </w:numPr>
       </w:pPr>
       <w:r>
@@ -6686,7 +6810,7 @@
         <w:pStyle w:val="Compact"/>
         <w:numPr>
           <w:ilvl w:val="0"/>
-          <w:numId w:val="1008"/>
+          <w:numId w:val="1009"/>
         </w:numPr>
       </w:pPr>
       <w:r>
@@ -6698,7 +6822,7 @@
         <w:pStyle w:val="Compact"/>
         <w:numPr>
           <w:ilvl w:val="0"/>
-          <w:numId w:val="1008"/>
+          <w:numId w:val="1009"/>
         </w:numPr>
       </w:pPr>
       <w:r>
@@ -6745,8 +6869,8 @@
         </w:pict>
       </w:r>
     </w:p>
-    <w:bookmarkEnd w:id="75"/>
-    <w:bookmarkStart w:id="76" w:name="gap-018-source-code-strategy"/>
+    <w:bookmarkEnd w:id="76"/>
+    <w:bookmarkStart w:id="77" w:name="gap-018-source-code-strategy"/>
     <w:p>
       <w:pPr>
         <w:pStyle w:val="Heading2"/>
@@ -6808,7 +6932,7 @@
         <w:pStyle w:val="Compact"/>
         <w:numPr>
           <w:ilvl w:val="0"/>
-          <w:numId w:val="1009"/>
+          <w:numId w:val="1010"/>
         </w:numPr>
       </w:pPr>
       <w:r>
@@ -6820,7 +6944,7 @@
         <w:pStyle w:val="Compact"/>
         <w:numPr>
           <w:ilvl w:val="0"/>
-          <w:numId w:val="1009"/>
+          <w:numId w:val="1010"/>
         </w:numPr>
       </w:pPr>
       <w:r>
@@ -6832,7 +6956,7 @@
         <w:pStyle w:val="Compact"/>
         <w:numPr>
           <w:ilvl w:val="0"/>
-          <w:numId w:val="1009"/>
+          <w:numId w:val="1010"/>
         </w:numPr>
       </w:pPr>
       <w:r>
@@ -6876,9 +7000,9 @@
         <w:t xml:space="preserve">All 4 gaps above must be reviewed and signed off by Peter Bamuhigire before the documents they block are submitted for phase-gate approval.</w:t>
       </w:r>
     </w:p>
-    <w:bookmarkEnd w:id="76"/>
     <w:bookmarkEnd w:id="77"/>
-    <w:bookmarkStart w:id="85" w:name="Xb38158efe5c70268bffb632872174aebaaeea8e"/>
+    <w:bookmarkEnd w:id="78"/>
+    <w:bookmarkStart w:id="86" w:name="Xb38158efe5c70268bffb632872174aebaaeea8e"/>
     <w:p>
       <w:pPr>
         <w:pStyle w:val="Heading1"/>
@@ -6887,7 +7011,7 @@
         <w:t xml:space="preserve">AI Intelligence Module — Intelligent Business Add-On</w:t>
       </w:r>
     </w:p>
-    <w:bookmarkStart w:id="78" w:name="positioning"/>
+    <w:bookmarkStart w:id="79" w:name="positioning"/>
     <w:p>
       <w:pPr>
         <w:pStyle w:val="Heading2"/>
@@ -6942,8 +7066,8 @@
         </w:pict>
       </w:r>
     </w:p>
-    <w:bookmarkEnd w:id="78"/>
-    <w:bookmarkStart w:id="79" w:name="X55e2a79977ea7a1d8ff12997b8b5425d3f10854"/>
+    <w:bookmarkEnd w:id="79"/>
+    <w:bookmarkStart w:id="80" w:name="X55e2a79977ea7a1d8ff12997b8b5425d3f10854"/>
     <w:p>
       <w:pPr>
         <w:pStyle w:val="Heading2"/>
@@ -7067,8 +7191,8 @@
         </w:pict>
       </w:r>
     </w:p>
-    <w:bookmarkEnd w:id="79"/>
-    <w:bookmarkStart w:id="80" w:name="Xb20f5f86fc741c1035dac928e5245ecd5fe83da"/>
+    <w:bookmarkEnd w:id="80"/>
+    <w:bookmarkStart w:id="81" w:name="Xb20f5f86fc741c1035dac928e5245ecd5fe83da"/>
     <w:p>
       <w:pPr>
         <w:pStyle w:val="Heading2"/>
@@ -7192,8 +7316,8 @@
         </w:pict>
       </w:r>
     </w:p>
-    <w:bookmarkEnd w:id="80"/>
-    <w:bookmarkStart w:id="81" w:name="X6ee0b7705dc9348be3351465ebb1fbd1e778047"/>
+    <w:bookmarkEnd w:id="81"/>
+    <w:bookmarkStart w:id="82" w:name="X6ee0b7705dc9348be3351465ebb1fbd1e778047"/>
     <w:p>
       <w:pPr>
         <w:pStyle w:val="Heading2"/>
@@ -7317,8 +7441,8 @@
         </w:pict>
       </w:r>
     </w:p>
-    <w:bookmarkEnd w:id="81"/>
-    <w:bookmarkStart w:id="82" w:name="Xfb33015a467edff35a6f4c58b1a60d7813b1fa7"/>
+    <w:bookmarkEnd w:id="82"/>
+    <w:bookmarkStart w:id="83" w:name="Xfb33015a467edff35a6f4c58b1a60d7813b1fa7"/>
     <w:p>
       <w:pPr>
         <w:pStyle w:val="Heading2"/>
@@ -7442,8 +7566,8 @@
         </w:pict>
       </w:r>
     </w:p>
-    <w:bookmarkEnd w:id="82"/>
-    <w:bookmarkStart w:id="83" w:name="Xf899a5ad0e538e65599cf5dd64375d3e3dbbf43"/>
+    <w:bookmarkEnd w:id="83"/>
+    <w:bookmarkStart w:id="84" w:name="Xf899a5ad0e538e65599cf5dd64375d3e3dbbf43"/>
     <w:p>
       <w:pPr>
         <w:pStyle w:val="Heading2"/>
@@ -7567,8 +7691,8 @@
         </w:pict>
       </w:r>
     </w:p>
-    <w:bookmarkEnd w:id="83"/>
-    <w:bookmarkStart w:id="84" w:name="ai-intelligence-module-packaging-summary"/>
+    <w:bookmarkEnd w:id="84"/>
+    <w:bookmarkStart w:id="85" w:name="ai-intelligence-module-packaging-summary"/>
     <w:p>
       <w:pPr>
         <w:pStyle w:val="Heading2"/>
@@ -7900,9 +8024,9 @@
         <w:t xml:space="preserve">.</w:t>
       </w:r>
     </w:p>
-    <w:bookmarkEnd w:id="84"/>
     <w:bookmarkEnd w:id="85"/>
-    <w:bookmarkStart w:id="92" w:name="Xf8227227ae81cf775b96b824b0c2b3d248f77e6"/>
+    <w:bookmarkEnd w:id="86"/>
+    <w:bookmarkStart w:id="93" w:name="Xf8227227ae81cf775b96b824b0c2b3d248f77e6"/>
     <w:p>
       <w:pPr>
         <w:pStyle w:val="Heading1"/>
@@ -7911,7 +8035,7 @@
         <w:t xml:space="preserve">Industrial Lifecycle, Manufacturing Execution, and Transportation Depth</w:t>
       </w:r>
     </w:p>
-    <w:bookmarkStart w:id="86" w:name="positioning-1"/>
+    <w:bookmarkStart w:id="87" w:name="positioning-1"/>
     <w:p>
       <w:pPr>
         <w:pStyle w:val="Heading2"/>
@@ -7941,7 +8065,7 @@
         <w:pStyle w:val="Compact"/>
         <w:numPr>
           <w:ilvl w:val="0"/>
-          <w:numId w:val="1010"/>
+          <w:numId w:val="1011"/>
         </w:numPr>
       </w:pPr>
       <w:r>
@@ -7963,7 +8087,7 @@
         <w:pStyle w:val="Compact"/>
         <w:numPr>
           <w:ilvl w:val="0"/>
-          <w:numId w:val="1010"/>
+          <w:numId w:val="1011"/>
         </w:numPr>
       </w:pPr>
       <w:r>
@@ -7985,7 +8109,7 @@
         <w:pStyle w:val="Compact"/>
         <w:numPr>
           <w:ilvl w:val="0"/>
-          <w:numId w:val="1010"/>
+          <w:numId w:val="1011"/>
         </w:numPr>
       </w:pPr>
       <w:r>
@@ -8017,8 +8141,8 @@
         </w:pict>
       </w:r>
     </w:p>
-    <w:bookmarkEnd w:id="86"/>
-    <w:bookmarkStart w:id="87" w:name="Xd0b0d03c0071c3f3e0e467c5dd714c3d98adad1"/>
+    <w:bookmarkEnd w:id="87"/>
+    <w:bookmarkStart w:id="88" w:name="Xd0b0d03c0071c3f3e0e467c5dd714c3d98adad1"/>
     <w:p>
       <w:pPr>
         <w:pStyle w:val="Heading2"/>
@@ -8142,8 +8266,8 @@
         </w:pict>
       </w:r>
     </w:p>
-    <w:bookmarkEnd w:id="87"/>
-    <w:bookmarkStart w:id="88" w:name="X13f49fd4699712dbe2b9c2d929fcd469a871e88"/>
+    <w:bookmarkEnd w:id="88"/>
+    <w:bookmarkStart w:id="89" w:name="X13f49fd4699712dbe2b9c2d929fcd469a871e88"/>
     <w:p>
       <w:pPr>
         <w:pStyle w:val="Heading2"/>
@@ -8267,8 +8391,8 @@
         </w:pict>
       </w:r>
     </w:p>
-    <w:bookmarkEnd w:id="88"/>
-    <w:bookmarkStart w:id="89" w:name="Xa22881436a94f03bf8d5882337a9f7298ad818a"/>
+    <w:bookmarkEnd w:id="89"/>
+    <w:bookmarkStart w:id="90" w:name="Xa22881436a94f03bf8d5882337a9f7298ad818a"/>
     <w:p>
       <w:pPr>
         <w:pStyle w:val="Heading2"/>
@@ -8392,8 +8516,8 @@
         </w:pict>
       </w:r>
     </w:p>
-    <w:bookmarkEnd w:id="89"/>
-    <w:bookmarkStart w:id="90" w:name="capability-4-fleet-operations-control"/>
+    <w:bookmarkEnd w:id="90"/>
+    <w:bookmarkStart w:id="91" w:name="capability-4-fleet-operations-control"/>
     <w:p>
       <w:pPr>
         <w:pStyle w:val="Heading2"/>
@@ -8517,8 +8641,8 @@
         </w:pict>
       </w:r>
     </w:p>
-    <w:bookmarkEnd w:id="90"/>
-    <w:bookmarkStart w:id="91" w:name="product-boundary-rule"/>
+    <w:bookmarkEnd w:id="91"/>
+    <w:bookmarkStart w:id="92" w:name="product-boundary-rule"/>
     <w:p>
       <w:pPr>
         <w:pStyle w:val="Heading2"/>
@@ -8540,7 +8664,7 @@
         <w:pStyle w:val="Compact"/>
         <w:numPr>
           <w:ilvl w:val="0"/>
-          <w:numId w:val="1011"/>
+          <w:numId w:val="1012"/>
         </w:numPr>
       </w:pPr>
       <w:r>
@@ -8561,7 +8685,7 @@
         <w:pStyle w:val="Compact"/>
         <w:numPr>
           <w:ilvl w:val="0"/>
-          <w:numId w:val="1011"/>
+          <w:numId w:val="1012"/>
         </w:numPr>
       </w:pPr>
       <w:r>
@@ -8582,7 +8706,7 @@
         <w:pStyle w:val="Compact"/>
         <w:numPr>
           <w:ilvl w:val="0"/>
-          <w:numId w:val="1011"/>
+          <w:numId w:val="1012"/>
         </w:numPr>
       </w:pPr>
       <w:r>
@@ -8603,7 +8727,7 @@
         <w:pStyle w:val="Compact"/>
         <w:numPr>
           <w:ilvl w:val="0"/>
-          <w:numId w:val="1011"/>
+          <w:numId w:val="1012"/>
         </w:numPr>
       </w:pPr>
       <w:r>
@@ -8627,8 +8751,1379 @@
         <w:t xml:space="preserve">This separation keeps decision rights clear while still giving the customer one integrated ERP platform.</w:t>
       </w:r>
     </w:p>
-    <w:bookmarkEnd w:id="91"/>
     <w:bookmarkEnd w:id="92"/>
+    <w:bookmarkEnd w:id="93"/>
+    <w:bookmarkStart w:id="102" w:name="finance-erp-excellence"/>
+    <w:p>
+      <w:pPr>
+        <w:pStyle w:val="Heading1"/>
+      </w:pPr>
+      <w:r>
+        <w:t xml:space="preserve">Finance ERP Excellence</w:t>
+      </w:r>
+    </w:p>
+    <w:bookmarkStart w:id="94" w:name="positioning-2"/>
+    <w:p>
+      <w:pPr>
+        <w:pStyle w:val="Heading2"/>
+      </w:pPr>
+      <w:r>
+        <w:t xml:space="preserve">Positioning</w:t>
+      </w:r>
+    </w:p>
+    <w:p>
+      <w:pPr>
+        <w:pStyle w:val="FirstParagraph"/>
+      </w:pPr>
+      <w:r>
+        <w:t xml:space="preserve">Longhorn ERP aims to be a world-class African ERP for organisations that must control money, risk, operations, and growth from a single platform. In that positioning, finance is not a back-office afterthought. It is the control tower for trust, capital discipline, operational visibility, and board-level decision-making.</w:t>
+      </w:r>
+    </w:p>
+    <w:p>
+      <w:pPr>
+        <w:pStyle w:val="BodyText"/>
+      </w:pPr>
+      <w:r>
+        <w:t xml:space="preserve">Longhorn ERP keeps</w:t>
+      </w:r>
+      <w:r>
+        <w:t xml:space="preserve"> </w:t>
+      </w:r>
+      <w:r>
+        <w:rPr>
+          <w:rStyle w:val="VerbatimChar"/>
+        </w:rPr>
+        <w:t xml:space="preserve">ACCOUNTING</w:t>
+      </w:r>
+      <w:r>
+        <w:t xml:space="preserve"> </w:t>
+      </w:r>
+      <w:r>
+        <w:t xml:space="preserve">as the core finance module. The product does not fragment finance into disconnected mini-products. Instead, it deepens</w:t>
+      </w:r>
+      <w:r>
+        <w:t xml:space="preserve"> </w:t>
+      </w:r>
+      <w:r>
+        <w:rPr>
+          <w:rStyle w:val="VerbatimChar"/>
+        </w:rPr>
+        <w:t xml:space="preserve">ACCOUNTING</w:t>
+      </w:r>
+      <w:r>
+        <w:t xml:space="preserve"> </w:t>
+      </w:r>
+      <w:r>
+        <w:t xml:space="preserve">so the same financial core can serve:</w:t>
+      </w:r>
+    </w:p>
+    <w:p>
+      <w:pPr>
+        <w:pStyle w:val="Compact"/>
+        <w:numPr>
+          <w:ilvl w:val="0"/>
+          <w:numId w:val="1013"/>
+        </w:numPr>
+      </w:pPr>
+      <w:r>
+        <w:t xml:space="preserve">small businesses that need strong controls early</w:t>
+      </w:r>
+    </w:p>
+    <w:p>
+      <w:pPr>
+        <w:pStyle w:val="Compact"/>
+        <w:numPr>
+          <w:ilvl w:val="0"/>
+          <w:numId w:val="1013"/>
+        </w:numPr>
+      </w:pPr>
+      <w:r>
+        <w:t xml:space="preserve">mid-market organisations that need faster close and better management reporting</w:t>
+      </w:r>
+    </w:p>
+    <w:p>
+      <w:pPr>
+        <w:pStyle w:val="Compact"/>
+        <w:numPr>
+          <w:ilvl w:val="0"/>
+          <w:numId w:val="1013"/>
+        </w:numPr>
+      </w:pPr>
+      <w:r>
+        <w:t xml:space="preserve">larger multi-entity groups that need consolidation foundations, finance governance, and audit-ready evidence</w:t>
+      </w:r>
+    </w:p>
+    <w:bookmarkEnd w:id="94"/>
+    <w:bookmarkStart w:id="100" w:name="world-class-finance-capability-themes"/>
+    <w:p>
+      <w:pPr>
+        <w:pStyle w:val="Heading2"/>
+      </w:pPr>
+      <w:r>
+        <w:t xml:space="preserve">World-Class Finance Capability Themes</w:t>
+      </w:r>
+    </w:p>
+    <w:bookmarkStart w:id="95" w:name="X09df0a9dee15f5e7f9eca8102801b6591576de1"/>
+    <w:p>
+      <w:pPr>
+        <w:pStyle w:val="Heading3"/>
+      </w:pPr>
+      <w:r>
+        <w:t xml:space="preserve">1. Record-to-Report Discipline</w:t>
+      </w:r>
+    </w:p>
+    <w:p>
+      <w:pPr>
+        <w:pStyle w:val="FirstParagraph"/>
+      </w:pPr>
+      <w:r>
+        <w:t xml:space="preserve">Longhorn ERP must support a disciplined record-to-report operating model rather than loose transaction capture. Finance teams should be able to move from source transactions to trusted books and formal reporting with clear controls at each stage.</w:t>
+      </w:r>
+    </w:p>
+    <w:p>
+      <w:pPr>
+        <w:pStyle w:val="BodyText"/>
+      </w:pPr>
+      <w:r>
+        <w:t xml:space="preserve">Core expectations include:</w:t>
+      </w:r>
+    </w:p>
+    <w:p>
+      <w:pPr>
+        <w:pStyle w:val="Compact"/>
+        <w:numPr>
+          <w:ilvl w:val="0"/>
+          <w:numId w:val="1014"/>
+        </w:numPr>
+      </w:pPr>
+      <w:r>
+        <w:t xml:space="preserve">chart of accounts governance with dimensional reporting support</w:t>
+      </w:r>
+    </w:p>
+    <w:p>
+      <w:pPr>
+        <w:pStyle w:val="Compact"/>
+        <w:numPr>
+          <w:ilvl w:val="0"/>
+          <w:numId w:val="1014"/>
+        </w:numPr>
+      </w:pPr>
+      <w:r>
+        <w:t xml:space="preserve">controlled journals with maker-checker review where configured</w:t>
+      </w:r>
+    </w:p>
+    <w:p>
+      <w:pPr>
+        <w:pStyle w:val="Compact"/>
+        <w:numPr>
+          <w:ilvl w:val="0"/>
+          <w:numId w:val="1014"/>
+        </w:numPr>
+      </w:pPr>
+      <w:r>
+        <w:t xml:space="preserve">accounting period management with open, soft-close, hard-close, and re-open controls</w:t>
+      </w:r>
+    </w:p>
+    <w:p>
+      <w:pPr>
+        <w:pStyle w:val="Compact"/>
+        <w:numPr>
+          <w:ilvl w:val="0"/>
+          <w:numId w:val="1014"/>
+        </w:numPr>
+      </w:pPr>
+      <w:r>
+        <w:t xml:space="preserve">subledger-to-GL reconciliation support across receivables, payables, inventory, payroll, banking, fixed assets, and manufacturing cost flows</w:t>
+      </w:r>
+    </w:p>
+    <w:p>
+      <w:pPr>
+        <w:pStyle w:val="Compact"/>
+        <w:numPr>
+          <w:ilvl w:val="0"/>
+          <w:numId w:val="1014"/>
+        </w:numPr>
+      </w:pPr>
+      <w:r>
+        <w:t xml:space="preserve">accrual, prepayment, adjustment, and reclassification discipline</w:t>
+      </w:r>
+    </w:p>
+    <w:p>
+      <w:pPr>
+        <w:pStyle w:val="Compact"/>
+        <w:numPr>
+          <w:ilvl w:val="0"/>
+          <w:numId w:val="1014"/>
+        </w:numPr>
+      </w:pPr>
+      <w:r>
+        <w:t xml:space="preserve">audit-ready evidence for postings, reversals, overrides, and late adjustments</w:t>
+      </w:r>
+    </w:p>
+    <w:bookmarkEnd w:id="95"/>
+    <w:bookmarkStart w:id="96" w:name="Xa5a01402f503996e742a4ccc292d5b22a0fb1ec"/>
+    <w:p>
+      <w:pPr>
+        <w:pStyle w:val="Heading3"/>
+      </w:pPr>
+      <w:r>
+        <w:t xml:space="preserve">2. Close Orchestration</w:t>
+      </w:r>
+    </w:p>
+    <w:p>
+      <w:pPr>
+        <w:pStyle w:val="FirstParagraph"/>
+      </w:pPr>
+      <w:r>
+        <w:t xml:space="preserve">Longhorn ERP must help finance teams run a repeatable monthly, quarterly, and annual close, not just post entries into the ledger. Close should be visible, accountable, and measurable.</w:t>
+      </w:r>
+    </w:p>
+    <w:p>
+      <w:pPr>
+        <w:pStyle w:val="BodyText"/>
+      </w:pPr>
+      <w:r>
+        <w:t xml:space="preserve">Core expectations include:</w:t>
+      </w:r>
+    </w:p>
+    <w:p>
+      <w:pPr>
+        <w:pStyle w:val="Compact"/>
+        <w:numPr>
+          <w:ilvl w:val="0"/>
+          <w:numId w:val="1015"/>
+        </w:numPr>
+      </w:pPr>
+      <w:r>
+        <w:t xml:space="preserve">close calendars and period-specific close checklists</w:t>
+      </w:r>
+    </w:p>
+    <w:p>
+      <w:pPr>
+        <w:pStyle w:val="Compact"/>
+        <w:numPr>
+          <w:ilvl w:val="0"/>
+          <w:numId w:val="1015"/>
+        </w:numPr>
+      </w:pPr>
+      <w:r>
+        <w:t xml:space="preserve">assigned close tasks with owners, due dates, status, and blockers</w:t>
+      </w:r>
+    </w:p>
+    <w:p>
+      <w:pPr>
+        <w:pStyle w:val="Compact"/>
+        <w:numPr>
+          <w:ilvl w:val="0"/>
+          <w:numId w:val="1015"/>
+        </w:numPr>
+      </w:pPr>
+      <w:r>
+        <w:t xml:space="preserve">dependency-aware close sequencing across branches, business units, and entities</w:t>
+      </w:r>
+    </w:p>
+    <w:p>
+      <w:pPr>
+        <w:pStyle w:val="Compact"/>
+        <w:numPr>
+          <w:ilvl w:val="0"/>
+          <w:numId w:val="1015"/>
+        </w:numPr>
+      </w:pPr>
+      <w:r>
+        <w:t xml:space="preserve">review and sign-off workflow for critical close activities</w:t>
+      </w:r>
+    </w:p>
+    <w:p>
+      <w:pPr>
+        <w:pStyle w:val="Compact"/>
+        <w:numPr>
+          <w:ilvl w:val="0"/>
+          <w:numId w:val="1015"/>
+        </w:numPr>
+      </w:pPr>
+      <w:r>
+        <w:t xml:space="preserve">issue and exception tracking for unresolved reconciling items</w:t>
+      </w:r>
+    </w:p>
+    <w:p>
+      <w:pPr>
+        <w:pStyle w:val="Compact"/>
+        <w:numPr>
+          <w:ilvl w:val="0"/>
+          <w:numId w:val="1015"/>
+        </w:numPr>
+      </w:pPr>
+      <w:r>
+        <w:t xml:space="preserve">close dashboards for CFO, controller, and finance manager oversight</w:t>
+      </w:r>
+    </w:p>
+    <w:bookmarkEnd w:id="96"/>
+    <w:bookmarkStart w:id="97" w:name="X14170d31aef46dfa8cebb56c689ed01ad39bbb8"/>
+    <w:p>
+      <w:pPr>
+        <w:pStyle w:val="Heading3"/>
+      </w:pPr>
+      <w:r>
+        <w:t xml:space="preserve">3. Consolidation Foundations</w:t>
+      </w:r>
+    </w:p>
+    <w:p>
+      <w:pPr>
+        <w:pStyle w:val="FirstParagraph"/>
+      </w:pPr>
+      <w:r>
+        <w:t xml:space="preserve">Longhorn ERP should support growth into group finance without forcing customers to replace the financial core once they expand. The system should therefore provide consolidation foundations even where full advanced consolidation is phased in over time.</w:t>
+      </w:r>
+    </w:p>
+    <w:p>
+      <w:pPr>
+        <w:pStyle w:val="BodyText"/>
+      </w:pPr>
+      <w:r>
+        <w:t xml:space="preserve">Core expectations include:</w:t>
+      </w:r>
+    </w:p>
+    <w:p>
+      <w:pPr>
+        <w:pStyle w:val="Compact"/>
+        <w:numPr>
+          <w:ilvl w:val="0"/>
+          <w:numId w:val="1016"/>
+        </w:numPr>
+      </w:pPr>
+      <w:r>
+        <w:t xml:space="preserve">legal-entity and branch structures aligned to finance reporting needs</w:t>
+      </w:r>
+    </w:p>
+    <w:p>
+      <w:pPr>
+        <w:pStyle w:val="Compact"/>
+        <w:numPr>
+          <w:ilvl w:val="0"/>
+          <w:numId w:val="1016"/>
+        </w:numPr>
+      </w:pPr>
+      <w:r>
+        <w:t xml:space="preserve">multi-company and multi-currency foundations</w:t>
+      </w:r>
+    </w:p>
+    <w:p>
+      <w:pPr>
+        <w:pStyle w:val="Compact"/>
+        <w:numPr>
+          <w:ilvl w:val="0"/>
+          <w:numId w:val="1016"/>
+        </w:numPr>
+      </w:pPr>
+      <w:r>
+        <w:t xml:space="preserve">intercompany transaction discipline and reconciliation readiness</w:t>
+      </w:r>
+    </w:p>
+    <w:p>
+      <w:pPr>
+        <w:pStyle w:val="Compact"/>
+        <w:numPr>
+          <w:ilvl w:val="0"/>
+          <w:numId w:val="1016"/>
+        </w:numPr>
+      </w:pPr>
+      <w:r>
+        <w:t xml:space="preserve">elimination support foundations for group reporting</w:t>
+      </w:r>
+    </w:p>
+    <w:p>
+      <w:pPr>
+        <w:pStyle w:val="Compact"/>
+        <w:numPr>
+          <w:ilvl w:val="0"/>
+          <w:numId w:val="1016"/>
+        </w:numPr>
+      </w:pPr>
+      <w:r>
+        <w:t xml:space="preserve">common dimensional design to support entity, branch, department, project, and product-line reporting</w:t>
+      </w:r>
+    </w:p>
+    <w:p>
+      <w:pPr>
+        <w:pStyle w:val="Compact"/>
+        <w:numPr>
+          <w:ilvl w:val="0"/>
+          <w:numId w:val="1016"/>
+        </w:numPr>
+      </w:pPr>
+      <w:r>
+        <w:t xml:space="preserve">group pack preparation for board, lender, investor, and statutory reporting</w:t>
+      </w:r>
+    </w:p>
+    <w:bookmarkEnd w:id="97"/>
+    <w:bookmarkStart w:id="98" w:name="X1f4ff391e5add7e26faf81aa846ee5581848876"/>
+    <w:p>
+      <w:pPr>
+        <w:pStyle w:val="Heading3"/>
+      </w:pPr>
+      <w:r>
+        <w:t xml:space="preserve">4. Finance Controls, Workflow, and Approvals</w:t>
+      </w:r>
+    </w:p>
+    <w:p>
+      <w:pPr>
+        <w:pStyle w:val="FirstParagraph"/>
+      </w:pPr>
+      <w:r>
+        <w:t xml:space="preserve">Longhorn ERP must make control design a product capability, not a consulting afterthought. African organisations often operate in environments where fraud resistance, policy compliance, and delegated authority discipline materially affect survival and growth.</w:t>
+      </w:r>
+    </w:p>
+    <w:p>
+      <w:pPr>
+        <w:pStyle w:val="BodyText"/>
+      </w:pPr>
+      <w:r>
+        <w:t xml:space="preserve">Core expectations include:</w:t>
+      </w:r>
+    </w:p>
+    <w:p>
+      <w:pPr>
+        <w:pStyle w:val="Compact"/>
+        <w:numPr>
+          <w:ilvl w:val="0"/>
+          <w:numId w:val="1017"/>
+        </w:numPr>
+      </w:pPr>
+      <w:r>
+        <w:t xml:space="preserve">maker-checker workflows for sensitive finance actions</w:t>
+      </w:r>
+    </w:p>
+    <w:p>
+      <w:pPr>
+        <w:pStyle w:val="Compact"/>
+        <w:numPr>
+          <w:ilvl w:val="0"/>
+          <w:numId w:val="1017"/>
+        </w:numPr>
+      </w:pPr>
+      <w:r>
+        <w:t xml:space="preserve">configurable approval thresholds by transaction type, amount, entity, and role</w:t>
+      </w:r>
+    </w:p>
+    <w:p>
+      <w:pPr>
+        <w:pStyle w:val="Compact"/>
+        <w:numPr>
+          <w:ilvl w:val="0"/>
+          <w:numId w:val="1017"/>
+        </w:numPr>
+      </w:pPr>
+      <w:r>
+        <w:t xml:space="preserve">segregation-of-duties-aware workflow design</w:t>
+      </w:r>
+    </w:p>
+    <w:p>
+      <w:pPr>
+        <w:pStyle w:val="Compact"/>
+        <w:numPr>
+          <w:ilvl w:val="0"/>
+          <w:numId w:val="1017"/>
+        </w:numPr>
+      </w:pPr>
+      <w:r>
+        <w:t xml:space="preserve">controlled overrides with reason capture and audit logging</w:t>
+      </w:r>
+    </w:p>
+    <w:p>
+      <w:pPr>
+        <w:pStyle w:val="Compact"/>
+        <w:numPr>
+          <w:ilvl w:val="0"/>
+          <w:numId w:val="1017"/>
+        </w:numPr>
+      </w:pPr>
+      <w:r>
+        <w:t xml:space="preserve">posting and period-lock controls to reduce unauthorised back-dated changes</w:t>
+      </w:r>
+    </w:p>
+    <w:p>
+      <w:pPr>
+        <w:pStyle w:val="Compact"/>
+        <w:numPr>
+          <w:ilvl w:val="0"/>
+          <w:numId w:val="1017"/>
+        </w:numPr>
+      </w:pPr>
+      <w:r>
+        <w:t xml:space="preserve">exception queues for finance review, escalation, and remediation</w:t>
+      </w:r>
+    </w:p>
+    <w:bookmarkEnd w:id="98"/>
+    <w:bookmarkStart w:id="99" w:name="X963125afec8492fd01bf9b1358ab11d7e7cf0e2"/>
+    <w:p>
+      <w:pPr>
+        <w:pStyle w:val="Heading3"/>
+      </w:pPr>
+      <w:r>
+        <w:t xml:space="preserve">5. Reporting Foundations</w:t>
+      </w:r>
+    </w:p>
+    <w:p>
+      <w:pPr>
+        <w:pStyle w:val="FirstParagraph"/>
+      </w:pPr>
+      <w:r>
+        <w:t xml:space="preserve">Longhorn ERP must make finance reporting trustworthy, timely, and reusable. Reporting foundations should support daily operational finance use as well as formal management and statutory reporting.</w:t>
+      </w:r>
+    </w:p>
+    <w:p>
+      <w:pPr>
+        <w:pStyle w:val="BodyText"/>
+      </w:pPr>
+      <w:r>
+        <w:t xml:space="preserve">Core expectations include:</w:t>
+      </w:r>
+    </w:p>
+    <w:p>
+      <w:pPr>
+        <w:pStyle w:val="Compact"/>
+        <w:numPr>
+          <w:ilvl w:val="0"/>
+          <w:numId w:val="1018"/>
+        </w:numPr>
+      </w:pPr>
+      <w:r>
+        <w:t xml:space="preserve">trial balance, ledger, and subledger reporting that reconciles cleanly</w:t>
+      </w:r>
+    </w:p>
+    <w:p>
+      <w:pPr>
+        <w:pStyle w:val="Compact"/>
+        <w:numPr>
+          <w:ilvl w:val="0"/>
+          <w:numId w:val="1018"/>
+        </w:numPr>
+      </w:pPr>
+      <w:r>
+        <w:t xml:space="preserve">board-ready management packs built from governed finance data</w:t>
+      </w:r>
+    </w:p>
+    <w:p>
+      <w:pPr>
+        <w:pStyle w:val="Compact"/>
+        <w:numPr>
+          <w:ilvl w:val="0"/>
+          <w:numId w:val="1018"/>
+        </w:numPr>
+      </w:pPr>
+      <w:r>
+        <w:t xml:space="preserve">statutory statements and tax-supporting schedules</w:t>
+      </w:r>
+    </w:p>
+    <w:p>
+      <w:pPr>
+        <w:pStyle w:val="Compact"/>
+        <w:numPr>
+          <w:ilvl w:val="0"/>
+          <w:numId w:val="1018"/>
+        </w:numPr>
+      </w:pPr>
+      <w:r>
+        <w:t xml:space="preserve">cash, working-capital, margin, and cost analytics foundations</w:t>
+      </w:r>
+    </w:p>
+    <w:p>
+      <w:pPr>
+        <w:pStyle w:val="Compact"/>
+        <w:numPr>
+          <w:ilvl w:val="0"/>
+          <w:numId w:val="1018"/>
+        </w:numPr>
+      </w:pPr>
+      <w:r>
+        <w:t xml:space="preserve">dimensional reporting for branches, cost centres, projects, products, and channels</w:t>
+      </w:r>
+    </w:p>
+    <w:p>
+      <w:pPr>
+        <w:pStyle w:val="Compact"/>
+        <w:numPr>
+          <w:ilvl w:val="0"/>
+          <w:numId w:val="1018"/>
+        </w:numPr>
+      </w:pPr>
+      <w:r>
+        <w:t xml:space="preserve">export and integration readiness for BI, audit, and external reporting workflows</w:t>
+      </w:r>
+    </w:p>
+    <w:bookmarkEnd w:id="99"/>
+    <w:bookmarkEnd w:id="100"/>
+    <w:bookmarkStart w:id="101" w:name="strategic-implication-for-longhorn-erp"/>
+    <w:p>
+      <w:pPr>
+        <w:pStyle w:val="Heading2"/>
+      </w:pPr>
+      <w:r>
+        <w:t xml:space="preserve">Strategic Implication for Longhorn ERP</w:t>
+      </w:r>
+    </w:p>
+    <w:p>
+      <w:pPr>
+        <w:pStyle w:val="FirstParagraph"/>
+      </w:pPr>
+      <w:r>
+        <w:t xml:space="preserve">This finance positioning strengthens Longhorn ERP's credibility across African markets because it matches the real maturity path of ambitious organisations:</w:t>
+      </w:r>
+    </w:p>
+    <w:p>
+      <w:pPr>
+        <w:pStyle w:val="Compact"/>
+        <w:numPr>
+          <w:ilvl w:val="0"/>
+          <w:numId w:val="1019"/>
+        </w:numPr>
+      </w:pPr>
+      <w:r>
+        <w:t xml:space="preserve">they start by needing reliable books</w:t>
+      </w:r>
+    </w:p>
+    <w:p>
+      <w:pPr>
+        <w:pStyle w:val="Compact"/>
+        <w:numPr>
+          <w:ilvl w:val="0"/>
+          <w:numId w:val="1019"/>
+        </w:numPr>
+      </w:pPr>
+      <w:r>
+        <w:t xml:space="preserve">they then need faster close and better controls</w:t>
+      </w:r>
+    </w:p>
+    <w:p>
+      <w:pPr>
+        <w:pStyle w:val="Compact"/>
+        <w:numPr>
+          <w:ilvl w:val="0"/>
+          <w:numId w:val="1019"/>
+        </w:numPr>
+      </w:pPr>
+      <w:r>
+        <w:t xml:space="preserve">they later need multi-entity governance, stronger reporting, and investor-grade finance discipline</w:t>
+      </w:r>
+    </w:p>
+    <w:p>
+      <w:pPr>
+        <w:pStyle w:val="FirstParagraph"/>
+      </w:pPr>
+      <w:r>
+        <w:t xml:space="preserve">Longhorn ERP should meet that journey on one coherent finance architecture. The strategic standard is therefore clear:</w:t>
+      </w:r>
+      <w:r>
+        <w:t xml:space="preserve"> </w:t>
+      </w:r>
+      <w:r>
+        <w:rPr>
+          <w:rStyle w:val="VerbatimChar"/>
+        </w:rPr>
+        <w:t xml:space="preserve">ACCOUNTING</w:t>
+      </w:r>
+      <w:r>
+        <w:t xml:space="preserve"> </w:t>
+      </w:r>
+      <w:r>
+        <w:t xml:space="preserve">remains the core module, but it must operate at a level that can credibly support controller, CFO, auditor, and board expectations.</w:t>
+      </w:r>
+    </w:p>
+    <w:bookmarkEnd w:id="101"/>
+    <w:bookmarkEnd w:id="102"/>
+    <w:bookmarkStart w:id="110" w:name="Xc44d29bef89c4c8e3916317b504a4557aafdeb6"/>
+    <w:p>
+      <w:pPr>
+        <w:pStyle w:val="Heading1"/>
+      </w:pPr>
+      <w:r>
+        <w:t xml:space="preserve">13. Treasury, Capital, and Group Finance</w:t>
+      </w:r>
+    </w:p>
+    <w:bookmarkStart w:id="103" w:name="X41570d66f4a055e742c23a6d74e744e64363043"/>
+    <w:p>
+      <w:pPr>
+        <w:pStyle w:val="Heading2"/>
+      </w:pPr>
+      <w:r>
+        <w:t xml:space="preserve">13.1 Strategic Intent</w:t>
+      </w:r>
+    </w:p>
+    <w:p>
+      <w:pPr>
+        <w:pStyle w:val="FirstParagraph"/>
+      </w:pPr>
+      <w:r>
+        <w:t xml:space="preserve">LonghornERP finance must extend beyond core bookkeeping into disciplined cash, capital, and group-finance control. The platform should serve as the transactional core of record for finance operations while also providing the governance, evidence, and reporting layer needed by organizations that are scaling from single-entity operations into multi-bank, multi-asset, and multi-entity groups.</w:t>
+      </w:r>
+    </w:p>
+    <w:p>
+      <w:pPr>
+        <w:pStyle w:val="BodyText"/>
+      </w:pPr>
+      <w:r>
+        <w:t xml:space="preserve">This positioning is critical for African businesses that operate across multiple legal entities, currencies, banks, tax regimes, and operating environments. LonghornERP should help them move from founder-led cash management and spreadsheet close processes to controlled, auditable, and repeatable finance operations.</w:t>
+      </w:r>
+    </w:p>
+    <w:bookmarkEnd w:id="103"/>
+    <w:bookmarkStart w:id="104" w:name="Xa3b2207f5037ea25b5255ec8396b6e6585330c4"/>
+    <w:p>
+      <w:pPr>
+        <w:pStyle w:val="Heading2"/>
+      </w:pPr>
+      <w:r>
+        <w:t xml:space="preserve">13.2 Treasury and Bank Control Positioning</w:t>
+      </w:r>
+    </w:p>
+    <w:p>
+      <w:pPr>
+        <w:pStyle w:val="FirstParagraph"/>
+      </w:pPr>
+      <w:r>
+        <w:t xml:space="preserve">LonghornERP shall position treasury as a first-class finance capability focused on cash visibility, payment governance, and bank-operating discipline.</w:t>
+      </w:r>
+    </w:p>
+    <w:p>
+      <w:pPr>
+        <w:pStyle w:val="BodyText"/>
+      </w:pPr>
+      <w:r>
+        <w:t xml:space="preserve">The treasury posture for LonghornERP includes:</w:t>
+      </w:r>
+    </w:p>
+    <w:p>
+      <w:pPr>
+        <w:pStyle w:val="Compact"/>
+        <w:numPr>
+          <w:ilvl w:val="0"/>
+          <w:numId w:val="1020"/>
+        </w:numPr>
+      </w:pPr>
+      <w:r>
+        <w:t xml:space="preserve">centralized bank account registry and signer governance</w:t>
+      </w:r>
+    </w:p>
+    <w:p>
+      <w:pPr>
+        <w:pStyle w:val="Compact"/>
+        <w:numPr>
+          <w:ilvl w:val="0"/>
+          <w:numId w:val="1020"/>
+        </w:numPr>
+      </w:pPr>
+      <w:r>
+        <w:t xml:space="preserve">cash-position visibility by bank, entity, currency, and value date</w:t>
+      </w:r>
+    </w:p>
+    <w:p>
+      <w:pPr>
+        <w:pStyle w:val="Compact"/>
+        <w:numPr>
+          <w:ilvl w:val="0"/>
+          <w:numId w:val="1020"/>
+        </w:numPr>
+      </w:pPr>
+      <w:r>
+        <w:t xml:space="preserve">payment-request, approval, release, and confirmation controls</w:t>
+      </w:r>
+    </w:p>
+    <w:p>
+      <w:pPr>
+        <w:pStyle w:val="Compact"/>
+        <w:numPr>
+          <w:ilvl w:val="0"/>
+          <w:numId w:val="1020"/>
+        </w:numPr>
+      </w:pPr>
+      <w:r>
+        <w:t xml:space="preserve">bank connectivity foundations for statement ingestion, reconciliation, and payment-status feedback</w:t>
+      </w:r>
+    </w:p>
+    <w:p>
+      <w:pPr>
+        <w:pStyle w:val="Compact"/>
+        <w:numPr>
+          <w:ilvl w:val="0"/>
+          <w:numId w:val="1020"/>
+        </w:numPr>
+      </w:pPr>
+      <w:r>
+        <w:t xml:space="preserve">segregation of duties across payment preparation, approval, release, and posting</w:t>
+      </w:r>
+    </w:p>
+    <w:p>
+      <w:pPr>
+        <w:pStyle w:val="Compact"/>
+        <w:numPr>
+          <w:ilvl w:val="0"/>
+          <w:numId w:val="1020"/>
+        </w:numPr>
+      </w:pPr>
+      <w:r>
+        <w:t xml:space="preserve">support for bank fees, charges, reversals, rejects, and exception handling</w:t>
+      </w:r>
+    </w:p>
+    <w:p>
+      <w:pPr>
+        <w:pStyle w:val="Compact"/>
+        <w:numPr>
+          <w:ilvl w:val="0"/>
+          <w:numId w:val="1020"/>
+        </w:numPr>
+      </w:pPr>
+      <w:r>
+        <w:t xml:space="preserve">treasury audit evidence for who initiated, approved, transmitted, and confirmed each payment</w:t>
+      </w:r>
+    </w:p>
+    <w:p>
+      <w:pPr>
+        <w:pStyle w:val="FirstParagraph"/>
+      </w:pPr>
+      <w:r>
+        <w:t xml:space="preserve">LonghornERP should be the operational control layer for payment governance even where specialized treasury connectivity or enterprise payment hubs are used. Where a client requires advanced cash forecasting, in-country connectivity adapters, dealing, hedging, or complex liquidity structures, LonghornERP should define explicit integration boundaries with best-of-breed treasury systems rather than attempting to absorb every treasury-specialist workflow into the ERP core.</w:t>
+      </w:r>
+    </w:p>
+    <w:bookmarkEnd w:id="104"/>
+    <w:bookmarkStart w:id="105" w:name="Xd97be0bbe6ff56e6503dbe02796602c32bd52a5"/>
+    <w:p>
+      <w:pPr>
+        <w:pStyle w:val="Heading2"/>
+      </w:pPr>
+      <w:r>
+        <w:t xml:space="preserve">13.3 Capital and Fixed-Asset Accounting Positioning</w:t>
+      </w:r>
+    </w:p>
+    <w:p>
+      <w:pPr>
+        <w:pStyle w:val="FirstParagraph"/>
+      </w:pPr>
+      <w:r>
+        <w:t xml:space="preserve">LonghornERP shall position fixed-asset and capital accounting as a disciplined finance capability, not merely a static asset register.</w:t>
+      </w:r>
+    </w:p>
+    <w:p>
+      <w:pPr>
+        <w:pStyle w:val="BodyText"/>
+      </w:pPr>
+      <w:r>
+        <w:t xml:space="preserve">The capital-accounting posture for LonghornERP includes:</w:t>
+      </w:r>
+    </w:p>
+    <w:p>
+      <w:pPr>
+        <w:pStyle w:val="Compact"/>
+        <w:numPr>
+          <w:ilvl w:val="0"/>
+          <w:numId w:val="1021"/>
+        </w:numPr>
+      </w:pPr>
+      <w:r>
+        <w:t xml:space="preserve">acquisition, capitalization, transfer, impairment, revaluation, and disposal accounting</w:t>
+      </w:r>
+    </w:p>
+    <w:p>
+      <w:pPr>
+        <w:pStyle w:val="Compact"/>
+        <w:numPr>
+          <w:ilvl w:val="0"/>
+          <w:numId w:val="1021"/>
+        </w:numPr>
+      </w:pPr>
+      <w:r>
+        <w:t xml:space="preserve">capitalization project and asset-under-construction support</w:t>
+      </w:r>
+    </w:p>
+    <w:p>
+      <w:pPr>
+        <w:pStyle w:val="Compact"/>
+        <w:numPr>
+          <w:ilvl w:val="0"/>
+          <w:numId w:val="1021"/>
+        </w:numPr>
+      </w:pPr>
+      <w:r>
+        <w:t xml:space="preserve">book-versus-tax treatment where local policy or statutory reporting requires separate views</w:t>
+      </w:r>
+    </w:p>
+    <w:p>
+      <w:pPr>
+        <w:pStyle w:val="Compact"/>
+        <w:numPr>
+          <w:ilvl w:val="0"/>
+          <w:numId w:val="1021"/>
+        </w:numPr>
+      </w:pPr>
+      <w:r>
+        <w:t xml:space="preserve">depreciation policy management by asset class, entity, and accounting basis</w:t>
+      </w:r>
+    </w:p>
+    <w:p>
+      <w:pPr>
+        <w:pStyle w:val="Compact"/>
+        <w:numPr>
+          <w:ilvl w:val="0"/>
+          <w:numId w:val="1021"/>
+        </w:numPr>
+      </w:pPr>
+      <w:r>
+        <w:t xml:space="preserve">capitalization controls for threshold policies, approvals, and supporting evidence</w:t>
+      </w:r>
+    </w:p>
+    <w:p>
+      <w:pPr>
+        <w:pStyle w:val="Compact"/>
+        <w:numPr>
+          <w:ilvl w:val="0"/>
+          <w:numId w:val="1021"/>
+        </w:numPr>
+      </w:pPr>
+      <w:r>
+        <w:t xml:space="preserve">maintenance of finance-grade asset history tied to source transactions and approvals</w:t>
+      </w:r>
+    </w:p>
+    <w:p>
+      <w:pPr>
+        <w:pStyle w:val="Compact"/>
+        <w:numPr>
+          <w:ilvl w:val="0"/>
+          <w:numId w:val="1021"/>
+        </w:numPr>
+      </w:pPr>
+      <w:r>
+        <w:t xml:space="preserve">alignment between operational asset lifecycle events and accounting consequences</w:t>
+      </w:r>
+    </w:p>
+    <w:p>
+      <w:pPr>
+        <w:pStyle w:val="FirstParagraph"/>
+      </w:pPr>
+      <w:r>
+        <w:t xml:space="preserve">LonghornERP should support organizations that need strong capital discipline for factories, fleets, infrastructure, energy assets, property, equipment, and distributed branch operations. The ERP must provide a defensible accounting record for capital spend and asset lifecycle changes, while allowing specialized maintenance, engineering, or asset-performance tools to remain system-of-execution where appropriate.</w:t>
+      </w:r>
+    </w:p>
+    <w:bookmarkEnd w:id="105"/>
+    <w:bookmarkStart w:id="106" w:name="X60b06c6b9cfad84e13e817a79a0a4d31db4e5a4"/>
+    <w:p>
+      <w:pPr>
+        <w:pStyle w:val="Heading2"/>
+      </w:pPr>
+      <w:r>
+        <w:t xml:space="preserve">13.4 Multi-Entity Group Finance Positioning</w:t>
+      </w:r>
+    </w:p>
+    <w:p>
+      <w:pPr>
+        <w:pStyle w:val="FirstParagraph"/>
+      </w:pPr>
+      <w:r>
+        <w:t xml:space="preserve">LonghornERP shall position group finance as a deliberate capability for organizations operating subsidiaries, branches, regional entities, and holding-company structures.</w:t>
+      </w:r>
+    </w:p>
+    <w:p>
+      <w:pPr>
+        <w:pStyle w:val="BodyText"/>
+      </w:pPr>
+      <w:r>
+        <w:t xml:space="preserve">The group-finance posture for LonghornERP includes:</w:t>
+      </w:r>
+    </w:p>
+    <w:p>
+      <w:pPr>
+        <w:pStyle w:val="Compact"/>
+        <w:numPr>
+          <w:ilvl w:val="0"/>
+          <w:numId w:val="1022"/>
+        </w:numPr>
+      </w:pPr>
+      <w:r>
+        <w:t xml:space="preserve">shared chart-of-accounts governance with local flexibility where required</w:t>
+      </w:r>
+    </w:p>
+    <w:p>
+      <w:pPr>
+        <w:pStyle w:val="Compact"/>
+        <w:numPr>
+          <w:ilvl w:val="0"/>
+          <w:numId w:val="1022"/>
+        </w:numPr>
+      </w:pPr>
+      <w:r>
+        <w:t xml:space="preserve">intercompany transaction discipline with reciprocal-account structure and mismatch visibility</w:t>
+      </w:r>
+    </w:p>
+    <w:p>
+      <w:pPr>
+        <w:pStyle w:val="Compact"/>
+        <w:numPr>
+          <w:ilvl w:val="0"/>
+          <w:numId w:val="1022"/>
+        </w:numPr>
+      </w:pPr>
+      <w:r>
+        <w:t xml:space="preserve">elimination-ready journals and group-adjustment workflows</w:t>
+      </w:r>
+    </w:p>
+    <w:p>
+      <w:pPr>
+        <w:pStyle w:val="Compact"/>
+        <w:numPr>
+          <w:ilvl w:val="0"/>
+          <w:numId w:val="1022"/>
+        </w:numPr>
+      </w:pPr>
+      <w:r>
+        <w:t xml:space="preserve">consolidation-ready period structures and entity hierarchies</w:t>
+      </w:r>
+    </w:p>
+    <w:p>
+      <w:pPr>
+        <w:pStyle w:val="Compact"/>
+        <w:numPr>
+          <w:ilvl w:val="0"/>
+          <w:numId w:val="1022"/>
+        </w:numPr>
+      </w:pPr>
+      <w:r>
+        <w:t xml:space="preserve">support for management and statutory reporting across entity and group views</w:t>
+      </w:r>
+    </w:p>
+    <w:p>
+      <w:pPr>
+        <w:pStyle w:val="Compact"/>
+        <w:numPr>
+          <w:ilvl w:val="0"/>
+          <w:numId w:val="1022"/>
+        </w:numPr>
+      </w:pPr>
+      <w:r>
+        <w:t xml:space="preserve">traceable movement from transactional postings to entity trial balances, consolidation inputs, eliminations, and certified outputs</w:t>
+      </w:r>
+    </w:p>
+    <w:p>
+      <w:pPr>
+        <w:pStyle w:val="FirstParagraph"/>
+      </w:pPr>
+      <w:r>
+        <w:t xml:space="preserve">LonghornERP should provide strong multi-entity foundations inside the ERP. Where a customer requires highly complex external consolidation tooling, advanced disclosure management, or listed-company reporting workflows, LonghornERP should integrate cleanly with best-of-breed consolidation and reporting platforms while remaining the trusted source of operational finance data and close evidence.</w:t>
+      </w:r>
+    </w:p>
+    <w:bookmarkEnd w:id="106"/>
+    <w:bookmarkStart w:id="107" w:name="X067fcae43ee13f4eb617da34e54d0c32eb4b7a1"/>
+    <w:p>
+      <w:pPr>
+        <w:pStyle w:val="Heading2"/>
+      </w:pPr>
+      <w:r>
+        <w:t xml:space="preserve">13.5 Results, Governance, and First-Close Discipline</w:t>
+      </w:r>
+    </w:p>
+    <w:p>
+      <w:pPr>
+        <w:pStyle w:val="FirstParagraph"/>
+      </w:pPr>
+      <w:r>
+        <w:t xml:space="preserve">LonghornERP shall treat finance not only as a transaction-processing domain but also as a results and governance discipline.</w:t>
+      </w:r>
+    </w:p>
+    <w:p>
+      <w:pPr>
+        <w:pStyle w:val="BodyText"/>
+      </w:pPr>
+      <w:r>
+        <w:t xml:space="preserve">This means the product should support:</w:t>
+      </w:r>
+    </w:p>
+    <w:p>
+      <w:pPr>
+        <w:pStyle w:val="Compact"/>
+        <w:numPr>
+          <w:ilvl w:val="0"/>
+          <w:numId w:val="1023"/>
+        </w:numPr>
+      </w:pPr>
+      <w:r>
+        <w:t xml:space="preserve">first-close discipline through governed close checklists, ownership, deadlines, blockers, and evidence</w:t>
+      </w:r>
+    </w:p>
+    <w:p>
+      <w:pPr>
+        <w:pStyle w:val="Compact"/>
+        <w:numPr>
+          <w:ilvl w:val="0"/>
+          <w:numId w:val="1023"/>
+        </w:numPr>
+      </w:pPr>
+      <w:r>
+        <w:t xml:space="preserve">certified reporting processes with controlled reporting packs and reproducible close outputs</w:t>
+      </w:r>
+    </w:p>
+    <w:p>
+      <w:pPr>
+        <w:pStyle w:val="Compact"/>
+        <w:numPr>
+          <w:ilvl w:val="0"/>
+          <w:numId w:val="1023"/>
+        </w:numPr>
+      </w:pPr>
+      <w:r>
+        <w:t xml:space="preserve">journal governance with maker-checker controls, approval thresholds, and audit trails</w:t>
+      </w:r>
+    </w:p>
+    <w:p>
+      <w:pPr>
+        <w:pStyle w:val="Compact"/>
+        <w:numPr>
+          <w:ilvl w:val="0"/>
+          <w:numId w:val="1023"/>
+        </w:numPr>
+      </w:pPr>
+      <w:r>
+        <w:t xml:space="preserve">policy-backed finance operations where every sensitive workflow leaves structured evidence</w:t>
+      </w:r>
+    </w:p>
+    <w:p>
+      <w:pPr>
+        <w:pStyle w:val="Compact"/>
+        <w:numPr>
+          <w:ilvl w:val="0"/>
+          <w:numId w:val="1023"/>
+        </w:numPr>
+      </w:pPr>
+      <w:r>
+        <w:t xml:space="preserve">management visibility into close status, control exceptions, unresolved reconciliations, and reporting readiness</w:t>
+      </w:r>
+    </w:p>
+    <w:p>
+      <w:pPr>
+        <w:pStyle w:val="FirstParagraph"/>
+      </w:pPr>
+      <w:r>
+        <w:t xml:space="preserve">The intended product outcome is that finance leaders can rely on LonghornERP to answer two questions with confidence:</w:t>
+      </w:r>
+    </w:p>
+    <w:p>
+      <w:pPr>
+        <w:pStyle w:val="Compact"/>
+        <w:numPr>
+          <w:ilvl w:val="0"/>
+          <w:numId w:val="1024"/>
+        </w:numPr>
+      </w:pPr>
+      <w:r>
+        <w:t xml:space="preserve">What happened financially?</w:t>
+      </w:r>
+    </w:p>
+    <w:p>
+      <w:pPr>
+        <w:pStyle w:val="Compact"/>
+        <w:numPr>
+          <w:ilvl w:val="0"/>
+          <w:numId w:val="1024"/>
+        </w:numPr>
+      </w:pPr>
+      <w:r>
+        <w:t xml:space="preserve">Was it processed, approved, and reported under controlled conditions?</w:t>
+      </w:r>
+    </w:p>
+    <w:bookmarkEnd w:id="107"/>
+    <w:bookmarkStart w:id="108" w:name="Xa37c5c7cb94516b5cc1a1fe4710605b39547c53"/>
+    <w:p>
+      <w:pPr>
+        <w:pStyle w:val="Heading2"/>
+      </w:pPr>
+      <w:r>
+        <w:t xml:space="preserve">13.6 Product Boundary Principles</w:t>
+      </w:r>
+    </w:p>
+    <w:p>
+      <w:pPr>
+        <w:pStyle w:val="FirstParagraph"/>
+      </w:pPr>
+      <w:r>
+        <w:t xml:space="preserve">LonghornERP should be strong enough to run the finance core for SMEs, mid-market groups, and control-conscious enterprises, but it should remain disciplined about product boundaries.</w:t>
+      </w:r>
+    </w:p>
+    <w:p>
+      <w:pPr>
+        <w:pStyle w:val="BodyText"/>
+      </w:pPr>
+      <w:r>
+        <w:t xml:space="preserve">LonghornERP should own:</w:t>
+      </w:r>
+    </w:p>
+    <w:p>
+      <w:pPr>
+        <w:pStyle w:val="Compact"/>
+        <w:numPr>
+          <w:ilvl w:val="0"/>
+          <w:numId w:val="1025"/>
+        </w:numPr>
+      </w:pPr>
+      <w:r>
+        <w:t xml:space="preserve">operational transaction capture</w:t>
+      </w:r>
+    </w:p>
+    <w:p>
+      <w:pPr>
+        <w:pStyle w:val="Compact"/>
+        <w:numPr>
+          <w:ilvl w:val="0"/>
+          <w:numId w:val="1025"/>
+        </w:numPr>
+      </w:pPr>
+      <w:r>
+        <w:t xml:space="preserve">subledger and general-ledger control</w:t>
+      </w:r>
+    </w:p>
+    <w:p>
+      <w:pPr>
+        <w:pStyle w:val="Compact"/>
+        <w:numPr>
+          <w:ilvl w:val="0"/>
+          <w:numId w:val="1025"/>
+        </w:numPr>
+      </w:pPr>
+      <w:r>
+        <w:t xml:space="preserve">reconciliations and period close</w:t>
+      </w:r>
+    </w:p>
+    <w:p>
+      <w:pPr>
+        <w:pStyle w:val="Compact"/>
+        <w:numPr>
+          <w:ilvl w:val="0"/>
+          <w:numId w:val="1025"/>
+        </w:numPr>
+      </w:pPr>
+      <w:r>
+        <w:t xml:space="preserve">payment governance and bank-operating controls</w:t>
+      </w:r>
+    </w:p>
+    <w:p>
+      <w:pPr>
+        <w:pStyle w:val="Compact"/>
+        <w:numPr>
+          <w:ilvl w:val="0"/>
+          <w:numId w:val="1025"/>
+        </w:numPr>
+      </w:pPr>
+      <w:r>
+        <w:t xml:space="preserve">fixed-asset and capital-accounting discipline</w:t>
+      </w:r>
+    </w:p>
+    <w:p>
+      <w:pPr>
+        <w:pStyle w:val="Compact"/>
+        <w:numPr>
+          <w:ilvl w:val="0"/>
+          <w:numId w:val="1025"/>
+        </w:numPr>
+      </w:pPr>
+      <w:r>
+        <w:t xml:space="preserve">intercompany and elimination-ready finance structure</w:t>
+      </w:r>
+    </w:p>
+    <w:p>
+      <w:pPr>
+        <w:pStyle w:val="Compact"/>
+        <w:numPr>
+          <w:ilvl w:val="0"/>
+          <w:numId w:val="1025"/>
+        </w:numPr>
+      </w:pPr>
+      <w:r>
+        <w:t xml:space="preserve">management and statutory reporting foundations</w:t>
+      </w:r>
+    </w:p>
+    <w:p>
+      <w:pPr>
+        <w:pStyle w:val="Compact"/>
+        <w:numPr>
+          <w:ilvl w:val="0"/>
+          <w:numId w:val="1025"/>
+        </w:numPr>
+      </w:pPr>
+      <w:r>
+        <w:t xml:space="preserve">finance workflow evidence and auditability</w:t>
+      </w:r>
+    </w:p>
+    <w:p>
+      <w:pPr>
+        <w:pStyle w:val="FirstParagraph"/>
+      </w:pPr>
+      <w:r>
+        <w:t xml:space="preserve">LonghornERP should integrate rather than overextend where clients require:</w:t>
+      </w:r>
+    </w:p>
+    <w:p>
+      <w:pPr>
+        <w:pStyle w:val="Compact"/>
+        <w:numPr>
+          <w:ilvl w:val="0"/>
+          <w:numId w:val="1026"/>
+        </w:numPr>
+      </w:pPr>
+      <w:r>
+        <w:t xml:space="preserve">advanced treasury dealing and liquidity optimization</w:t>
+      </w:r>
+    </w:p>
+    <w:p>
+      <w:pPr>
+        <w:pStyle w:val="Compact"/>
+        <w:numPr>
+          <w:ilvl w:val="0"/>
+          <w:numId w:val="1026"/>
+        </w:numPr>
+      </w:pPr>
+      <w:r>
+        <w:t xml:space="preserve">highly specialized bank connectivity networks</w:t>
+      </w:r>
+    </w:p>
+    <w:p>
+      <w:pPr>
+        <w:pStyle w:val="Compact"/>
+        <w:numPr>
+          <w:ilvl w:val="0"/>
+          <w:numId w:val="1026"/>
+        </w:numPr>
+      </w:pPr>
+      <w:r>
+        <w:t xml:space="preserve">complex listed-company consolidation and external disclosure tooling</w:t>
+      </w:r>
+    </w:p>
+    <w:p>
+      <w:pPr>
+        <w:pStyle w:val="Compact"/>
+        <w:numPr>
+          <w:ilvl w:val="0"/>
+          <w:numId w:val="1026"/>
+        </w:numPr>
+      </w:pPr>
+      <w:r>
+        <w:t xml:space="preserve">niche local compliance engines beyond the ERP core</w:t>
+      </w:r>
+    </w:p>
+    <w:bookmarkEnd w:id="108"/>
+    <w:bookmarkStart w:id="109" w:name="Xc15918a0dbcfecc839acab8bb3363b8365b9200"/>
+    <w:p>
+      <w:pPr>
+        <w:pStyle w:val="Heading2"/>
+      </w:pPr>
+      <w:r>
+        <w:t xml:space="preserve">13.7 Strategic Outcome</w:t>
+      </w:r>
+    </w:p>
+    <w:p>
+      <w:pPr>
+        <w:pStyle w:val="FirstParagraph"/>
+      </w:pPr>
+      <w:r>
+        <w:t xml:space="preserve">This positioning makes LonghornERP suitable for organizations that need more than accounting software but do not want fragmented finance operations. It establishes LonghornERP as a finance platform that can grow from single-entity operational accounting into controlled treasury operations, disciplined capital accounting, and multi-entity group finance without losing clarity of ownership between ERP core capabilities and specialist extensions.</w:t>
+      </w:r>
+    </w:p>
+    <w:bookmarkEnd w:id="109"/>
+    <w:bookmarkEnd w:id="110"/>
     <w:sectPr>
       <w:footerReference r:id="rId9" w:type="default"/>
       <w:headerReference r:id="rId10" w:type="default"/>
@@ -9079,6 +10574,91 @@
       <w:rPr>
         <w:rFonts w:ascii="Wingdings" w:hAnsi="Wingdings" w:cs="Wingdings" w:hint="default"/>
       </w:rPr>
+    </w:lvl>
+  </w:abstractNum>
+  <w:abstractNum w:abstractNumId="99411">
+    <w:nsid w:val="00A99411"/>
+    <w:multiLevelType w:val="multilevel"/>
+    <w:lvl w:ilvl="0">
+      <w:start w:val="1"/>
+      <w:numFmt w:val="decimal"/>
+      <w:lvlText w:val="%1."/>
+      <w:lvlJc w:val="left"/>
+      <w:pPr>
+        <w:ind w:left="720" w:hanging="360"/>
+      </w:pPr>
+    </w:lvl>
+    <w:lvl w:ilvl="1">
+      <w:start w:val="1"/>
+      <w:numFmt w:val="decimal"/>
+      <w:lvlText w:val="%2."/>
+      <w:lvlJc w:val="left"/>
+      <w:pPr>
+        <w:ind w:left="1440" w:hanging="360"/>
+      </w:pPr>
+    </w:lvl>
+    <w:lvl w:ilvl="2">
+      <w:start w:val="1"/>
+      <w:numFmt w:val="decimal"/>
+      <w:lvlText w:val="%3."/>
+      <w:lvlJc w:val="left"/>
+      <w:pPr>
+        <w:ind w:left="2160" w:hanging="360"/>
+      </w:pPr>
+    </w:lvl>
+    <w:lvl w:ilvl="3">
+      <w:start w:val="1"/>
+      <w:numFmt w:val="decimal"/>
+      <w:lvlText w:val="%4."/>
+      <w:lvlJc w:val="left"/>
+      <w:pPr>
+        <w:ind w:left="2880" w:hanging="360"/>
+      </w:pPr>
+    </w:lvl>
+    <w:lvl w:ilvl="4">
+      <w:start w:val="1"/>
+      <w:numFmt w:val="decimal"/>
+      <w:lvlText w:val="%5."/>
+      <w:lvlJc w:val="left"/>
+      <w:pPr>
+        <w:ind w:left="3600" w:hanging="360"/>
+      </w:pPr>
+    </w:lvl>
+    <w:lvl w:ilvl="5">
+      <w:start w:val="1"/>
+      <w:numFmt w:val="decimal"/>
+      <w:lvlText w:val="%6."/>
+      <w:lvlJc w:val="left"/>
+      <w:pPr>
+        <w:ind w:left="4320" w:hanging="360"/>
+      </w:pPr>
+    </w:lvl>
+    <w:lvl w:ilvl="6">
+      <w:start w:val="1"/>
+      <w:numFmt w:val="decimal"/>
+      <w:lvlText w:val="%7."/>
+      <w:lvlJc w:val="left"/>
+      <w:pPr>
+        <w:ind w:left="5040" w:hanging="360"/>
+      </w:pPr>
+    </w:lvl>
+    <w:lvl w:ilvl="7">
+      <w:start w:val="1"/>
+      <w:numFmt w:val="decimal"/>
+      <w:lvlText w:val="%8."/>
+      <w:lvlJc w:val="left"/>
+      <w:pPr>
+        <w:ind w:left="5760" w:hanging="360"/>
+      </w:pPr>
+    </w:lvl>
+    <w:lvl w:ilvl="8">
+      <w:start w:val="1"/>
+      <w:numFmt w:val="decimal"/>
+      <w:lvlText w:val="%9."/>
+      <w:lvlJc w:val="left"/>
+      <w:pPr>
+        <w:ind w:left="6480" w:hanging="360"/>
+      </w:pPr>
     </w:lvl>
   </w:abstractNum>
   <w:num w:numId="1">
@@ -9142,6 +10722,78 @@
     <w:abstractNumId w:val="991"/>
   </w:num>
   <w:num w:numId="1011">
+    <w:abstractNumId w:val="991"/>
+  </w:num>
+  <w:num w:numId="1012">
+    <w:abstractNumId w:val="991"/>
+  </w:num>
+  <w:num w:numId="1013">
+    <w:abstractNumId w:val="991"/>
+  </w:num>
+  <w:num w:numId="1014">
+    <w:abstractNumId w:val="991"/>
+  </w:num>
+  <w:num w:numId="1015">
+    <w:abstractNumId w:val="991"/>
+  </w:num>
+  <w:num w:numId="1016">
+    <w:abstractNumId w:val="991"/>
+  </w:num>
+  <w:num w:numId="1017">
+    <w:abstractNumId w:val="991"/>
+  </w:num>
+  <w:num w:numId="1018">
+    <w:abstractNumId w:val="991"/>
+  </w:num>
+  <w:num w:numId="1019">
+    <w:abstractNumId w:val="991"/>
+  </w:num>
+  <w:num w:numId="1020">
+    <w:abstractNumId w:val="991"/>
+  </w:num>
+  <w:num w:numId="1021">
+    <w:abstractNumId w:val="991"/>
+  </w:num>
+  <w:num w:numId="1022">
+    <w:abstractNumId w:val="991"/>
+  </w:num>
+  <w:num w:numId="1023">
+    <w:abstractNumId w:val="991"/>
+  </w:num>
+  <w:num w:numId="1024">
+    <w:abstractNumId w:val="99411"/>
+    <w:lvlOverride w:ilvl="0">
+      <w:startOverride w:val="1"/>
+    </w:lvlOverride>
+    <w:lvlOverride w:ilvl="1">
+      <w:startOverride w:val="1"/>
+    </w:lvlOverride>
+    <w:lvlOverride w:ilvl="2">
+      <w:startOverride w:val="1"/>
+    </w:lvlOverride>
+    <w:lvlOverride w:ilvl="3">
+      <w:startOverride w:val="1"/>
+    </w:lvlOverride>
+    <w:lvlOverride w:ilvl="4">
+      <w:startOverride w:val="1"/>
+    </w:lvlOverride>
+    <w:lvlOverride w:ilvl="5">
+      <w:startOverride w:val="1"/>
+    </w:lvlOverride>
+    <w:lvlOverride w:ilvl="6">
+      <w:startOverride w:val="1"/>
+    </w:lvlOverride>
+    <w:lvlOverride w:ilvl="7">
+      <w:startOverride w:val="1"/>
+    </w:lvlOverride>
+    <w:lvlOverride w:ilvl="8">
+      <w:startOverride w:val="1"/>
+    </w:lvlOverride>
+  </w:num>
+  <w:num w:numId="1025">
+    <w:abstractNumId w:val="991"/>
+  </w:num>
+  <w:num w:numId="1026">
     <w:abstractNumId w:val="991"/>
   </w:num>
 </w:numbering>

</xml_diff>

<commit_message>
Expand LonghornERP CRM into revenue and service platform
</commit_message>
<xml_diff>
--- a/projects/LonghornERP/01-strategic-vision/LonghornERP_PRD.docx
+++ b/projects/LonghornERP/01-strategic-vision/LonghornERP_PRD.docx
@@ -1862,7 +1862,7 @@
     </w:p>
     <w:bookmarkEnd w:id="40"/>
     <w:bookmarkEnd w:id="41"/>
-    <w:bookmarkStart w:id="49" w:name="module-overview"/>
+    <w:bookmarkStart w:id="50" w:name="module-overview"/>
     <w:p>
       <w:pPr>
         <w:pStyle w:val="Heading1"/>
@@ -2420,7 +2420,7 @@
               <w:pStyle w:val="Compact"/>
             </w:pPr>
             <w:r>
-              <w:t xml:space="preserve">Leads pipeline, opportunities, Kanban view, activity logging, contact management, quotation tracking, sales forecasting, territory management, WhatsApp logging</w:t>
+              <w:t xml:space="preserve">Customer and prospect system of record plus engagement workspace for accounts, contacts, leads, opportunities, cases, activities, account planning, segmentation, prioritisation, forecasting, channel and partner coordination, quote-to-cash orchestration, retention workflows, SLA visibility, and customer-facing collaboration</w:t>
             </w:r>
           </w:p>
         </w:tc>
@@ -3325,8 +3325,132 @@
       </w:r>
     </w:p>
     <w:bookmarkEnd w:id="48"/>
+    <w:bookmarkStart w:id="49" w:name="Xdecb91db4094d9de38bfa880fc6f3ba93d8af19"/>
+    <w:p>
+      <w:pPr>
+        <w:pStyle w:val="Heading2"/>
+      </w:pPr>
+      <w:r>
+        <w:t xml:space="preserve">Customer Revenue and Service Excellence Note</w:t>
+      </w:r>
+    </w:p>
+    <w:p>
+      <w:pPr>
+        <w:pStyle w:val="FirstParagraph"/>
+      </w:pPr>
+      <w:r>
+        <w:t xml:space="preserve">Longhorn ERP treats</w:t>
+      </w:r>
+      <w:r>
+        <w:t xml:space="preserve"> </w:t>
+      </w:r>
+      <w:r>
+        <w:rPr>
+          <w:rStyle w:val="VerbatimChar"/>
+        </w:rPr>
+        <w:t xml:space="preserve">SALES_CRM</w:t>
+      </w:r>
+      <w:r>
+        <w:t xml:space="preserve"> </w:t>
+      </w:r>
+      <w:r>
+        <w:t xml:space="preserve">as more than a basic pipeline tracker. It is positioned as the customer-facing relationship system of record and day-to-day engagement workspace for revenue teams, account teams, service teams, and partner-facing operations.</w:t>
+      </w:r>
+    </w:p>
+    <w:p>
+      <w:pPr>
+        <w:pStyle w:val="BodyText"/>
+      </w:pPr>
+      <w:r>
+        <w:t xml:space="preserve">World-class CRM capability in Longhorn ERP means:</w:t>
+      </w:r>
+    </w:p>
+    <w:p>
+      <w:pPr>
+        <w:pStyle w:val="Compact"/>
+        <w:numPr>
+          <w:ilvl w:val="0"/>
+          <w:numId w:val="1005"/>
+        </w:numPr>
+      </w:pPr>
+      <w:r>
+        <w:t xml:space="preserve">a governed customer object model covering accounts, contacts, leads, opportunities, cases, and activities so relationship context is durable and shared across the organisation</w:t>
+      </w:r>
+    </w:p>
+    <w:p>
+      <w:pPr>
+        <w:pStyle w:val="Compact"/>
+        <w:numPr>
+          <w:ilvl w:val="0"/>
+          <w:numId w:val="1005"/>
+        </w:numPr>
+      </w:pPr>
+      <w:r>
+        <w:t xml:space="preserve">relationship-intent ownership in CRM, where prospecting, qualification, account planning, next-best-action workflows, and customer engagement coordination are managed before and around transactional execution</w:t>
+      </w:r>
+    </w:p>
+    <w:p>
+      <w:pPr>
+        <w:pStyle w:val="Compact"/>
+        <w:numPr>
+          <w:ilvl w:val="0"/>
+          <w:numId w:val="1005"/>
+        </w:numPr>
+      </w:pPr>
+      <w:r>
+        <w:t xml:space="preserve">clear execution boundaries, where CRM owns customer-facing workflow and intent while core ERP modules own order execution, fulfilment, invoicing, inventory movement, and financial truth</w:t>
+      </w:r>
+    </w:p>
+    <w:p>
+      <w:pPr>
+        <w:pStyle w:val="Compact"/>
+        <w:numPr>
+          <w:ilvl w:val="0"/>
+          <w:numId w:val="1005"/>
+        </w:numPr>
+      </w:pPr>
+      <w:r>
+        <w:t xml:space="preserve">revenue excellence through stronger conversion discipline, forecast predictability, quote-to-cash coordination, segmentation, prioritisation, and channel or partner readiness</w:t>
+      </w:r>
+    </w:p>
+    <w:p>
+      <w:pPr>
+        <w:pStyle w:val="Compact"/>
+        <w:numPr>
+          <w:ilvl w:val="0"/>
+          <w:numId w:val="1005"/>
+        </w:numPr>
+      </w:pPr>
+      <w:r>
+        <w:t xml:space="preserve">service excellence through case management, SLA visibility, activity traceability, retention signals, and a consistent record of customer commitments and follow-up actions</w:t>
+      </w:r>
+    </w:p>
+    <w:p>
+      <w:pPr>
+        <w:pStyle w:val="FirstParagraph"/>
+      </w:pPr>
+      <w:r>
+        <w:t xml:space="preserve">This positioning is deliberate.</w:t>
+      </w:r>
+      <w:r>
+        <w:t xml:space="preserve"> </w:t>
+      </w:r>
+      <w:r>
+        <w:rPr>
+          <w:rStyle w:val="VerbatimChar"/>
+        </w:rPr>
+        <w:t xml:space="preserve">SALES_CRM</w:t>
+      </w:r>
+      <w:r>
+        <w:t xml:space="preserve"> </w:t>
+      </w:r>
+      <w:r>
+        <w:t xml:space="preserve">remains additive to the core ERP architecture rather than competing with it. The module strengthens front-office execution while keeping Longhorn ERP's operational and financial system boundaries explicit and coherent.</w:t>
+      </w:r>
+    </w:p>
     <w:bookmarkEnd w:id="49"/>
-    <w:bookmarkStart w:id="58" w:name="competitive-positioning"/>
+    <w:bookmarkEnd w:id="50"/>
+    <w:bookmarkStart w:id="59" w:name="competitive-positioning"/>
     <w:p>
       <w:pPr>
         <w:pStyle w:val="Heading1"/>
@@ -3335,7 +3459,7 @@
         <w:t xml:space="preserve">Competitive Positioning</w:t>
       </w:r>
     </w:p>
-    <w:bookmarkStart w:id="50" w:name="market-context"/>
+    <w:bookmarkStart w:id="51" w:name="market-context"/>
     <w:p>
       <w:pPr>
         <w:pStyle w:val="Heading2"/>
@@ -3360,8 +3484,8 @@
         <w:t xml:space="preserve">The full cost comparison table appears in Section 2. The following analysis expands on the five key competitive advantages.</w:t>
       </w:r>
     </w:p>
-    <w:bookmarkEnd w:id="50"/>
-    <w:bookmarkStart w:id="56" w:name="X76c8c33d32d5c0e3360f8ab11a513094d3223d5"/>
+    <w:bookmarkEnd w:id="51"/>
+    <w:bookmarkStart w:id="57" w:name="X76c8c33d32d5c0e3360f8ab11a513094d3223d5"/>
     <w:p>
       <w:pPr>
         <w:pStyle w:val="Heading2"/>
@@ -3370,7 +3494,7 @@
         <w:t xml:space="preserve">5 Key Competitive Advantages</w:t>
       </w:r>
     </w:p>
-    <w:bookmarkStart w:id="51" w:name="X46c69c95a0b55c263e712b76e07e6245d46b018"/>
+    <w:bookmarkStart w:id="52" w:name="X46c69c95a0b55c263e712b76e07e6245d46b018"/>
     <w:p>
       <w:pPr>
         <w:pStyle w:val="Heading3"/>
@@ -3387,8 +3511,8 @@
         <w:t xml:space="preserve">Longhorn ERP is priced in Ugandan Shillings. Competitors bill in USD or EUR, exposing clients to exchange rate fluctuation. For a Ugandan organisation with UGX revenue, a USD-denominated SaaS subscription is a currency risk as well as a cost. Longhorn ERP removes this entirely.</w:t>
       </w:r>
     </w:p>
-    <w:bookmarkEnd w:id="51"/>
-    <w:bookmarkStart w:id="52" w:name="X71f737682fe7201dc17de9580c7b5d6a20f0a69"/>
+    <w:bookmarkEnd w:id="52"/>
+    <w:bookmarkStart w:id="53" w:name="X71f737682fe7201dc17de9580c7b5d6a20f0a69"/>
     <w:p>
       <w:pPr>
         <w:pStyle w:val="Heading3"/>
@@ -3405,8 +3529,8 @@
         <w:t xml:space="preserve">Every subscription tier covers the entire organisation at a flat monthly rate. A company adding its 16th user pays nothing more than a company with 15. This is the primary structural differentiator versus Odoo, Dynamics, and NetSuite, all of which charge per named user. An organisation growing from 15 to 30 employees on Longhorn ERP sees zero incremental cost until it crosses a tier threshold.</w:t>
       </w:r>
     </w:p>
-    <w:bookmarkEnd w:id="52"/>
-    <w:bookmarkStart w:id="53" w:name="X8b49be4ded8a60af879d601a7d09652a6133cee"/>
+    <w:bookmarkEnd w:id="53"/>
+    <w:bookmarkStart w:id="54" w:name="X8b49be4ded8a60af879d601a7d09652a6133cee"/>
     <w:p>
       <w:pPr>
         <w:pStyle w:val="Heading3"/>
@@ -3423,8 +3547,8 @@
         <w:t xml:space="preserve">The Golden Rule governs every interface design decision. No onboarding consultant, no training day, and no user manual is required before a new employee can perform their role in the system. This is enforced through a ≥ 85% unassisted task success rate requirement on 5 benchmark tasks. Competitors with complex configuration UIs, multi-step wizards, and role-based menus that require administrator setup cannot make this claim.</w:t>
       </w:r>
     </w:p>
-    <w:bookmarkEnd w:id="53"/>
-    <w:bookmarkStart w:id="54" w:name="Xddf462855bdb8a79e019aa4bfa067b53af6097b"/>
+    <w:bookmarkEnd w:id="54"/>
+    <w:bookmarkStart w:id="55" w:name="Xddf462855bdb8a79e019aa4bfa067b53af6097b"/>
     <w:p>
       <w:pPr>
         <w:pStyle w:val="Heading3"/>
@@ -3441,8 +3565,8 @@
         <w:t xml:space="preserve">Longhorn ERP ships with native integrations for EFRIS (Uganda VAT invoicing), MTN MoMo (Uganda, Rwanda), Airtel Money (Uganda, Kenya, Tanzania), and M-Pesa Daraja B2C (Kenya, Tanzania). No international competitor offers these integrations out of the box. A Ugandan organisation using SAP or NetSuite must build or buy these integrations separately.</w:t>
       </w:r>
     </w:p>
-    <w:bookmarkEnd w:id="54"/>
-    <w:bookmarkStart w:id="55" w:name="X6c74a3168e57cc811916e793323e24e67ba5808"/>
+    <w:bookmarkEnd w:id="55"/>
+    <w:bookmarkStart w:id="56" w:name="X6c74a3168e57cc811916e793323e24e67ba5808"/>
     <w:p>
       <w:pPr>
         <w:pStyle w:val="Heading3"/>
@@ -3459,9 +3583,9 @@
         <w:t xml:space="preserve">Longhorn ERP is a fully managed SaaS platform. There is no on-premise installation, no server procurement, no database configuration, and no implementation project. A new tenant is provisioned and live in ≤ 10 minutes. The total cost from purchase decision to first live transaction is one subscription payment.</w:t>
       </w:r>
     </w:p>
-    <w:bookmarkEnd w:id="55"/>
     <w:bookmarkEnd w:id="56"/>
-    <w:bookmarkStart w:id="57" w:name="positioning-summary"/>
+    <w:bookmarkEnd w:id="57"/>
+    <w:bookmarkStart w:id="58" w:name="positioning-summary"/>
     <w:p>
       <w:pPr>
         <w:pStyle w:val="Heading2"/>
@@ -3808,9 +3932,9 @@
         </w:tc>
       </w:tr>
     </w:tbl>
-    <w:bookmarkEnd w:id="57"/>
     <w:bookmarkEnd w:id="58"/>
-    <w:bookmarkStart w:id="66" w:name="revenue-model"/>
+    <w:bookmarkEnd w:id="59"/>
+    <w:bookmarkStart w:id="67" w:name="revenue-model"/>
     <w:p>
       <w:pPr>
         <w:pStyle w:val="Heading1"/>
@@ -3819,7 +3943,7 @@
         <w:t xml:space="preserve">Revenue Model</w:t>
       </w:r>
     </w:p>
-    <w:bookmarkStart w:id="59" w:name="subscription-tiers"/>
+    <w:bookmarkStart w:id="60" w:name="subscription-tiers"/>
     <w:p>
       <w:pPr>
         <w:pStyle w:val="Heading2"/>
@@ -4286,8 +4410,8 @@
         <w:t xml:space="preserve">Starter locks out all add-on modules. Upgrade to Small Business or above to activate add-ons.</w:t>
       </w:r>
     </w:p>
-    <w:bookmarkEnd w:id="59"/>
-    <w:bookmarkStart w:id="60" w:name="annual-billing-incentive"/>
+    <w:bookmarkEnd w:id="60"/>
+    <w:bookmarkStart w:id="61" w:name="annual-billing-incentive"/>
     <w:p>
       <w:pPr>
         <w:pStyle w:val="Heading2"/>
@@ -4424,8 +4548,8 @@
         </w:tc>
       </w:tr>
     </w:tbl>
-    <w:bookmarkEnd w:id="60"/>
-    <w:bookmarkStart w:id="61" w:name="a-la-carte-add-on-pricing"/>
+    <w:bookmarkEnd w:id="61"/>
+    <w:bookmarkStart w:id="62" w:name="a-la-carte-add-on-pricing"/>
     <w:p>
       <w:pPr>
         <w:pStyle w:val="Heading2"/>
@@ -4842,8 +4966,8 @@
         </w:tc>
       </w:tr>
     </w:tbl>
-    <w:bookmarkEnd w:id="61"/>
-    <w:bookmarkStart w:id="62" w:name="add-on-stacking-upgrade-trigger"/>
+    <w:bookmarkEnd w:id="62"/>
+    <w:bookmarkStart w:id="63" w:name="add-on-stacking-upgrade-trigger"/>
     <w:p>
       <w:pPr>
         <w:pStyle w:val="Heading2"/>
@@ -4858,68 +4982,6 @@
       </w:pPr>
       <w:r>
         <w:t xml:space="preserve">A Professional plan tenant activating all 10 add-ons would pay:</w:t>
-      </w:r>
-    </w:p>
-    <w:p>
-      <w:pPr>
-        <w:pStyle w:val="Compact"/>
-        <w:numPr>
-          <w:ilvl w:val="0"/>
-          <w:numId w:val="1005"/>
-        </w:numPr>
-      </w:pPr>
-      <w:r>
-        <w:t xml:space="preserve">Professional base: UGX 1,000,000/month</w:t>
-      </w:r>
-    </w:p>
-    <w:p>
-      <w:pPr>
-        <w:pStyle w:val="Compact"/>
-        <w:numPr>
-          <w:ilvl w:val="0"/>
-          <w:numId w:val="1005"/>
-        </w:numPr>
-      </w:pPr>
-      <w:r>
-        <w:t xml:space="preserve">All add-ons (POS counted as 1 terminal): UGX 1,490,000/month</w:t>
-      </w:r>
-    </w:p>
-    <w:p>
-      <w:pPr>
-        <w:pStyle w:val="Compact"/>
-        <w:numPr>
-          <w:ilvl w:val="0"/>
-          <w:numId w:val="1005"/>
-        </w:numPr>
-      </w:pPr>
-      <w:r>
-        <w:t xml:space="preserve">Total: UGX 2,490,000/month</w:t>
-      </w:r>
-    </w:p>
-    <w:p>
-      <w:pPr>
-        <w:pStyle w:val="FirstParagraph"/>
-      </w:pPr>
-      <w:r>
-        <w:t xml:space="preserve">This is UGX 10,000 below the Enterprise plan price of UGX 2,500,000/month. The system shall detect when a tenant's combined subscription cost (base + add-ons) reaches ≥ 95% of the next tier price and display a contextual upgrade prompt offering the higher tier for the price difference, with the benefit of unlimited users, unlimited branches, dedicated onboarding, and priority support.</w:t>
-      </w:r>
-    </w:p>
-    <w:bookmarkEnd w:id="62"/>
-    <w:bookmarkStart w:id="63" w:name="payment-methods"/>
-    <w:p>
-      <w:pPr>
-        <w:pStyle w:val="Heading2"/>
-      </w:pPr>
-      <w:r>
-        <w:t xml:space="preserve">Payment Methods</w:t>
-      </w:r>
-    </w:p>
-    <w:p>
-      <w:pPr>
-        <w:pStyle w:val="FirstParagraph"/>
-      </w:pPr>
-      <w:r>
-        <w:t xml:space="preserve">The system shall accept payment via:</w:t>
       </w:r>
     </w:p>
     <w:p>
@@ -4931,7 +4993,7 @@
         </w:numPr>
       </w:pPr>
       <w:r>
-        <w:t xml:space="preserve">Credit and debit card (Visa, Mastercard)</w:t>
+        <w:t xml:space="preserve">Professional base: UGX 1,000,000/month</w:t>
       </w:r>
     </w:p>
     <w:p>
@@ -4943,7 +5005,7 @@
         </w:numPr>
       </w:pPr>
       <w:r>
-        <w:t xml:space="preserve">Bank transfer (Uganda Shillings)</w:t>
+        <w:t xml:space="preserve">All add-ons (POS counted as 1 terminal): UGX 1,490,000/month</w:t>
       </w:r>
     </w:p>
     <w:p>
@@ -4955,7 +5017,33 @@
         </w:numPr>
       </w:pPr>
       <w:r>
-        <w:t xml:space="preserve">MTN Mobile Money (Uganda, Rwanda)</w:t>
+        <w:t xml:space="preserve">Total: UGX 2,490,000/month</w:t>
+      </w:r>
+    </w:p>
+    <w:p>
+      <w:pPr>
+        <w:pStyle w:val="FirstParagraph"/>
+      </w:pPr>
+      <w:r>
+        <w:t xml:space="preserve">This is UGX 10,000 below the Enterprise plan price of UGX 2,500,000/month. The system shall detect when a tenant's combined subscription cost (base + add-ons) reaches ≥ 95% of the next tier price and display a contextual upgrade prompt offering the higher tier for the price difference, with the benefit of unlimited users, unlimited branches, dedicated onboarding, and priority support.</w:t>
+      </w:r>
+    </w:p>
+    <w:bookmarkEnd w:id="63"/>
+    <w:bookmarkStart w:id="64" w:name="payment-methods"/>
+    <w:p>
+      <w:pPr>
+        <w:pStyle w:val="Heading2"/>
+      </w:pPr>
+      <w:r>
+        <w:t xml:space="preserve">Payment Methods</w:t>
+      </w:r>
+    </w:p>
+    <w:p>
+      <w:pPr>
+        <w:pStyle w:val="FirstParagraph"/>
+      </w:pPr>
+      <w:r>
+        <w:t xml:space="preserve">The system shall accept payment via:</w:t>
       </w:r>
     </w:p>
     <w:p>
@@ -4963,15 +5051,51 @@
         <w:pStyle w:val="Compact"/>
         <w:numPr>
           <w:ilvl w:val="0"/>
-          <w:numId w:val="1006"/>
+          <w:numId w:val="1007"/>
         </w:numPr>
       </w:pPr>
       <w:r>
+        <w:t xml:space="preserve">Credit and debit card (Visa, Mastercard)</w:t>
+      </w:r>
+    </w:p>
+    <w:p>
+      <w:pPr>
+        <w:pStyle w:val="Compact"/>
+        <w:numPr>
+          <w:ilvl w:val="0"/>
+          <w:numId w:val="1007"/>
+        </w:numPr>
+      </w:pPr>
+      <w:r>
+        <w:t xml:space="preserve">Bank transfer (Uganda Shillings)</w:t>
+      </w:r>
+    </w:p>
+    <w:p>
+      <w:pPr>
+        <w:pStyle w:val="Compact"/>
+        <w:numPr>
+          <w:ilvl w:val="0"/>
+          <w:numId w:val="1007"/>
+        </w:numPr>
+      </w:pPr>
+      <w:r>
+        <w:t xml:space="preserve">MTN Mobile Money (Uganda, Rwanda)</w:t>
+      </w:r>
+    </w:p>
+    <w:p>
+      <w:pPr>
+        <w:pStyle w:val="Compact"/>
+        <w:numPr>
+          <w:ilvl w:val="0"/>
+          <w:numId w:val="1007"/>
+        </w:numPr>
+      </w:pPr>
+      <w:r>
         <w:t xml:space="preserve">M-Pesa (Kenya, Tanzania)</w:t>
       </w:r>
     </w:p>
-    <w:bookmarkEnd w:id="63"/>
-    <w:bookmarkStart w:id="64" w:name="revenue-milestones"/>
+    <w:bookmarkEnd w:id="64"/>
+    <w:bookmarkStart w:id="65" w:name="revenue-milestones"/>
     <w:p>
       <w:pPr>
         <w:pStyle w:val="Heading2"/>
@@ -5226,8 +5350,8 @@
         </w:tc>
       </w:tr>
     </w:tbl>
-    <w:bookmarkEnd w:id="64"/>
-    <w:bookmarkStart w:id="65" w:name="revenue-model-summary"/>
+    <w:bookmarkEnd w:id="65"/>
+    <w:bookmarkStart w:id="66" w:name="revenue-model-summary"/>
     <w:p>
       <w:pPr>
         <w:pStyle w:val="Heading2"/>
@@ -5244,9 +5368,9 @@
         <w:t xml:space="preserve">Longhorn ERP is a pure SaaS subscription business. There are no implementation fees, no licence fees, no module purchase costs, and no support contracts sold separately. Revenue is generated entirely from monthly or annual subscription payments. Add-on a-la-carte revenue supplements base subscription revenue and is structured to create natural upgrade paths to higher tiers.</w:t>
       </w:r>
     </w:p>
-    <w:bookmarkEnd w:id="65"/>
     <w:bookmarkEnd w:id="66"/>
-    <w:bookmarkStart w:id="73" w:name="success-metrics"/>
+    <w:bookmarkEnd w:id="67"/>
+    <w:bookmarkStart w:id="74" w:name="success-metrics"/>
     <w:p>
       <w:pPr>
         <w:pStyle w:val="Heading1"/>
@@ -5263,7 +5387,7 @@
         <w:t xml:space="preserve">All metrics below are measurable thresholds. Each constitutes a pass/fail criterion that must be verified before the Phase 1 launch gate is approved.</w:t>
       </w:r>
     </w:p>
-    <w:bookmarkStart w:id="67" w:name="usability-unassisted-task-success-rate"/>
+    <w:bookmarkStart w:id="68" w:name="usability-unassisted-task-success-rate"/>
     <w:p>
       <w:pPr>
         <w:pStyle w:val="Heading2"/>
@@ -5549,8 +5673,8 @@
         <w:t xml:space="preserve">Failure definition: participant requests verbal guidance, or navigates to a dead end and requires backtracking more than once.</w:t>
       </w:r>
     </w:p>
-    <w:bookmarkEnd w:id="67"/>
-    <w:bookmarkStart w:id="68" w:name="performance-page-response-time"/>
+    <w:bookmarkEnd w:id="68"/>
+    <w:bookmarkStart w:id="69" w:name="performance-page-response-time"/>
     <w:p>
       <w:pPr>
         <w:pStyle w:val="Heading2"/>
@@ -5689,8 +5813,8 @@
         <w:t xml:space="preserve">Measurement method: load testing tool (e.g., k6 or Apache JMeter) simulating 100 concurrent users performing mixed read/write operations over a 10-minute sustained run.</w:t>
       </w:r>
     </w:p>
-    <w:bookmarkEnd w:id="68"/>
-    <w:bookmarkStart w:id="69" w:name="availability-platform-uptime"/>
+    <w:bookmarkEnd w:id="69"/>
+    <w:bookmarkStart w:id="70" w:name="availability-platform-uptime"/>
     <w:p>
       <w:pPr>
         <w:pStyle w:val="Heading2"/>
@@ -5873,8 +5997,8 @@
         <w:t xml:space="preserve">Measurement method: external uptime monitoring service polling the application health endpoint at 1-minute intervals.</w:t>
       </w:r>
     </w:p>
-    <w:bookmarkEnd w:id="69"/>
-    <w:bookmarkStart w:id="70" w:name="tenant-provisioning-time"/>
+    <w:bookmarkEnd w:id="70"/>
+    <w:bookmarkStart w:id="71" w:name="tenant-provisioning-time"/>
     <w:p>
       <w:pPr>
         <w:pStyle w:val="Heading2"/>
@@ -5989,8 +6113,8 @@
         <w:t xml:space="preserve">Measurement method: automated provisioning test run at each deployment; time recorded from payment webhook receipt to successful first login.</w:t>
       </w:r>
     </w:p>
-    <w:bookmarkEnd w:id="70"/>
-    <w:bookmarkStart w:id="71" w:name="revenue-milestones-1"/>
+    <w:bookmarkEnd w:id="71"/>
+    <w:bookmarkStart w:id="72" w:name="revenue-milestones-1"/>
     <w:p>
       <w:pPr>
         <w:pStyle w:val="Heading2"/>
@@ -6313,8 +6437,8 @@
         <w:t xml:space="preserve">Revenue milestones are gate criteria for market expansion phases. Phase 2 development budget is not released until Phase 1 MRR target is achieved for two consecutive months.</w:t>
       </w:r>
     </w:p>
-    <w:bookmarkEnd w:id="71"/>
-    <w:bookmarkStart w:id="72" w:name="security-and-compliance"/>
+    <w:bookmarkEnd w:id="72"/>
+    <w:bookmarkStart w:id="73" w:name="security-and-compliance"/>
     <w:p>
       <w:pPr>
         <w:pStyle w:val="Heading2"/>
@@ -6433,9 +6557,9 @@
         </w:tc>
       </w:tr>
     </w:tbl>
-    <w:bookmarkEnd w:id="72"/>
     <w:bookmarkEnd w:id="73"/>
-    <w:bookmarkStart w:id="78" w:name="open-questions--internal-decision-gaps"/>
+    <w:bookmarkEnd w:id="74"/>
+    <w:bookmarkStart w:id="79" w:name="open-questions--internal-decision-gaps"/>
     <w:p>
       <w:pPr>
         <w:pStyle w:val="Heading1"/>
@@ -6459,7 +6583,7 @@
         </w:pict>
       </w:r>
     </w:p>
-    <w:bookmarkStart w:id="74" w:name="gap-015-white-labelling-policy"/>
+    <w:bookmarkStart w:id="75" w:name="gap-015-white-labelling-policy"/>
     <w:p>
       <w:pPr>
         <w:pStyle w:val="Heading2"/>
@@ -6521,7 +6645,7 @@
         <w:pStyle w:val="Compact"/>
         <w:numPr>
           <w:ilvl w:val="0"/>
-          <w:numId w:val="1007"/>
+          <w:numId w:val="1008"/>
         </w:numPr>
       </w:pPr>
       <w:r>
@@ -6533,7 +6657,7 @@
         <w:pStyle w:val="Compact"/>
         <w:numPr>
           <w:ilvl w:val="0"/>
-          <w:numId w:val="1007"/>
+          <w:numId w:val="1008"/>
         </w:numPr>
       </w:pPr>
       <w:r>
@@ -6545,7 +6669,7 @@
         <w:pStyle w:val="Compact"/>
         <w:numPr>
           <w:ilvl w:val="0"/>
-          <w:numId w:val="1007"/>
+          <w:numId w:val="1008"/>
         </w:numPr>
       </w:pPr>
       <w:r>
@@ -6589,8 +6713,8 @@
         </w:pict>
       </w:r>
     </w:p>
-    <w:bookmarkEnd w:id="74"/>
-    <w:bookmarkStart w:id="75" w:name="gap-016-hospitality-module-scope"/>
+    <w:bookmarkEnd w:id="75"/>
+    <w:bookmarkStart w:id="76" w:name="gap-016-hospitality-module-scope"/>
     <w:p>
       <w:pPr>
         <w:pStyle w:val="Heading2"/>
@@ -6661,7 +6785,7 @@
         <w:pStyle w:val="Compact"/>
         <w:numPr>
           <w:ilvl w:val="0"/>
-          <w:numId w:val="1008"/>
+          <w:numId w:val="1009"/>
         </w:numPr>
       </w:pPr>
       <w:r>
@@ -6673,7 +6797,7 @@
         <w:pStyle w:val="Compact"/>
         <w:numPr>
           <w:ilvl w:val="0"/>
-          <w:numId w:val="1008"/>
+          <w:numId w:val="1009"/>
         </w:numPr>
       </w:pPr>
       <w:r>
@@ -6685,7 +6809,7 @@
         <w:pStyle w:val="Compact"/>
         <w:numPr>
           <w:ilvl w:val="0"/>
-          <w:numId w:val="1008"/>
+          <w:numId w:val="1009"/>
         </w:numPr>
       </w:pPr>
       <w:r>
@@ -6726,8 +6850,8 @@
         </w:pict>
       </w:r>
     </w:p>
-    <w:bookmarkEnd w:id="75"/>
-    <w:bookmarkStart w:id="76" w:name="Xa1dd700d3e7c29a6b86db3cd21562eacf4be287"/>
+    <w:bookmarkEnd w:id="76"/>
+    <w:bookmarkStart w:id="77" w:name="Xa1dd700d3e7c29a6b86db3cd21562eacf4be287"/>
     <w:p>
       <w:pPr>
         <w:pStyle w:val="Heading2"/>
@@ -6789,7 +6913,7 @@
         <w:pStyle w:val="Compact"/>
         <w:numPr>
           <w:ilvl w:val="0"/>
-          <w:numId w:val="1009"/>
+          <w:numId w:val="1010"/>
         </w:numPr>
       </w:pPr>
       <w:r>
@@ -6810,7 +6934,7 @@
         <w:pStyle w:val="Compact"/>
         <w:numPr>
           <w:ilvl w:val="0"/>
-          <w:numId w:val="1009"/>
+          <w:numId w:val="1010"/>
         </w:numPr>
       </w:pPr>
       <w:r>
@@ -6822,7 +6946,7 @@
         <w:pStyle w:val="Compact"/>
         <w:numPr>
           <w:ilvl w:val="0"/>
-          <w:numId w:val="1009"/>
+          <w:numId w:val="1010"/>
         </w:numPr>
       </w:pPr>
       <w:r>
@@ -6869,8 +6993,8 @@
         </w:pict>
       </w:r>
     </w:p>
-    <w:bookmarkEnd w:id="76"/>
-    <w:bookmarkStart w:id="77" w:name="gap-018-source-code-strategy"/>
+    <w:bookmarkEnd w:id="77"/>
+    <w:bookmarkStart w:id="78" w:name="gap-018-source-code-strategy"/>
     <w:p>
       <w:pPr>
         <w:pStyle w:val="Heading2"/>
@@ -6932,7 +7056,7 @@
         <w:pStyle w:val="Compact"/>
         <w:numPr>
           <w:ilvl w:val="0"/>
-          <w:numId w:val="1010"/>
+          <w:numId w:val="1011"/>
         </w:numPr>
       </w:pPr>
       <w:r>
@@ -6944,7 +7068,7 @@
         <w:pStyle w:val="Compact"/>
         <w:numPr>
           <w:ilvl w:val="0"/>
-          <w:numId w:val="1010"/>
+          <w:numId w:val="1011"/>
         </w:numPr>
       </w:pPr>
       <w:r>
@@ -6956,7 +7080,7 @@
         <w:pStyle w:val="Compact"/>
         <w:numPr>
           <w:ilvl w:val="0"/>
-          <w:numId w:val="1010"/>
+          <w:numId w:val="1011"/>
         </w:numPr>
       </w:pPr>
       <w:r>
@@ -7000,9 +7124,9 @@
         <w:t xml:space="preserve">All 4 gaps above must be reviewed and signed off by Peter Bamuhigire before the documents they block are submitted for phase-gate approval.</w:t>
       </w:r>
     </w:p>
-    <w:bookmarkEnd w:id="77"/>
     <w:bookmarkEnd w:id="78"/>
-    <w:bookmarkStart w:id="86" w:name="Xb38158efe5c70268bffb632872174aebaaeea8e"/>
+    <w:bookmarkEnd w:id="79"/>
+    <w:bookmarkStart w:id="87" w:name="Xb38158efe5c70268bffb632872174aebaaeea8e"/>
     <w:p>
       <w:pPr>
         <w:pStyle w:val="Heading1"/>
@@ -7011,7 +7135,7 @@
         <w:t xml:space="preserve">AI Intelligence Module — Intelligent Business Add-On</w:t>
       </w:r>
     </w:p>
-    <w:bookmarkStart w:id="79" w:name="positioning"/>
+    <w:bookmarkStart w:id="80" w:name="positioning"/>
     <w:p>
       <w:pPr>
         <w:pStyle w:val="Heading2"/>
@@ -7066,8 +7190,8 @@
         </w:pict>
       </w:r>
     </w:p>
-    <w:bookmarkEnd w:id="79"/>
-    <w:bookmarkStart w:id="80" w:name="X55e2a79977ea7a1d8ff12997b8b5425d3f10854"/>
+    <w:bookmarkEnd w:id="80"/>
+    <w:bookmarkStart w:id="81" w:name="X55e2a79977ea7a1d8ff12997b8b5425d3f10854"/>
     <w:p>
       <w:pPr>
         <w:pStyle w:val="Heading2"/>
@@ -7191,8 +7315,8 @@
         </w:pict>
       </w:r>
     </w:p>
-    <w:bookmarkEnd w:id="80"/>
-    <w:bookmarkStart w:id="81" w:name="Xb20f5f86fc741c1035dac928e5245ecd5fe83da"/>
+    <w:bookmarkEnd w:id="81"/>
+    <w:bookmarkStart w:id="82" w:name="Xb20f5f86fc741c1035dac928e5245ecd5fe83da"/>
     <w:p>
       <w:pPr>
         <w:pStyle w:val="Heading2"/>
@@ -7316,8 +7440,8 @@
         </w:pict>
       </w:r>
     </w:p>
-    <w:bookmarkEnd w:id="81"/>
-    <w:bookmarkStart w:id="82" w:name="X6ee0b7705dc9348be3351465ebb1fbd1e778047"/>
+    <w:bookmarkEnd w:id="82"/>
+    <w:bookmarkStart w:id="83" w:name="X6ee0b7705dc9348be3351465ebb1fbd1e778047"/>
     <w:p>
       <w:pPr>
         <w:pStyle w:val="Heading2"/>
@@ -7441,8 +7565,8 @@
         </w:pict>
       </w:r>
     </w:p>
-    <w:bookmarkEnd w:id="82"/>
-    <w:bookmarkStart w:id="83" w:name="Xfb33015a467edff35a6f4c58b1a60d7813b1fa7"/>
+    <w:bookmarkEnd w:id="83"/>
+    <w:bookmarkStart w:id="84" w:name="Xfb33015a467edff35a6f4c58b1a60d7813b1fa7"/>
     <w:p>
       <w:pPr>
         <w:pStyle w:val="Heading2"/>
@@ -7566,8 +7690,8 @@
         </w:pict>
       </w:r>
     </w:p>
-    <w:bookmarkEnd w:id="83"/>
-    <w:bookmarkStart w:id="84" w:name="Xf899a5ad0e538e65599cf5dd64375d3e3dbbf43"/>
+    <w:bookmarkEnd w:id="84"/>
+    <w:bookmarkStart w:id="85" w:name="Xf899a5ad0e538e65599cf5dd64375d3e3dbbf43"/>
     <w:p>
       <w:pPr>
         <w:pStyle w:val="Heading2"/>
@@ -7691,8 +7815,8 @@
         </w:pict>
       </w:r>
     </w:p>
-    <w:bookmarkEnd w:id="84"/>
-    <w:bookmarkStart w:id="85" w:name="ai-intelligence-module-packaging-summary"/>
+    <w:bookmarkEnd w:id="85"/>
+    <w:bookmarkStart w:id="86" w:name="ai-intelligence-module-packaging-summary"/>
     <w:p>
       <w:pPr>
         <w:pStyle w:val="Heading2"/>
@@ -8024,9 +8148,9 @@
         <w:t xml:space="preserve">.</w:t>
       </w:r>
     </w:p>
-    <w:bookmarkEnd w:id="85"/>
     <w:bookmarkEnd w:id="86"/>
-    <w:bookmarkStart w:id="93" w:name="Xf8227227ae81cf775b96b824b0c2b3d248f77e6"/>
+    <w:bookmarkEnd w:id="87"/>
+    <w:bookmarkStart w:id="94" w:name="Xf8227227ae81cf775b96b824b0c2b3d248f77e6"/>
     <w:p>
       <w:pPr>
         <w:pStyle w:val="Heading1"/>
@@ -8035,7 +8159,7 @@
         <w:t xml:space="preserve">Industrial Lifecycle, Manufacturing Execution, and Transportation Depth</w:t>
       </w:r>
     </w:p>
-    <w:bookmarkStart w:id="87" w:name="positioning-1"/>
+    <w:bookmarkStart w:id="88" w:name="positioning-1"/>
     <w:p>
       <w:pPr>
         <w:pStyle w:val="Heading2"/>
@@ -8065,7 +8189,7 @@
         <w:pStyle w:val="Compact"/>
         <w:numPr>
           <w:ilvl w:val="0"/>
-          <w:numId w:val="1011"/>
+          <w:numId w:val="1012"/>
         </w:numPr>
       </w:pPr>
       <w:r>
@@ -8087,7 +8211,7 @@
         <w:pStyle w:val="Compact"/>
         <w:numPr>
           <w:ilvl w:val="0"/>
-          <w:numId w:val="1011"/>
+          <w:numId w:val="1012"/>
         </w:numPr>
       </w:pPr>
       <w:r>
@@ -8109,7 +8233,7 @@
         <w:pStyle w:val="Compact"/>
         <w:numPr>
           <w:ilvl w:val="0"/>
-          <w:numId w:val="1011"/>
+          <w:numId w:val="1012"/>
         </w:numPr>
       </w:pPr>
       <w:r>
@@ -8141,8 +8265,8 @@
         </w:pict>
       </w:r>
     </w:p>
-    <w:bookmarkEnd w:id="87"/>
-    <w:bookmarkStart w:id="88" w:name="Xd0b0d03c0071c3f3e0e467c5dd714c3d98adad1"/>
+    <w:bookmarkEnd w:id="88"/>
+    <w:bookmarkStart w:id="89" w:name="Xd0b0d03c0071c3f3e0e467c5dd714c3d98adad1"/>
     <w:p>
       <w:pPr>
         <w:pStyle w:val="Heading2"/>
@@ -8266,8 +8390,8 @@
         </w:pict>
       </w:r>
     </w:p>
-    <w:bookmarkEnd w:id="88"/>
-    <w:bookmarkStart w:id="89" w:name="X13f49fd4699712dbe2b9c2d929fcd469a871e88"/>
+    <w:bookmarkEnd w:id="89"/>
+    <w:bookmarkStart w:id="90" w:name="X13f49fd4699712dbe2b9c2d929fcd469a871e88"/>
     <w:p>
       <w:pPr>
         <w:pStyle w:val="Heading2"/>
@@ -8391,8 +8515,8 @@
         </w:pict>
       </w:r>
     </w:p>
-    <w:bookmarkEnd w:id="89"/>
-    <w:bookmarkStart w:id="90" w:name="Xa22881436a94f03bf8d5882337a9f7298ad818a"/>
+    <w:bookmarkEnd w:id="90"/>
+    <w:bookmarkStart w:id="91" w:name="Xa22881436a94f03bf8d5882337a9f7298ad818a"/>
     <w:p>
       <w:pPr>
         <w:pStyle w:val="Heading2"/>
@@ -8516,8 +8640,8 @@
         </w:pict>
       </w:r>
     </w:p>
-    <w:bookmarkEnd w:id="90"/>
-    <w:bookmarkStart w:id="91" w:name="capability-4-fleet-operations-control"/>
+    <w:bookmarkEnd w:id="91"/>
+    <w:bookmarkStart w:id="92" w:name="capability-4-fleet-operations-control"/>
     <w:p>
       <w:pPr>
         <w:pStyle w:val="Heading2"/>
@@ -8641,8 +8765,8 @@
         </w:pict>
       </w:r>
     </w:p>
-    <w:bookmarkEnd w:id="91"/>
-    <w:bookmarkStart w:id="92" w:name="product-boundary-rule"/>
+    <w:bookmarkEnd w:id="92"/>
+    <w:bookmarkStart w:id="93" w:name="product-boundary-rule"/>
     <w:p>
       <w:pPr>
         <w:pStyle w:val="Heading2"/>
@@ -8657,164 +8781,6 @@
       </w:pPr>
       <w:r>
         <w:t xml:space="preserve">Longhorn ERP uses the following boundary rule to remain world-class rather than bloated:</w:t>
-      </w:r>
-    </w:p>
-    <w:p>
-      <w:pPr>
-        <w:pStyle w:val="Compact"/>
-        <w:numPr>
-          <w:ilvl w:val="0"/>
-          <w:numId w:val="1012"/>
-        </w:numPr>
-      </w:pPr>
-      <w:r>
-        <w:rPr>
-          <w:rStyle w:val="VerbatimChar"/>
-        </w:rPr>
-        <w:t xml:space="preserve">PLM</w:t>
-      </w:r>
-      <w:r>
-        <w:t xml:space="preserve"> </w:t>
-      </w:r>
-      <w:r>
-        <w:t xml:space="preserve">owns engineering truth.</w:t>
-      </w:r>
-    </w:p>
-    <w:p>
-      <w:pPr>
-        <w:pStyle w:val="Compact"/>
-        <w:numPr>
-          <w:ilvl w:val="0"/>
-          <w:numId w:val="1012"/>
-        </w:numPr>
-      </w:pPr>
-      <w:r>
-        <w:rPr>
-          <w:rStyle w:val="VerbatimChar"/>
-        </w:rPr>
-        <w:t xml:space="preserve">MANUFACTURING</w:t>
-      </w:r>
-      <w:r>
-        <w:t xml:space="preserve"> </w:t>
-      </w:r>
-      <w:r>
-        <w:t xml:space="preserve">owns plant execution and production economics.</w:t>
-      </w:r>
-    </w:p>
-    <w:p>
-      <w:pPr>
-        <w:pStyle w:val="Compact"/>
-        <w:numPr>
-          <w:ilvl w:val="0"/>
-          <w:numId w:val="1012"/>
-        </w:numPr>
-      </w:pPr>
-      <w:r>
-        <w:rPr>
-          <w:rStyle w:val="VerbatimChar"/>
-        </w:rPr>
-        <w:t xml:space="preserve">TRANSPORTATION</w:t>
-      </w:r>
-      <w:r>
-        <w:t xml:space="preserve"> </w:t>
-      </w:r>
-      <w:r>
-        <w:t xml:space="preserve">owns shipment and fleet operations.</w:t>
-      </w:r>
-    </w:p>
-    <w:p>
-      <w:pPr>
-        <w:pStyle w:val="Compact"/>
-        <w:numPr>
-          <w:ilvl w:val="0"/>
-          <w:numId w:val="1012"/>
-        </w:numPr>
-      </w:pPr>
-      <w:r>
-        <w:rPr>
-          <w:rStyle w:val="VerbatimChar"/>
-        </w:rPr>
-        <w:t xml:space="preserve">ASSETS</w:t>
-      </w:r>
-      <w:r>
-        <w:t xml:space="preserve"> </w:t>
-      </w:r>
-      <w:r>
-        <w:t xml:space="preserve">owns vehicle capital-asset accounting and maintenance history.</w:t>
-      </w:r>
-    </w:p>
-    <w:p>
-      <w:pPr>
-        <w:pStyle w:val="FirstParagraph"/>
-      </w:pPr>
-      <w:r>
-        <w:t xml:space="preserve">This separation keeps decision rights clear while still giving the customer one integrated ERP platform.</w:t>
-      </w:r>
-    </w:p>
-    <w:bookmarkEnd w:id="92"/>
-    <w:bookmarkEnd w:id="93"/>
-    <w:bookmarkStart w:id="102" w:name="finance-erp-excellence"/>
-    <w:p>
-      <w:pPr>
-        <w:pStyle w:val="Heading1"/>
-      </w:pPr>
-      <w:r>
-        <w:t xml:space="preserve">Finance ERP Excellence</w:t>
-      </w:r>
-    </w:p>
-    <w:bookmarkStart w:id="94" w:name="positioning-2"/>
-    <w:p>
-      <w:pPr>
-        <w:pStyle w:val="Heading2"/>
-      </w:pPr>
-      <w:r>
-        <w:t xml:space="preserve">Positioning</w:t>
-      </w:r>
-    </w:p>
-    <w:p>
-      <w:pPr>
-        <w:pStyle w:val="FirstParagraph"/>
-      </w:pPr>
-      <w:r>
-        <w:t xml:space="preserve">Longhorn ERP aims to be a world-class African ERP for organisations that must control money, risk, operations, and growth from a single platform. In that positioning, finance is not a back-office afterthought. It is the control tower for trust, capital discipline, operational visibility, and board-level decision-making.</w:t>
-      </w:r>
-    </w:p>
-    <w:p>
-      <w:pPr>
-        <w:pStyle w:val="BodyText"/>
-      </w:pPr>
-      <w:r>
-        <w:t xml:space="preserve">Longhorn ERP keeps</w:t>
-      </w:r>
-      <w:r>
-        <w:t xml:space="preserve"> </w:t>
-      </w:r>
-      <w:r>
-        <w:rPr>
-          <w:rStyle w:val="VerbatimChar"/>
-        </w:rPr>
-        <w:t xml:space="preserve">ACCOUNTING</w:t>
-      </w:r>
-      <w:r>
-        <w:t xml:space="preserve"> </w:t>
-      </w:r>
-      <w:r>
-        <w:t xml:space="preserve">as the core finance module. The product does not fragment finance into disconnected mini-products. Instead, it deepens</w:t>
-      </w:r>
-      <w:r>
-        <w:t xml:space="preserve"> </w:t>
-      </w:r>
-      <w:r>
-        <w:rPr>
-          <w:rStyle w:val="VerbatimChar"/>
-        </w:rPr>
-        <w:t xml:space="preserve">ACCOUNTING</w:t>
-      </w:r>
-      <w:r>
-        <w:t xml:space="preserve"> </w:t>
-      </w:r>
-      <w:r>
-        <w:t xml:space="preserve">so the same financial core can serve:</w:t>
       </w:r>
     </w:p>
     <w:p>
@@ -8826,7 +8792,16 @@
         </w:numPr>
       </w:pPr>
       <w:r>
-        <w:t xml:space="preserve">small businesses that need strong controls early</w:t>
+        <w:rPr>
+          <w:rStyle w:val="VerbatimChar"/>
+        </w:rPr>
+        <w:t xml:space="preserve">PLM</w:t>
+      </w:r>
+      <w:r>
+        <w:t xml:space="preserve"> </w:t>
+      </w:r>
+      <w:r>
+        <w:t xml:space="preserve">owns engineering truth.</w:t>
       </w:r>
     </w:p>
     <w:p>
@@ -8838,7 +8813,16 @@
         </w:numPr>
       </w:pPr>
       <w:r>
-        <w:t xml:space="preserve">mid-market organisations that need faster close and better management reporting</w:t>
+        <w:rPr>
+          <w:rStyle w:val="VerbatimChar"/>
+        </w:rPr>
+        <w:t xml:space="preserve">MANUFACTURING</w:t>
+      </w:r>
+      <w:r>
+        <w:t xml:space="preserve"> </w:t>
+      </w:r>
+      <w:r>
+        <w:t xml:space="preserve">owns plant execution and production economics.</w:t>
       </w:r>
     </w:p>
     <w:p>
@@ -8850,26 +8834,65 @@
         </w:numPr>
       </w:pPr>
       <w:r>
-        <w:t xml:space="preserve">larger multi-entity groups that need consolidation foundations, finance governance, and audit-ready evidence</w:t>
-      </w:r>
-    </w:p>
+        <w:rPr>
+          <w:rStyle w:val="VerbatimChar"/>
+        </w:rPr>
+        <w:t xml:space="preserve">TRANSPORTATION</w:t>
+      </w:r>
+      <w:r>
+        <w:t xml:space="preserve"> </w:t>
+      </w:r>
+      <w:r>
+        <w:t xml:space="preserve">owns shipment and fleet operations.</w:t>
+      </w:r>
+    </w:p>
+    <w:p>
+      <w:pPr>
+        <w:pStyle w:val="Compact"/>
+        <w:numPr>
+          <w:ilvl w:val="0"/>
+          <w:numId w:val="1013"/>
+        </w:numPr>
+      </w:pPr>
+      <w:r>
+        <w:rPr>
+          <w:rStyle w:val="VerbatimChar"/>
+        </w:rPr>
+        <w:t xml:space="preserve">ASSETS</w:t>
+      </w:r>
+      <w:r>
+        <w:t xml:space="preserve"> </w:t>
+      </w:r>
+      <w:r>
+        <w:t xml:space="preserve">owns vehicle capital-asset accounting and maintenance history.</w:t>
+      </w:r>
+    </w:p>
+    <w:p>
+      <w:pPr>
+        <w:pStyle w:val="FirstParagraph"/>
+      </w:pPr>
+      <w:r>
+        <w:t xml:space="preserve">This separation keeps decision rights clear while still giving the customer one integrated ERP platform.</w:t>
+      </w:r>
+    </w:p>
+    <w:bookmarkEnd w:id="93"/>
     <w:bookmarkEnd w:id="94"/>
-    <w:bookmarkStart w:id="100" w:name="world-class-finance-capability-themes"/>
+    <w:bookmarkStart w:id="103" w:name="finance-erp-excellence"/>
+    <w:p>
+      <w:pPr>
+        <w:pStyle w:val="Heading1"/>
+      </w:pPr>
+      <w:r>
+        <w:t xml:space="preserve">Finance ERP Excellence</w:t>
+      </w:r>
+    </w:p>
+    <w:bookmarkStart w:id="95" w:name="positioning-2"/>
     <w:p>
       <w:pPr>
         <w:pStyle w:val="Heading2"/>
       </w:pPr>
       <w:r>
-        <w:t xml:space="preserve">World-Class Finance Capability Themes</w:t>
-      </w:r>
-    </w:p>
-    <w:bookmarkStart w:id="95" w:name="X09df0a9dee15f5e7f9eca8102801b6591576de1"/>
-    <w:p>
-      <w:pPr>
-        <w:pStyle w:val="Heading3"/>
-      </w:pPr>
-      <w:r>
-        <w:t xml:space="preserve">1. Record-to-Report Discipline</w:t>
+        <w:t xml:space="preserve">Positioning</w:t>
       </w:r>
     </w:p>
     <w:p>
@@ -8877,7 +8900,7 @@
         <w:pStyle w:val="FirstParagraph"/>
       </w:pPr>
       <w:r>
-        <w:t xml:space="preserve">Longhorn ERP must support a disciplined record-to-report operating model rather than loose transaction capture. Finance teams should be able to move from source transactions to trusted books and formal reporting with clear controls at each stage.</w:t>
+        <w:t xml:space="preserve">Longhorn ERP aims to be a world-class African ERP for organisations that must control money, risk, operations, and growth from a single platform. In that positioning, finance is not a back-office afterthought. It is the control tower for trust, capital discipline, operational visibility, and board-level decision-making.</w:t>
       </w:r>
     </w:p>
     <w:p>
@@ -8885,7 +8908,37 @@
         <w:pStyle w:val="BodyText"/>
       </w:pPr>
       <w:r>
-        <w:t xml:space="preserve">Core expectations include:</w:t>
+        <w:t xml:space="preserve">Longhorn ERP keeps</w:t>
+      </w:r>
+      <w:r>
+        <w:t xml:space="preserve"> </w:t>
+      </w:r>
+      <w:r>
+        <w:rPr>
+          <w:rStyle w:val="VerbatimChar"/>
+        </w:rPr>
+        <w:t xml:space="preserve">ACCOUNTING</w:t>
+      </w:r>
+      <w:r>
+        <w:t xml:space="preserve"> </w:t>
+      </w:r>
+      <w:r>
+        <w:t xml:space="preserve">as the core finance module. The product does not fragment finance into disconnected mini-products. Instead, it deepens</w:t>
+      </w:r>
+      <w:r>
+        <w:t xml:space="preserve"> </w:t>
+      </w:r>
+      <w:r>
+        <w:rPr>
+          <w:rStyle w:val="VerbatimChar"/>
+        </w:rPr>
+        <w:t xml:space="preserve">ACCOUNTING</w:t>
+      </w:r>
+      <w:r>
+        <w:t xml:space="preserve"> </w:t>
+      </w:r>
+      <w:r>
+        <w:t xml:space="preserve">so the same financial core can serve:</w:t>
       </w:r>
     </w:p>
     <w:p>
@@ -8897,7 +8950,7 @@
         </w:numPr>
       </w:pPr>
       <w:r>
-        <w:t xml:space="preserve">chart of accounts governance with dimensional reporting support</w:t>
+        <w:t xml:space="preserve">small businesses that need strong controls early</w:t>
       </w:r>
     </w:p>
     <w:p>
@@ -8909,7 +8962,7 @@
         </w:numPr>
       </w:pPr>
       <w:r>
-        <w:t xml:space="preserve">controlled journals with maker-checker review where configured</w:t>
+        <w:t xml:space="preserve">mid-market organisations that need faster close and better management reporting</w:t>
       </w:r>
     </w:p>
     <w:p>
@@ -8921,53 +8974,26 @@
         </w:numPr>
       </w:pPr>
       <w:r>
-        <w:t xml:space="preserve">accounting period management with open, soft-close, hard-close, and re-open controls</w:t>
-      </w:r>
-    </w:p>
-    <w:p>
-      <w:pPr>
-        <w:pStyle w:val="Compact"/>
-        <w:numPr>
-          <w:ilvl w:val="0"/>
-          <w:numId w:val="1014"/>
-        </w:numPr>
-      </w:pPr>
-      <w:r>
-        <w:t xml:space="preserve">subledger-to-GL reconciliation support across receivables, payables, inventory, payroll, banking, fixed assets, and manufacturing cost flows</w:t>
-      </w:r>
-    </w:p>
-    <w:p>
-      <w:pPr>
-        <w:pStyle w:val="Compact"/>
-        <w:numPr>
-          <w:ilvl w:val="0"/>
-          <w:numId w:val="1014"/>
-        </w:numPr>
-      </w:pPr>
-      <w:r>
-        <w:t xml:space="preserve">accrual, prepayment, adjustment, and reclassification discipline</w:t>
-      </w:r>
-    </w:p>
-    <w:p>
-      <w:pPr>
-        <w:pStyle w:val="Compact"/>
-        <w:numPr>
-          <w:ilvl w:val="0"/>
-          <w:numId w:val="1014"/>
-        </w:numPr>
-      </w:pPr>
-      <w:r>
-        <w:t xml:space="preserve">audit-ready evidence for postings, reversals, overrides, and late adjustments</w:t>
+        <w:t xml:space="preserve">larger multi-entity groups that need consolidation foundations, finance governance, and audit-ready evidence</w:t>
       </w:r>
     </w:p>
     <w:bookmarkEnd w:id="95"/>
-    <w:bookmarkStart w:id="96" w:name="Xa5a01402f503996e742a4ccc292d5b22a0fb1ec"/>
+    <w:bookmarkStart w:id="101" w:name="world-class-finance-capability-themes"/>
+    <w:p>
+      <w:pPr>
+        <w:pStyle w:val="Heading2"/>
+      </w:pPr>
+      <w:r>
+        <w:t xml:space="preserve">World-Class Finance Capability Themes</w:t>
+      </w:r>
+    </w:p>
+    <w:bookmarkStart w:id="96" w:name="X09df0a9dee15f5e7f9eca8102801b6591576de1"/>
     <w:p>
       <w:pPr>
         <w:pStyle w:val="Heading3"/>
       </w:pPr>
       <w:r>
-        <w:t xml:space="preserve">2. Close Orchestration</w:t>
+        <w:t xml:space="preserve">1. Record-to-Report Discipline</w:t>
       </w:r>
     </w:p>
     <w:p>
@@ -8975,7 +9001,7 @@
         <w:pStyle w:val="FirstParagraph"/>
       </w:pPr>
       <w:r>
-        <w:t xml:space="preserve">Longhorn ERP must help finance teams run a repeatable monthly, quarterly, and annual close, not just post entries into the ledger. Close should be visible, accountable, and measurable.</w:t>
+        <w:t xml:space="preserve">Longhorn ERP must support a disciplined record-to-report operating model rather than loose transaction capture. Finance teams should be able to move from source transactions to trusted books and formal reporting with clear controls at each stage.</w:t>
       </w:r>
     </w:p>
     <w:p>
@@ -8995,7 +9021,7 @@
         </w:numPr>
       </w:pPr>
       <w:r>
-        <w:t xml:space="preserve">close calendars and period-specific close checklists</w:t>
+        <w:t xml:space="preserve">chart of accounts governance with dimensional reporting support</w:t>
       </w:r>
     </w:p>
     <w:p>
@@ -9007,7 +9033,7 @@
         </w:numPr>
       </w:pPr>
       <w:r>
-        <w:t xml:space="preserve">assigned close tasks with owners, due dates, status, and blockers</w:t>
+        <w:t xml:space="preserve">controlled journals with maker-checker review where configured</w:t>
       </w:r>
     </w:p>
     <w:p>
@@ -9019,7 +9045,7 @@
         </w:numPr>
       </w:pPr>
       <w:r>
-        <w:t xml:space="preserve">dependency-aware close sequencing across branches, business units, and entities</w:t>
+        <w:t xml:space="preserve">accounting period management with open, soft-close, hard-close, and re-open controls</w:t>
       </w:r>
     </w:p>
     <w:p>
@@ -9031,7 +9057,7 @@
         </w:numPr>
       </w:pPr>
       <w:r>
-        <w:t xml:space="preserve">review and sign-off workflow for critical close activities</w:t>
+        <w:t xml:space="preserve">subledger-to-GL reconciliation support across receivables, payables, inventory, payroll, banking, fixed assets, and manufacturing cost flows</w:t>
       </w:r>
     </w:p>
     <w:p>
@@ -9043,7 +9069,7 @@
         </w:numPr>
       </w:pPr>
       <w:r>
-        <w:t xml:space="preserve">issue and exception tracking for unresolved reconciling items</w:t>
+        <w:t xml:space="preserve">accrual, prepayment, adjustment, and reclassification discipline</w:t>
       </w:r>
     </w:p>
     <w:p>
@@ -9055,17 +9081,17 @@
         </w:numPr>
       </w:pPr>
       <w:r>
-        <w:t xml:space="preserve">close dashboards for CFO, controller, and finance manager oversight</w:t>
+        <w:t xml:space="preserve">audit-ready evidence for postings, reversals, overrides, and late adjustments</w:t>
       </w:r>
     </w:p>
     <w:bookmarkEnd w:id="96"/>
-    <w:bookmarkStart w:id="97" w:name="X14170d31aef46dfa8cebb56c689ed01ad39bbb8"/>
+    <w:bookmarkStart w:id="97" w:name="Xa5a01402f503996e742a4ccc292d5b22a0fb1ec"/>
     <w:p>
       <w:pPr>
         <w:pStyle w:val="Heading3"/>
       </w:pPr>
       <w:r>
-        <w:t xml:space="preserve">3. Consolidation Foundations</w:t>
+        <w:t xml:space="preserve">2. Close Orchestration</w:t>
       </w:r>
     </w:p>
     <w:p>
@@ -9073,7 +9099,7 @@
         <w:pStyle w:val="FirstParagraph"/>
       </w:pPr>
       <w:r>
-        <w:t xml:space="preserve">Longhorn ERP should support growth into group finance without forcing customers to replace the financial core once they expand. The system should therefore provide consolidation foundations even where full advanced consolidation is phased in over time.</w:t>
+        <w:t xml:space="preserve">Longhorn ERP must help finance teams run a repeatable monthly, quarterly, and annual close, not just post entries into the ledger. Close should be visible, accountable, and measurable.</w:t>
       </w:r>
     </w:p>
     <w:p>
@@ -9093,7 +9119,7 @@
         </w:numPr>
       </w:pPr>
       <w:r>
-        <w:t xml:space="preserve">legal-entity and branch structures aligned to finance reporting needs</w:t>
+        <w:t xml:space="preserve">close calendars and period-specific close checklists</w:t>
       </w:r>
     </w:p>
     <w:p>
@@ -9105,7 +9131,7 @@
         </w:numPr>
       </w:pPr>
       <w:r>
-        <w:t xml:space="preserve">multi-company and multi-currency foundations</w:t>
+        <w:t xml:space="preserve">assigned close tasks with owners, due dates, status, and blockers</w:t>
       </w:r>
     </w:p>
     <w:p>
@@ -9117,7 +9143,7 @@
         </w:numPr>
       </w:pPr>
       <w:r>
-        <w:t xml:space="preserve">intercompany transaction discipline and reconciliation readiness</w:t>
+        <w:t xml:space="preserve">dependency-aware close sequencing across branches, business units, and entities</w:t>
       </w:r>
     </w:p>
     <w:p>
@@ -9129,7 +9155,7 @@
         </w:numPr>
       </w:pPr>
       <w:r>
-        <w:t xml:space="preserve">elimination support foundations for group reporting</w:t>
+        <w:t xml:space="preserve">review and sign-off workflow for critical close activities</w:t>
       </w:r>
     </w:p>
     <w:p>
@@ -9141,7 +9167,7 @@
         </w:numPr>
       </w:pPr>
       <w:r>
-        <w:t xml:space="preserve">common dimensional design to support entity, branch, department, project, and product-line reporting</w:t>
+        <w:t xml:space="preserve">issue and exception tracking for unresolved reconciling items</w:t>
       </w:r>
     </w:p>
     <w:p>
@@ -9153,17 +9179,17 @@
         </w:numPr>
       </w:pPr>
       <w:r>
-        <w:t xml:space="preserve">group pack preparation for board, lender, investor, and statutory reporting</w:t>
+        <w:t xml:space="preserve">close dashboards for CFO, controller, and finance manager oversight</w:t>
       </w:r>
     </w:p>
     <w:bookmarkEnd w:id="97"/>
-    <w:bookmarkStart w:id="98" w:name="X1f4ff391e5add7e26faf81aa846ee5581848876"/>
+    <w:bookmarkStart w:id="98" w:name="X14170d31aef46dfa8cebb56c689ed01ad39bbb8"/>
     <w:p>
       <w:pPr>
         <w:pStyle w:val="Heading3"/>
       </w:pPr>
       <w:r>
-        <w:t xml:space="preserve">4. Finance Controls, Workflow, and Approvals</w:t>
+        <w:t xml:space="preserve">3. Consolidation Foundations</w:t>
       </w:r>
     </w:p>
     <w:p>
@@ -9171,7 +9197,7 @@
         <w:pStyle w:val="FirstParagraph"/>
       </w:pPr>
       <w:r>
-        <w:t xml:space="preserve">Longhorn ERP must make control design a product capability, not a consulting afterthought. African organisations often operate in environments where fraud resistance, policy compliance, and delegated authority discipline materially affect survival and growth.</w:t>
+        <w:t xml:space="preserve">Longhorn ERP should support growth into group finance without forcing customers to replace the financial core once they expand. The system should therefore provide consolidation foundations even where full advanced consolidation is phased in over time.</w:t>
       </w:r>
     </w:p>
     <w:p>
@@ -9191,7 +9217,7 @@
         </w:numPr>
       </w:pPr>
       <w:r>
-        <w:t xml:space="preserve">maker-checker workflows for sensitive finance actions</w:t>
+        <w:t xml:space="preserve">legal-entity and branch structures aligned to finance reporting needs</w:t>
       </w:r>
     </w:p>
     <w:p>
@@ -9203,7 +9229,7 @@
         </w:numPr>
       </w:pPr>
       <w:r>
-        <w:t xml:space="preserve">configurable approval thresholds by transaction type, amount, entity, and role</w:t>
+        <w:t xml:space="preserve">multi-company and multi-currency foundations</w:t>
       </w:r>
     </w:p>
     <w:p>
@@ -9215,7 +9241,7 @@
         </w:numPr>
       </w:pPr>
       <w:r>
-        <w:t xml:space="preserve">segregation-of-duties-aware workflow design</w:t>
+        <w:t xml:space="preserve">intercompany transaction discipline and reconciliation readiness</w:t>
       </w:r>
     </w:p>
     <w:p>
@@ -9227,7 +9253,7 @@
         </w:numPr>
       </w:pPr>
       <w:r>
-        <w:t xml:space="preserve">controlled overrides with reason capture and audit logging</w:t>
+        <w:t xml:space="preserve">elimination support foundations for group reporting</w:t>
       </w:r>
     </w:p>
     <w:p>
@@ -9239,7 +9265,7 @@
         </w:numPr>
       </w:pPr>
       <w:r>
-        <w:t xml:space="preserve">posting and period-lock controls to reduce unauthorised back-dated changes</w:t>
+        <w:t xml:space="preserve">common dimensional design to support entity, branch, department, project, and product-line reporting</w:t>
       </w:r>
     </w:p>
     <w:p>
@@ -9251,17 +9277,17 @@
         </w:numPr>
       </w:pPr>
       <w:r>
-        <w:t xml:space="preserve">exception queues for finance review, escalation, and remediation</w:t>
+        <w:t xml:space="preserve">group pack preparation for board, lender, investor, and statutory reporting</w:t>
       </w:r>
     </w:p>
     <w:bookmarkEnd w:id="98"/>
-    <w:bookmarkStart w:id="99" w:name="X963125afec8492fd01bf9b1358ab11d7e7cf0e2"/>
+    <w:bookmarkStart w:id="99" w:name="X1f4ff391e5add7e26faf81aa846ee5581848876"/>
     <w:p>
       <w:pPr>
         <w:pStyle w:val="Heading3"/>
       </w:pPr>
       <w:r>
-        <w:t xml:space="preserve">5. Reporting Foundations</w:t>
+        <w:t xml:space="preserve">4. Finance Controls, Workflow, and Approvals</w:t>
       </w:r>
     </w:p>
     <w:p>
@@ -9269,7 +9295,7 @@
         <w:pStyle w:val="FirstParagraph"/>
       </w:pPr>
       <w:r>
-        <w:t xml:space="preserve">Longhorn ERP must make finance reporting trustworthy, timely, and reusable. Reporting foundations should support daily operational finance use as well as formal management and statutory reporting.</w:t>
+        <w:t xml:space="preserve">Longhorn ERP must make control design a product capability, not a consulting afterthought. African organisations often operate in environments where fraud resistance, policy compliance, and delegated authority discipline materially affect survival and growth.</w:t>
       </w:r>
     </w:p>
     <w:p>
@@ -9289,7 +9315,7 @@
         </w:numPr>
       </w:pPr>
       <w:r>
-        <w:t xml:space="preserve">trial balance, ledger, and subledger reporting that reconciles cleanly</w:t>
+        <w:t xml:space="preserve">maker-checker workflows for sensitive finance actions</w:t>
       </w:r>
     </w:p>
     <w:p>
@@ -9301,7 +9327,7 @@
         </w:numPr>
       </w:pPr>
       <w:r>
-        <w:t xml:space="preserve">board-ready management packs built from governed finance data</w:t>
+        <w:t xml:space="preserve">configurable approval thresholds by transaction type, amount, entity, and role</w:t>
       </w:r>
     </w:p>
     <w:p>
@@ -9313,7 +9339,7 @@
         </w:numPr>
       </w:pPr>
       <w:r>
-        <w:t xml:space="preserve">statutory statements and tax-supporting schedules</w:t>
+        <w:t xml:space="preserve">segregation-of-duties-aware workflow design</w:t>
       </w:r>
     </w:p>
     <w:p>
@@ -9325,7 +9351,7 @@
         </w:numPr>
       </w:pPr>
       <w:r>
-        <w:t xml:space="preserve">cash, working-capital, margin, and cost analytics foundations</w:t>
+        <w:t xml:space="preserve">controlled overrides with reason capture and audit logging</w:t>
       </w:r>
     </w:p>
     <w:p>
@@ -9337,7 +9363,7 @@
         </w:numPr>
       </w:pPr>
       <w:r>
-        <w:t xml:space="preserve">dimensional reporting for branches, cost centres, projects, products, and channels</w:t>
+        <w:t xml:space="preserve">posting and period-lock controls to reduce unauthorised back-dated changes</w:t>
       </w:r>
     </w:p>
     <w:p>
@@ -9349,18 +9375,17 @@
         </w:numPr>
       </w:pPr>
       <w:r>
-        <w:t xml:space="preserve">export and integration readiness for BI, audit, and external reporting workflows</w:t>
+        <w:t xml:space="preserve">exception queues for finance review, escalation, and remediation</w:t>
       </w:r>
     </w:p>
     <w:bookmarkEnd w:id="99"/>
-    <w:bookmarkEnd w:id="100"/>
-    <w:bookmarkStart w:id="101" w:name="strategic-implication-for-longhorn-erp"/>
-    <w:p>
-      <w:pPr>
-        <w:pStyle w:val="Heading2"/>
-      </w:pPr>
-      <w:r>
-        <w:t xml:space="preserve">Strategic Implication for Longhorn ERP</w:t>
+    <w:bookmarkStart w:id="100" w:name="X963125afec8492fd01bf9b1358ab11d7e7cf0e2"/>
+    <w:p>
+      <w:pPr>
+        <w:pStyle w:val="Heading3"/>
+      </w:pPr>
+      <w:r>
+        <w:t xml:space="preserve">5. Reporting Foundations</w:t>
       </w:r>
     </w:p>
     <w:p>
@@ -9368,7 +9393,15 @@
         <w:pStyle w:val="FirstParagraph"/>
       </w:pPr>
       <w:r>
-        <w:t xml:space="preserve">This finance positioning strengthens Longhorn ERP's credibility across African markets because it matches the real maturity path of ambitious organisations:</w:t>
+        <w:t xml:space="preserve">Longhorn ERP must make finance reporting trustworthy, timely, and reusable. Reporting foundations should support daily operational finance use as well as formal management and statutory reporting.</w:t>
+      </w:r>
+    </w:p>
+    <w:p>
+      <w:pPr>
+        <w:pStyle w:val="BodyText"/>
+      </w:pPr>
+      <w:r>
+        <w:t xml:space="preserve">Core expectations include:</w:t>
       </w:r>
     </w:p>
     <w:p>
@@ -9380,7 +9413,7 @@
         </w:numPr>
       </w:pPr>
       <w:r>
-        <w:t xml:space="preserve">they start by needing reliable books</w:t>
+        <w:t xml:space="preserve">trial balance, ledger, and subledger reporting that reconciles cleanly</w:t>
       </w:r>
     </w:p>
     <w:p>
@@ -9392,7 +9425,7 @@
         </w:numPr>
       </w:pPr>
       <w:r>
-        <w:t xml:space="preserve">they then need faster close and better controls</w:t>
+        <w:t xml:space="preserve">board-ready management packs built from governed finance data</w:t>
       </w:r>
     </w:p>
     <w:p>
@@ -9404,7 +9437,54 @@
         </w:numPr>
       </w:pPr>
       <w:r>
-        <w:t xml:space="preserve">they later need multi-entity governance, stronger reporting, and investor-grade finance discipline</w:t>
+        <w:t xml:space="preserve">statutory statements and tax-supporting schedules</w:t>
+      </w:r>
+    </w:p>
+    <w:p>
+      <w:pPr>
+        <w:pStyle w:val="Compact"/>
+        <w:numPr>
+          <w:ilvl w:val="0"/>
+          <w:numId w:val="1019"/>
+        </w:numPr>
+      </w:pPr>
+      <w:r>
+        <w:t xml:space="preserve">cash, working-capital, margin, and cost analytics foundations</w:t>
+      </w:r>
+    </w:p>
+    <w:p>
+      <w:pPr>
+        <w:pStyle w:val="Compact"/>
+        <w:numPr>
+          <w:ilvl w:val="0"/>
+          <w:numId w:val="1019"/>
+        </w:numPr>
+      </w:pPr>
+      <w:r>
+        <w:t xml:space="preserve">dimensional reporting for branches, cost centres, projects, products, and channels</w:t>
+      </w:r>
+    </w:p>
+    <w:p>
+      <w:pPr>
+        <w:pStyle w:val="Compact"/>
+        <w:numPr>
+          <w:ilvl w:val="0"/>
+          <w:numId w:val="1019"/>
+        </w:numPr>
+      </w:pPr>
+      <w:r>
+        <w:t xml:space="preserve">export and integration readiness for BI, audit, and external reporting workflows</w:t>
+      </w:r>
+    </w:p>
+    <w:bookmarkEnd w:id="100"/>
+    <w:bookmarkEnd w:id="101"/>
+    <w:bookmarkStart w:id="102" w:name="strategic-implication-for-longhorn-erp"/>
+    <w:p>
+      <w:pPr>
+        <w:pStyle w:val="Heading2"/>
+      </w:pPr>
+      <w:r>
+        <w:t xml:space="preserve">Strategic Implication for Longhorn ERP</w:t>
       </w:r>
     </w:p>
     <w:p>
@@ -9412,84 +9492,7 @@
         <w:pStyle w:val="FirstParagraph"/>
       </w:pPr>
       <w:r>
-        <w:t xml:space="preserve">Longhorn ERP should meet that journey on one coherent finance architecture. The strategic standard is therefore clear:</w:t>
-      </w:r>
-      <w:r>
-        <w:t xml:space="preserve"> </w:t>
-      </w:r>
-      <w:r>
-        <w:rPr>
-          <w:rStyle w:val="VerbatimChar"/>
-        </w:rPr>
-        <w:t xml:space="preserve">ACCOUNTING</w:t>
-      </w:r>
-      <w:r>
-        <w:t xml:space="preserve"> </w:t>
-      </w:r>
-      <w:r>
-        <w:t xml:space="preserve">remains the core module, but it must operate at a level that can credibly support controller, CFO, auditor, and board expectations.</w:t>
-      </w:r>
-    </w:p>
-    <w:bookmarkEnd w:id="101"/>
-    <w:bookmarkEnd w:id="102"/>
-    <w:bookmarkStart w:id="110" w:name="Xc44d29bef89c4c8e3916317b504a4557aafdeb6"/>
-    <w:p>
-      <w:pPr>
-        <w:pStyle w:val="Heading1"/>
-      </w:pPr>
-      <w:r>
-        <w:t xml:space="preserve">13. Treasury, Capital, and Group Finance</w:t>
-      </w:r>
-    </w:p>
-    <w:bookmarkStart w:id="103" w:name="X41570d66f4a055e742c23a6d74e744e64363043"/>
-    <w:p>
-      <w:pPr>
-        <w:pStyle w:val="Heading2"/>
-      </w:pPr>
-      <w:r>
-        <w:t xml:space="preserve">13.1 Strategic Intent</w:t>
-      </w:r>
-    </w:p>
-    <w:p>
-      <w:pPr>
-        <w:pStyle w:val="FirstParagraph"/>
-      </w:pPr>
-      <w:r>
-        <w:t xml:space="preserve">LonghornERP finance must extend beyond core bookkeeping into disciplined cash, capital, and group-finance control. The platform should serve as the transactional core of record for finance operations while also providing the governance, evidence, and reporting layer needed by organizations that are scaling from single-entity operations into multi-bank, multi-asset, and multi-entity groups.</w:t>
-      </w:r>
-    </w:p>
-    <w:p>
-      <w:pPr>
-        <w:pStyle w:val="BodyText"/>
-      </w:pPr>
-      <w:r>
-        <w:t xml:space="preserve">This positioning is critical for African businesses that operate across multiple legal entities, currencies, banks, tax regimes, and operating environments. LonghornERP should help them move from founder-led cash management and spreadsheet close processes to controlled, auditable, and repeatable finance operations.</w:t>
-      </w:r>
-    </w:p>
-    <w:bookmarkEnd w:id="103"/>
-    <w:bookmarkStart w:id="104" w:name="Xa3b2207f5037ea25b5255ec8396b6e6585330c4"/>
-    <w:p>
-      <w:pPr>
-        <w:pStyle w:val="Heading2"/>
-      </w:pPr>
-      <w:r>
-        <w:t xml:space="preserve">13.2 Treasury and Bank Control Positioning</w:t>
-      </w:r>
-    </w:p>
-    <w:p>
-      <w:pPr>
-        <w:pStyle w:val="FirstParagraph"/>
-      </w:pPr>
-      <w:r>
-        <w:t xml:space="preserve">LonghornERP shall position treasury as a first-class finance capability focused on cash visibility, payment governance, and bank-operating discipline.</w:t>
-      </w:r>
-    </w:p>
-    <w:p>
-      <w:pPr>
-        <w:pStyle w:val="BodyText"/>
-      </w:pPr>
-      <w:r>
-        <w:t xml:space="preserve">The treasury posture for LonghornERP includes:</w:t>
+        <w:t xml:space="preserve">This finance positioning strengthens Longhorn ERP's credibility across African markets because it matches the real maturity path of ambitious organisations:</w:t>
       </w:r>
     </w:p>
     <w:p>
@@ -9501,7 +9504,7 @@
         </w:numPr>
       </w:pPr>
       <w:r>
-        <w:t xml:space="preserve">centralized bank account registry and signer governance</w:t>
+        <w:t xml:space="preserve">they start by needing reliable books</w:t>
       </w:r>
     </w:p>
     <w:p>
@@ -9513,7 +9516,7 @@
         </w:numPr>
       </w:pPr>
       <w:r>
-        <w:t xml:space="preserve">cash-position visibility by bank, entity, currency, and value date</w:t>
+        <w:t xml:space="preserve">they then need faster close and better controls</w:t>
       </w:r>
     </w:p>
     <w:p>
@@ -9525,55 +9528,7 @@
         </w:numPr>
       </w:pPr>
       <w:r>
-        <w:t xml:space="preserve">payment-request, approval, release, and confirmation controls</w:t>
-      </w:r>
-    </w:p>
-    <w:p>
-      <w:pPr>
-        <w:pStyle w:val="Compact"/>
-        <w:numPr>
-          <w:ilvl w:val="0"/>
-          <w:numId w:val="1020"/>
-        </w:numPr>
-      </w:pPr>
-      <w:r>
-        <w:t xml:space="preserve">bank connectivity foundations for statement ingestion, reconciliation, and payment-status feedback</w:t>
-      </w:r>
-    </w:p>
-    <w:p>
-      <w:pPr>
-        <w:pStyle w:val="Compact"/>
-        <w:numPr>
-          <w:ilvl w:val="0"/>
-          <w:numId w:val="1020"/>
-        </w:numPr>
-      </w:pPr>
-      <w:r>
-        <w:t xml:space="preserve">segregation of duties across payment preparation, approval, release, and posting</w:t>
-      </w:r>
-    </w:p>
-    <w:p>
-      <w:pPr>
-        <w:pStyle w:val="Compact"/>
-        <w:numPr>
-          <w:ilvl w:val="0"/>
-          <w:numId w:val="1020"/>
-        </w:numPr>
-      </w:pPr>
-      <w:r>
-        <w:t xml:space="preserve">support for bank fees, charges, reversals, rejects, and exception handling</w:t>
-      </w:r>
-    </w:p>
-    <w:p>
-      <w:pPr>
-        <w:pStyle w:val="Compact"/>
-        <w:numPr>
-          <w:ilvl w:val="0"/>
-          <w:numId w:val="1020"/>
-        </w:numPr>
-      </w:pPr>
-      <w:r>
-        <w:t xml:space="preserve">treasury audit evidence for who initiated, approved, transmitted, and confirmed each payment</w:t>
+        <w:t xml:space="preserve">they later need multi-entity governance, stronger reporting, and investor-grade finance discipline</w:t>
       </w:r>
     </w:p>
     <w:p>
@@ -9581,17 +9536,68 @@
         <w:pStyle w:val="FirstParagraph"/>
       </w:pPr>
       <w:r>
-        <w:t xml:space="preserve">LonghornERP should be the operational control layer for payment governance even where specialized treasury connectivity or enterprise payment hubs are used. Where a client requires advanced cash forecasting, in-country connectivity adapters, dealing, hedging, or complex liquidity structures, LonghornERP should define explicit integration boundaries with best-of-breed treasury systems rather than attempting to absorb every treasury-specialist workflow into the ERP core.</w:t>
+        <w:t xml:space="preserve">Longhorn ERP should meet that journey on one coherent finance architecture. The strategic standard is therefore clear:</w:t>
+      </w:r>
+      <w:r>
+        <w:t xml:space="preserve"> </w:t>
+      </w:r>
+      <w:r>
+        <w:rPr>
+          <w:rStyle w:val="VerbatimChar"/>
+        </w:rPr>
+        <w:t xml:space="preserve">ACCOUNTING</w:t>
+      </w:r>
+      <w:r>
+        <w:t xml:space="preserve"> </w:t>
+      </w:r>
+      <w:r>
+        <w:t xml:space="preserve">remains the core module, but it must operate at a level that can credibly support controller, CFO, auditor, and board expectations.</w:t>
+      </w:r>
+    </w:p>
+    <w:bookmarkEnd w:id="102"/>
+    <w:bookmarkEnd w:id="103"/>
+    <w:bookmarkStart w:id="111" w:name="Xc44d29bef89c4c8e3916317b504a4557aafdeb6"/>
+    <w:p>
+      <w:pPr>
+        <w:pStyle w:val="Heading1"/>
+      </w:pPr>
+      <w:r>
+        <w:t xml:space="preserve">13. Treasury, Capital, and Group Finance</w:t>
+      </w:r>
+    </w:p>
+    <w:bookmarkStart w:id="104" w:name="X41570d66f4a055e742c23a6d74e744e64363043"/>
+    <w:p>
+      <w:pPr>
+        <w:pStyle w:val="Heading2"/>
+      </w:pPr>
+      <w:r>
+        <w:t xml:space="preserve">13.1 Strategic Intent</w:t>
+      </w:r>
+    </w:p>
+    <w:p>
+      <w:pPr>
+        <w:pStyle w:val="FirstParagraph"/>
+      </w:pPr>
+      <w:r>
+        <w:t xml:space="preserve">LonghornERP finance must extend beyond core bookkeeping into disciplined cash, capital, and group-finance control. The platform should serve as the transactional core of record for finance operations while also providing the governance, evidence, and reporting layer needed by organizations that are scaling from single-entity operations into multi-bank, multi-asset, and multi-entity groups.</w:t>
+      </w:r>
+    </w:p>
+    <w:p>
+      <w:pPr>
+        <w:pStyle w:val="BodyText"/>
+      </w:pPr>
+      <w:r>
+        <w:t xml:space="preserve">This positioning is critical for African businesses that operate across multiple legal entities, currencies, banks, tax regimes, and operating environments. LonghornERP should help them move from founder-led cash management and spreadsheet close processes to controlled, auditable, and repeatable finance operations.</w:t>
       </w:r>
     </w:p>
     <w:bookmarkEnd w:id="104"/>
-    <w:bookmarkStart w:id="105" w:name="Xd97be0bbe6ff56e6503dbe02796602c32bd52a5"/>
+    <w:bookmarkStart w:id="105" w:name="Xa3b2207f5037ea25b5255ec8396b6e6585330c4"/>
     <w:p>
       <w:pPr>
         <w:pStyle w:val="Heading2"/>
       </w:pPr>
       <w:r>
-        <w:t xml:space="preserve">13.3 Capital and Fixed-Asset Accounting Positioning</w:t>
+        <w:t xml:space="preserve">13.2 Treasury and Bank Control Positioning</w:t>
       </w:r>
     </w:p>
     <w:p>
@@ -9599,7 +9605,7 @@
         <w:pStyle w:val="FirstParagraph"/>
       </w:pPr>
       <w:r>
-        <w:t xml:space="preserve">LonghornERP shall position fixed-asset and capital accounting as a disciplined finance capability, not merely a static asset register.</w:t>
+        <w:t xml:space="preserve">LonghornERP shall position treasury as a first-class finance capability focused on cash visibility, payment governance, and bank-operating discipline.</w:t>
       </w:r>
     </w:p>
     <w:p>
@@ -9607,7 +9613,7 @@
         <w:pStyle w:val="BodyText"/>
       </w:pPr>
       <w:r>
-        <w:t xml:space="preserve">The capital-accounting posture for LonghornERP includes:</w:t>
+        <w:t xml:space="preserve">The treasury posture for LonghornERP includes:</w:t>
       </w:r>
     </w:p>
     <w:p>
@@ -9619,7 +9625,7 @@
         </w:numPr>
       </w:pPr>
       <w:r>
-        <w:t xml:space="preserve">acquisition, capitalization, transfer, impairment, revaluation, and disposal accounting</w:t>
+        <w:t xml:space="preserve">centralized bank account registry and signer governance</w:t>
       </w:r>
     </w:p>
     <w:p>
@@ -9631,7 +9637,7 @@
         </w:numPr>
       </w:pPr>
       <w:r>
-        <w:t xml:space="preserve">capitalization project and asset-under-construction support</w:t>
+        <w:t xml:space="preserve">cash-position visibility by bank, entity, currency, and value date</w:t>
       </w:r>
     </w:p>
     <w:p>
@@ -9643,7 +9649,7 @@
         </w:numPr>
       </w:pPr>
       <w:r>
-        <w:t xml:space="preserve">book-versus-tax treatment where local policy or statutory reporting requires separate views</w:t>
+        <w:t xml:space="preserve">payment-request, approval, release, and confirmation controls</w:t>
       </w:r>
     </w:p>
     <w:p>
@@ -9655,7 +9661,7 @@
         </w:numPr>
       </w:pPr>
       <w:r>
-        <w:t xml:space="preserve">depreciation policy management by asset class, entity, and accounting basis</w:t>
+        <w:t xml:space="preserve">bank connectivity foundations for statement ingestion, reconciliation, and payment-status feedback</w:t>
       </w:r>
     </w:p>
     <w:p>
@@ -9667,7 +9673,7 @@
         </w:numPr>
       </w:pPr>
       <w:r>
-        <w:t xml:space="preserve">capitalization controls for threshold policies, approvals, and supporting evidence</w:t>
+        <w:t xml:space="preserve">segregation of duties across payment preparation, approval, release, and posting</w:t>
       </w:r>
     </w:p>
     <w:p>
@@ -9679,7 +9685,7 @@
         </w:numPr>
       </w:pPr>
       <w:r>
-        <w:t xml:space="preserve">maintenance of finance-grade asset history tied to source transactions and approvals</w:t>
+        <w:t xml:space="preserve">support for bank fees, charges, reversals, rejects, and exception handling</w:t>
       </w:r>
     </w:p>
     <w:p>
@@ -9691,7 +9697,7 @@
         </w:numPr>
       </w:pPr>
       <w:r>
-        <w:t xml:space="preserve">alignment between operational asset lifecycle events and accounting consequences</w:t>
+        <w:t xml:space="preserve">treasury audit evidence for who initiated, approved, transmitted, and confirmed each payment</w:t>
       </w:r>
     </w:p>
     <w:p>
@@ -9699,17 +9705,17 @@
         <w:pStyle w:val="FirstParagraph"/>
       </w:pPr>
       <w:r>
-        <w:t xml:space="preserve">LonghornERP should support organizations that need strong capital discipline for factories, fleets, infrastructure, energy assets, property, equipment, and distributed branch operations. The ERP must provide a defensible accounting record for capital spend and asset lifecycle changes, while allowing specialized maintenance, engineering, or asset-performance tools to remain system-of-execution where appropriate.</w:t>
+        <w:t xml:space="preserve">LonghornERP should be the operational control layer for payment governance even where specialized treasury connectivity or enterprise payment hubs are used. Where a client requires advanced cash forecasting, in-country connectivity adapters, dealing, hedging, or complex liquidity structures, LonghornERP should define explicit integration boundaries with best-of-breed treasury systems rather than attempting to absorb every treasury-specialist workflow into the ERP core.</w:t>
       </w:r>
     </w:p>
     <w:bookmarkEnd w:id="105"/>
-    <w:bookmarkStart w:id="106" w:name="X60b06c6b9cfad84e13e817a79a0a4d31db4e5a4"/>
+    <w:bookmarkStart w:id="106" w:name="Xd97be0bbe6ff56e6503dbe02796602c32bd52a5"/>
     <w:p>
       <w:pPr>
         <w:pStyle w:val="Heading2"/>
       </w:pPr>
       <w:r>
-        <w:t xml:space="preserve">13.4 Multi-Entity Group Finance Positioning</w:t>
+        <w:t xml:space="preserve">13.3 Capital and Fixed-Asset Accounting Positioning</w:t>
       </w:r>
     </w:p>
     <w:p>
@@ -9717,7 +9723,7 @@
         <w:pStyle w:val="FirstParagraph"/>
       </w:pPr>
       <w:r>
-        <w:t xml:space="preserve">LonghornERP shall position group finance as a deliberate capability for organizations operating subsidiaries, branches, regional entities, and holding-company structures.</w:t>
+        <w:t xml:space="preserve">LonghornERP shall position fixed-asset and capital accounting as a disciplined finance capability, not merely a static asset register.</w:t>
       </w:r>
     </w:p>
     <w:p>
@@ -9725,7 +9731,7 @@
         <w:pStyle w:val="BodyText"/>
       </w:pPr>
       <w:r>
-        <w:t xml:space="preserve">The group-finance posture for LonghornERP includes:</w:t>
+        <w:t xml:space="preserve">The capital-accounting posture for LonghornERP includes:</w:t>
       </w:r>
     </w:p>
     <w:p>
@@ -9737,7 +9743,7 @@
         </w:numPr>
       </w:pPr>
       <w:r>
-        <w:t xml:space="preserve">shared chart-of-accounts governance with local flexibility where required</w:t>
+        <w:t xml:space="preserve">acquisition, capitalization, transfer, impairment, revaluation, and disposal accounting</w:t>
       </w:r>
     </w:p>
     <w:p>
@@ -9749,7 +9755,7 @@
         </w:numPr>
       </w:pPr>
       <w:r>
-        <w:t xml:space="preserve">intercompany transaction discipline with reciprocal-account structure and mismatch visibility</w:t>
+        <w:t xml:space="preserve">capitalization project and asset-under-construction support</w:t>
       </w:r>
     </w:p>
     <w:p>
@@ -9761,7 +9767,7 @@
         </w:numPr>
       </w:pPr>
       <w:r>
-        <w:t xml:space="preserve">elimination-ready journals and group-adjustment workflows</w:t>
+        <w:t xml:space="preserve">book-versus-tax treatment where local policy or statutory reporting requires separate views</w:t>
       </w:r>
     </w:p>
     <w:p>
@@ -9773,7 +9779,7 @@
         </w:numPr>
       </w:pPr>
       <w:r>
-        <w:t xml:space="preserve">consolidation-ready period structures and entity hierarchies</w:t>
+        <w:t xml:space="preserve">depreciation policy management by asset class, entity, and accounting basis</w:t>
       </w:r>
     </w:p>
     <w:p>
@@ -9785,7 +9791,7 @@
         </w:numPr>
       </w:pPr>
       <w:r>
-        <w:t xml:space="preserve">support for management and statutory reporting across entity and group views</w:t>
+        <w:t xml:space="preserve">capitalization controls for threshold policies, approvals, and supporting evidence</w:t>
       </w:r>
     </w:p>
     <w:p>
@@ -9797,7 +9803,19 @@
         </w:numPr>
       </w:pPr>
       <w:r>
-        <w:t xml:space="preserve">traceable movement from transactional postings to entity trial balances, consolidation inputs, eliminations, and certified outputs</w:t>
+        <w:t xml:space="preserve">maintenance of finance-grade asset history tied to source transactions and approvals</w:t>
+      </w:r>
+    </w:p>
+    <w:p>
+      <w:pPr>
+        <w:pStyle w:val="Compact"/>
+        <w:numPr>
+          <w:ilvl w:val="0"/>
+          <w:numId w:val="1022"/>
+        </w:numPr>
+      </w:pPr>
+      <w:r>
+        <w:t xml:space="preserve">alignment between operational asset lifecycle events and accounting consequences</w:t>
       </w:r>
     </w:p>
     <w:p>
@@ -9805,17 +9823,17 @@
         <w:pStyle w:val="FirstParagraph"/>
       </w:pPr>
       <w:r>
-        <w:t xml:space="preserve">LonghornERP should provide strong multi-entity foundations inside the ERP. Where a customer requires highly complex external consolidation tooling, advanced disclosure management, or listed-company reporting workflows, LonghornERP should integrate cleanly with best-of-breed consolidation and reporting platforms while remaining the trusted source of operational finance data and close evidence.</w:t>
+        <w:t xml:space="preserve">LonghornERP should support organizations that need strong capital discipline for factories, fleets, infrastructure, energy assets, property, equipment, and distributed branch operations. The ERP must provide a defensible accounting record for capital spend and asset lifecycle changes, while allowing specialized maintenance, engineering, or asset-performance tools to remain system-of-execution where appropriate.</w:t>
       </w:r>
     </w:p>
     <w:bookmarkEnd w:id="106"/>
-    <w:bookmarkStart w:id="107" w:name="X067fcae43ee13f4eb617da34e54d0c32eb4b7a1"/>
+    <w:bookmarkStart w:id="107" w:name="X60b06c6b9cfad84e13e817a79a0a4d31db4e5a4"/>
     <w:p>
       <w:pPr>
         <w:pStyle w:val="Heading2"/>
       </w:pPr>
       <w:r>
-        <w:t xml:space="preserve">13.5 Results, Governance, and First-Close Discipline</w:t>
+        <w:t xml:space="preserve">13.4 Multi-Entity Group Finance Positioning</w:t>
       </w:r>
     </w:p>
     <w:p>
@@ -9823,7 +9841,7 @@
         <w:pStyle w:val="FirstParagraph"/>
       </w:pPr>
       <w:r>
-        <w:t xml:space="preserve">LonghornERP shall treat finance not only as a transaction-processing domain but also as a results and governance discipline.</w:t>
+        <w:t xml:space="preserve">LonghornERP shall position group finance as a deliberate capability for organizations operating subsidiaries, branches, regional entities, and holding-company structures.</w:t>
       </w:r>
     </w:p>
     <w:p>
@@ -9831,7 +9849,7 @@
         <w:pStyle w:val="BodyText"/>
       </w:pPr>
       <w:r>
-        <w:t xml:space="preserve">This means the product should support:</w:t>
+        <w:t xml:space="preserve">The group-finance posture for LonghornERP includes:</w:t>
       </w:r>
     </w:p>
     <w:p>
@@ -9843,7 +9861,7 @@
         </w:numPr>
       </w:pPr>
       <w:r>
-        <w:t xml:space="preserve">first-close discipline through governed close checklists, ownership, deadlines, blockers, and evidence</w:t>
+        <w:t xml:space="preserve">shared chart-of-accounts governance with local flexibility where required</w:t>
       </w:r>
     </w:p>
     <w:p>
@@ -9855,7 +9873,7 @@
         </w:numPr>
       </w:pPr>
       <w:r>
-        <w:t xml:space="preserve">certified reporting processes with controlled reporting packs and reproducible close outputs</w:t>
+        <w:t xml:space="preserve">intercompany transaction discipline with reciprocal-account structure and mismatch visibility</w:t>
       </w:r>
     </w:p>
     <w:p>
@@ -9867,7 +9885,7 @@
         </w:numPr>
       </w:pPr>
       <w:r>
-        <w:t xml:space="preserve">journal governance with maker-checker controls, approval thresholds, and audit trails</w:t>
+        <w:t xml:space="preserve">elimination-ready journals and group-adjustment workflows</w:t>
       </w:r>
     </w:p>
     <w:p>
@@ -9879,7 +9897,7 @@
         </w:numPr>
       </w:pPr>
       <w:r>
-        <w:t xml:space="preserve">policy-backed finance operations where every sensitive workflow leaves structured evidence</w:t>
+        <w:t xml:space="preserve">consolidation-ready period structures and entity hierarchies</w:t>
       </w:r>
     </w:p>
     <w:p>
@@ -9891,7 +9909,19 @@
         </w:numPr>
       </w:pPr>
       <w:r>
-        <w:t xml:space="preserve">management visibility into close status, control exceptions, unresolved reconciliations, and reporting readiness</w:t>
+        <w:t xml:space="preserve">support for management and statutory reporting across entity and group views</w:t>
+      </w:r>
+    </w:p>
+    <w:p>
+      <w:pPr>
+        <w:pStyle w:val="Compact"/>
+        <w:numPr>
+          <w:ilvl w:val="0"/>
+          <w:numId w:val="1023"/>
+        </w:numPr>
+      </w:pPr>
+      <w:r>
+        <w:t xml:space="preserve">traceable movement from transactional postings to entity trial balances, consolidation inputs, eliminations, and certified outputs</w:t>
       </w:r>
     </w:p>
     <w:p>
@@ -9899,7 +9929,33 @@
         <w:pStyle w:val="FirstParagraph"/>
       </w:pPr>
       <w:r>
-        <w:t xml:space="preserve">The intended product outcome is that finance leaders can rely on LonghornERP to answer two questions with confidence:</w:t>
+        <w:t xml:space="preserve">LonghornERP should provide strong multi-entity foundations inside the ERP. Where a customer requires highly complex external consolidation tooling, advanced disclosure management, or listed-company reporting workflows, LonghornERP should integrate cleanly with best-of-breed consolidation and reporting platforms while remaining the trusted source of operational finance data and close evidence.</w:t>
+      </w:r>
+    </w:p>
+    <w:bookmarkEnd w:id="107"/>
+    <w:bookmarkStart w:id="108" w:name="X067fcae43ee13f4eb617da34e54d0c32eb4b7a1"/>
+    <w:p>
+      <w:pPr>
+        <w:pStyle w:val="Heading2"/>
+      </w:pPr>
+      <w:r>
+        <w:t xml:space="preserve">13.5 Results, Governance, and First-Close Discipline</w:t>
+      </w:r>
+    </w:p>
+    <w:p>
+      <w:pPr>
+        <w:pStyle w:val="FirstParagraph"/>
+      </w:pPr>
+      <w:r>
+        <w:t xml:space="preserve">LonghornERP shall treat finance not only as a transaction-processing domain but also as a results and governance discipline.</w:t>
+      </w:r>
+    </w:p>
+    <w:p>
+      <w:pPr>
+        <w:pStyle w:val="BodyText"/>
+      </w:pPr>
+      <w:r>
+        <w:t xml:space="preserve">This means the product should support:</w:t>
       </w:r>
     </w:p>
     <w:p>
@@ -9911,7 +9967,7 @@
         </w:numPr>
       </w:pPr>
       <w:r>
-        <w:t xml:space="preserve">What happened financially?</w:t>
+        <w:t xml:space="preserve">first-close discipline through governed close checklists, ownership, deadlines, blockers, and evidence</w:t>
       </w:r>
     </w:p>
     <w:p>
@@ -9923,17 +9979,43 @@
         </w:numPr>
       </w:pPr>
       <w:r>
-        <w:t xml:space="preserve">Was it processed, approved, and reported under controlled conditions?</w:t>
-      </w:r>
-    </w:p>
-    <w:bookmarkEnd w:id="107"/>
-    <w:bookmarkStart w:id="108" w:name="Xa37c5c7cb94516b5cc1a1fe4710605b39547c53"/>
-    <w:p>
-      <w:pPr>
-        <w:pStyle w:val="Heading2"/>
-      </w:pPr>
-      <w:r>
-        <w:t xml:space="preserve">13.6 Product Boundary Principles</w:t>
+        <w:t xml:space="preserve">certified reporting processes with controlled reporting packs and reproducible close outputs</w:t>
+      </w:r>
+    </w:p>
+    <w:p>
+      <w:pPr>
+        <w:pStyle w:val="Compact"/>
+        <w:numPr>
+          <w:ilvl w:val="0"/>
+          <w:numId w:val="1024"/>
+        </w:numPr>
+      </w:pPr>
+      <w:r>
+        <w:t xml:space="preserve">journal governance with maker-checker controls, approval thresholds, and audit trails</w:t>
+      </w:r>
+    </w:p>
+    <w:p>
+      <w:pPr>
+        <w:pStyle w:val="Compact"/>
+        <w:numPr>
+          <w:ilvl w:val="0"/>
+          <w:numId w:val="1024"/>
+        </w:numPr>
+      </w:pPr>
+      <w:r>
+        <w:t xml:space="preserve">policy-backed finance operations where every sensitive workflow leaves structured evidence</w:t>
+      </w:r>
+    </w:p>
+    <w:p>
+      <w:pPr>
+        <w:pStyle w:val="Compact"/>
+        <w:numPr>
+          <w:ilvl w:val="0"/>
+          <w:numId w:val="1024"/>
+        </w:numPr>
+      </w:pPr>
+      <w:r>
+        <w:t xml:space="preserve">management visibility into close status, control exceptions, unresolved reconciliations, and reporting readiness</w:t>
       </w:r>
     </w:p>
     <w:p>
@@ -9941,15 +10023,7 @@
         <w:pStyle w:val="FirstParagraph"/>
       </w:pPr>
       <w:r>
-        <w:t xml:space="preserve">LonghornERP should be strong enough to run the finance core for SMEs, mid-market groups, and control-conscious enterprises, but it should remain disciplined about product boundaries.</w:t>
-      </w:r>
-    </w:p>
-    <w:p>
-      <w:pPr>
-        <w:pStyle w:val="BodyText"/>
-      </w:pPr>
-      <w:r>
-        <w:t xml:space="preserve">LonghornERP should own:</w:t>
+        <w:t xml:space="preserve">The intended product outcome is that finance leaders can rely on LonghornERP to answer two questions with confidence:</w:t>
       </w:r>
     </w:p>
     <w:p>
@@ -9961,7 +10035,7 @@
         </w:numPr>
       </w:pPr>
       <w:r>
-        <w:t xml:space="preserve">operational transaction capture</w:t>
+        <w:t xml:space="preserve">What happened financially?</w:t>
       </w:r>
     </w:p>
     <w:p>
@@ -9973,79 +10047,17 @@
         </w:numPr>
       </w:pPr>
       <w:r>
-        <w:t xml:space="preserve">subledger and general-ledger control</w:t>
-      </w:r>
-    </w:p>
-    <w:p>
-      <w:pPr>
-        <w:pStyle w:val="Compact"/>
-        <w:numPr>
-          <w:ilvl w:val="0"/>
-          <w:numId w:val="1025"/>
-        </w:numPr>
-      </w:pPr>
-      <w:r>
-        <w:t xml:space="preserve">reconciliations and period close</w:t>
-      </w:r>
-    </w:p>
-    <w:p>
-      <w:pPr>
-        <w:pStyle w:val="Compact"/>
-        <w:numPr>
-          <w:ilvl w:val="0"/>
-          <w:numId w:val="1025"/>
-        </w:numPr>
-      </w:pPr>
-      <w:r>
-        <w:t xml:space="preserve">payment governance and bank-operating controls</w:t>
-      </w:r>
-    </w:p>
-    <w:p>
-      <w:pPr>
-        <w:pStyle w:val="Compact"/>
-        <w:numPr>
-          <w:ilvl w:val="0"/>
-          <w:numId w:val="1025"/>
-        </w:numPr>
-      </w:pPr>
-      <w:r>
-        <w:t xml:space="preserve">fixed-asset and capital-accounting discipline</w:t>
-      </w:r>
-    </w:p>
-    <w:p>
-      <w:pPr>
-        <w:pStyle w:val="Compact"/>
-        <w:numPr>
-          <w:ilvl w:val="0"/>
-          <w:numId w:val="1025"/>
-        </w:numPr>
-      </w:pPr>
-      <w:r>
-        <w:t xml:space="preserve">intercompany and elimination-ready finance structure</w:t>
-      </w:r>
-    </w:p>
-    <w:p>
-      <w:pPr>
-        <w:pStyle w:val="Compact"/>
-        <w:numPr>
-          <w:ilvl w:val="0"/>
-          <w:numId w:val="1025"/>
-        </w:numPr>
-      </w:pPr>
-      <w:r>
-        <w:t xml:space="preserve">management and statutory reporting foundations</w:t>
-      </w:r>
-    </w:p>
-    <w:p>
-      <w:pPr>
-        <w:pStyle w:val="Compact"/>
-        <w:numPr>
-          <w:ilvl w:val="0"/>
-          <w:numId w:val="1025"/>
-        </w:numPr>
-      </w:pPr>
-      <w:r>
-        <w:t xml:space="preserve">finance workflow evidence and auditability</w:t>
+        <w:t xml:space="preserve">Was it processed, approved, and reported under controlled conditions?</w:t>
+      </w:r>
+    </w:p>
+    <w:bookmarkEnd w:id="108"/>
+    <w:bookmarkStart w:id="109" w:name="Xa37c5c7cb94516b5cc1a1fe4710605b39547c53"/>
+    <w:p>
+      <w:pPr>
+        <w:pStyle w:val="Heading2"/>
+      </w:pPr>
+      <w:r>
+        <w:t xml:space="preserve">13.6 Product Boundary Principles</w:t>
       </w:r>
     </w:p>
     <w:p>
@@ -10053,7 +10065,15 @@
         <w:pStyle w:val="FirstParagraph"/>
       </w:pPr>
       <w:r>
-        <w:t xml:space="preserve">LonghornERP should integrate rather than overextend where clients require:</w:t>
+        <w:t xml:space="preserve">LonghornERP should be strong enough to run the finance core for SMEs, mid-market groups, and control-conscious enterprises, but it should remain disciplined about product boundaries.</w:t>
+      </w:r>
+    </w:p>
+    <w:p>
+      <w:pPr>
+        <w:pStyle w:val="BodyText"/>
+      </w:pPr>
+      <w:r>
+        <w:t xml:space="preserve">LonghornERP should own:</w:t>
       </w:r>
     </w:p>
     <w:p>
@@ -10065,7 +10085,7 @@
         </w:numPr>
       </w:pPr>
       <w:r>
-        <w:t xml:space="preserve">advanced treasury dealing and liquidity optimization</w:t>
+        <w:t xml:space="preserve">operational transaction capture</w:t>
       </w:r>
     </w:p>
     <w:p>
@@ -10077,7 +10097,7 @@
         </w:numPr>
       </w:pPr>
       <w:r>
-        <w:t xml:space="preserve">highly specialized bank connectivity networks</w:t>
+        <w:t xml:space="preserve">subledger and general-ledger control</w:t>
       </w:r>
     </w:p>
     <w:p>
@@ -10089,7 +10109,7 @@
         </w:numPr>
       </w:pPr>
       <w:r>
-        <w:t xml:space="preserve">complex listed-company consolidation and external disclosure tooling</w:t>
+        <w:t xml:space="preserve">reconciliations and period close</w:t>
       </w:r>
     </w:p>
     <w:p>
@@ -10101,11 +10121,115 @@
         </w:numPr>
       </w:pPr>
       <w:r>
+        <w:t xml:space="preserve">payment governance and bank-operating controls</w:t>
+      </w:r>
+    </w:p>
+    <w:p>
+      <w:pPr>
+        <w:pStyle w:val="Compact"/>
+        <w:numPr>
+          <w:ilvl w:val="0"/>
+          <w:numId w:val="1026"/>
+        </w:numPr>
+      </w:pPr>
+      <w:r>
+        <w:t xml:space="preserve">fixed-asset and capital-accounting discipline</w:t>
+      </w:r>
+    </w:p>
+    <w:p>
+      <w:pPr>
+        <w:pStyle w:val="Compact"/>
+        <w:numPr>
+          <w:ilvl w:val="0"/>
+          <w:numId w:val="1026"/>
+        </w:numPr>
+      </w:pPr>
+      <w:r>
+        <w:t xml:space="preserve">intercompany and elimination-ready finance structure</w:t>
+      </w:r>
+    </w:p>
+    <w:p>
+      <w:pPr>
+        <w:pStyle w:val="Compact"/>
+        <w:numPr>
+          <w:ilvl w:val="0"/>
+          <w:numId w:val="1026"/>
+        </w:numPr>
+      </w:pPr>
+      <w:r>
+        <w:t xml:space="preserve">management and statutory reporting foundations</w:t>
+      </w:r>
+    </w:p>
+    <w:p>
+      <w:pPr>
+        <w:pStyle w:val="Compact"/>
+        <w:numPr>
+          <w:ilvl w:val="0"/>
+          <w:numId w:val="1026"/>
+        </w:numPr>
+      </w:pPr>
+      <w:r>
+        <w:t xml:space="preserve">finance workflow evidence and auditability</w:t>
+      </w:r>
+    </w:p>
+    <w:p>
+      <w:pPr>
+        <w:pStyle w:val="FirstParagraph"/>
+      </w:pPr>
+      <w:r>
+        <w:t xml:space="preserve">LonghornERP should integrate rather than overextend where clients require:</w:t>
+      </w:r>
+    </w:p>
+    <w:p>
+      <w:pPr>
+        <w:pStyle w:val="Compact"/>
+        <w:numPr>
+          <w:ilvl w:val="0"/>
+          <w:numId w:val="1027"/>
+        </w:numPr>
+      </w:pPr>
+      <w:r>
+        <w:t xml:space="preserve">advanced treasury dealing and liquidity optimization</w:t>
+      </w:r>
+    </w:p>
+    <w:p>
+      <w:pPr>
+        <w:pStyle w:val="Compact"/>
+        <w:numPr>
+          <w:ilvl w:val="0"/>
+          <w:numId w:val="1027"/>
+        </w:numPr>
+      </w:pPr>
+      <w:r>
+        <w:t xml:space="preserve">highly specialized bank connectivity networks</w:t>
+      </w:r>
+    </w:p>
+    <w:p>
+      <w:pPr>
+        <w:pStyle w:val="Compact"/>
+        <w:numPr>
+          <w:ilvl w:val="0"/>
+          <w:numId w:val="1027"/>
+        </w:numPr>
+      </w:pPr>
+      <w:r>
+        <w:t xml:space="preserve">complex listed-company consolidation and external disclosure tooling</w:t>
+      </w:r>
+    </w:p>
+    <w:p>
+      <w:pPr>
+        <w:pStyle w:val="Compact"/>
+        <w:numPr>
+          <w:ilvl w:val="0"/>
+          <w:numId w:val="1027"/>
+        </w:numPr>
+      </w:pPr>
+      <w:r>
         <w:t xml:space="preserve">niche local compliance engines beyond the ERP core</w:t>
       </w:r>
     </w:p>
-    <w:bookmarkEnd w:id="108"/>
-    <w:bookmarkStart w:id="109" w:name="Xc15918a0dbcfecc839acab8bb3363b8365b9200"/>
+    <w:bookmarkEnd w:id="109"/>
+    <w:bookmarkStart w:id="110" w:name="Xc15918a0dbcfecc839acab8bb3363b8365b9200"/>
     <w:p>
       <w:pPr>
         <w:pStyle w:val="Heading2"/>
@@ -10122,8 +10246,835 @@
         <w:t xml:space="preserve">This positioning makes LonghornERP suitable for organizations that need more than accounting software but do not want fragmented finance operations. It establishes LonghornERP as a finance platform that can grow from single-entity operational accounting into controlled treasury operations, disciplined capital accounting, and multi-entity group finance without losing clarity of ownership between ERP core capabilities and specialist extensions.</w:t>
       </w:r>
     </w:p>
-    <w:bookmarkEnd w:id="109"/>
     <w:bookmarkEnd w:id="110"/>
+    <w:bookmarkEnd w:id="111"/>
+    <w:bookmarkStart w:id="121" w:name="customer-revenue-and-service-excellence"/>
+    <w:p>
+      <w:pPr>
+        <w:pStyle w:val="Heading1"/>
+      </w:pPr>
+      <w:r>
+        <w:t xml:space="preserve">Customer Revenue and Service Excellence</w:t>
+      </w:r>
+    </w:p>
+    <w:bookmarkStart w:id="112" w:name="purpose"/>
+    <w:p>
+      <w:pPr>
+        <w:pStyle w:val="Heading2"/>
+      </w:pPr>
+      <w:r>
+        <w:t xml:space="preserve">Purpose</w:t>
+      </w:r>
+    </w:p>
+    <w:p>
+      <w:pPr>
+        <w:pStyle w:val="FirstParagraph"/>
+      </w:pPr>
+      <w:r>
+        <w:t xml:space="preserve">Longhorn ERP must treat CRM as a first-class capability, not a lightweight lead tracker. The product needs a world-class customer-facing workspace that helps organisations win, retain, and serve customers while staying tightly connected to ERP execution and financial truth.</w:t>
+      </w:r>
+    </w:p>
+    <w:bookmarkEnd w:id="112"/>
+    <w:bookmarkStart w:id="113" w:name="crm-position-in-longhorn-erp"/>
+    <w:p>
+      <w:pPr>
+        <w:pStyle w:val="Heading2"/>
+      </w:pPr>
+      <w:r>
+        <w:t xml:space="preserve">CRM Position in Longhorn ERP</w:t>
+      </w:r>
+    </w:p>
+    <w:p>
+      <w:pPr>
+        <w:pStyle w:val="FirstParagraph"/>
+      </w:pPr>
+      <w:r>
+        <w:t xml:space="preserve">Within Longhorn ERP,</w:t>
+      </w:r>
+      <w:r>
+        <w:t xml:space="preserve"> </w:t>
+      </w:r>
+      <w:r>
+        <w:rPr>
+          <w:rStyle w:val="VerbatimChar"/>
+        </w:rPr>
+        <w:t xml:space="preserve">SALES_CRM</w:t>
+      </w:r>
+      <w:r>
+        <w:t xml:space="preserve"> </w:t>
+      </w:r>
+      <w:r>
+        <w:t xml:space="preserve">is both:</w:t>
+      </w:r>
+    </w:p>
+    <w:p>
+      <w:pPr>
+        <w:pStyle w:val="Compact"/>
+        <w:numPr>
+          <w:ilvl w:val="0"/>
+          <w:numId w:val="1028"/>
+        </w:numPr>
+      </w:pPr>
+      <w:r>
+        <w:t xml:space="preserve">the system of record for customer-facing relationship objects and intent</w:t>
+      </w:r>
+    </w:p>
+    <w:p>
+      <w:pPr>
+        <w:pStyle w:val="Compact"/>
+        <w:numPr>
+          <w:ilvl w:val="0"/>
+          <w:numId w:val="1028"/>
+        </w:numPr>
+      </w:pPr>
+      <w:r>
+        <w:t xml:space="preserve">the engagement system used by commercial and service teams to coordinate work, commitments, and follow-up</w:t>
+      </w:r>
+    </w:p>
+    <w:p>
+      <w:pPr>
+        <w:pStyle w:val="FirstParagraph"/>
+      </w:pPr>
+      <w:r>
+        <w:t xml:space="preserve">This means CRM is where teams understand who the customer is, what the relationship looks like, what is being pursued, what commitments have been made, what service issues are open, and what actions happen next.</w:t>
+      </w:r>
+    </w:p>
+    <w:bookmarkEnd w:id="113"/>
+    <w:bookmarkStart w:id="114" w:name="boundary-model"/>
+    <w:p>
+      <w:pPr>
+        <w:pStyle w:val="Heading2"/>
+      </w:pPr>
+      <w:r>
+        <w:t xml:space="preserve">Boundary Model</w:t>
+      </w:r>
+    </w:p>
+    <w:p>
+      <w:pPr>
+        <w:pStyle w:val="FirstParagraph"/>
+      </w:pPr>
+      <w:r>
+        <w:t xml:space="preserve">Longhorn ERP must keep the CRM boundary explicit:</w:t>
+      </w:r>
+    </w:p>
+    <w:p>
+      <w:pPr>
+        <w:pStyle w:val="Compact"/>
+        <w:numPr>
+          <w:ilvl w:val="0"/>
+          <w:numId w:val="1029"/>
+        </w:numPr>
+      </w:pPr>
+      <w:r>
+        <w:rPr>
+          <w:rStyle w:val="VerbatimChar"/>
+        </w:rPr>
+        <w:t xml:space="preserve">SALES_CRM</w:t>
+      </w:r>
+      <w:r>
+        <w:t xml:space="preserve"> </w:t>
+      </w:r>
+      <w:r>
+        <w:t xml:space="preserve">owns relationship intent, engagement workflow, revenue pursuit discipline, service interaction history, and customer-facing coordination</w:t>
+      </w:r>
+    </w:p>
+    <w:p>
+      <w:pPr>
+        <w:pStyle w:val="Compact"/>
+        <w:numPr>
+          <w:ilvl w:val="0"/>
+          <w:numId w:val="1029"/>
+        </w:numPr>
+      </w:pPr>
+      <w:r>
+        <w:t xml:space="preserve">core ERP modules own operational execution and financial truth, including orders, inventory commitments, delivery execution, billing, receipts, and accounting outcomes</w:t>
+      </w:r>
+    </w:p>
+    <w:p>
+      <w:pPr>
+        <w:pStyle w:val="FirstParagraph"/>
+      </w:pPr>
+      <w:r>
+        <w:t xml:space="preserve">This separation is important. It prevents CRM from becoming a second operational ledger and prevents ERP execution modules from absorbing customer-engagement workflow that needs a different operating model.</w:t>
+      </w:r>
+    </w:p>
+    <w:bookmarkEnd w:id="114"/>
+    <w:bookmarkStart w:id="115" w:name="core-crm-object-model"/>
+    <w:p>
+      <w:pPr>
+        <w:pStyle w:val="Heading2"/>
+      </w:pPr>
+      <w:r>
+        <w:t xml:space="preserve">Core CRM Object Model</w:t>
+      </w:r>
+    </w:p>
+    <w:p>
+      <w:pPr>
+        <w:pStyle w:val="FirstParagraph"/>
+      </w:pPr>
+      <w:r>
+        <w:t xml:space="preserve">World-class CRM in Longhorn ERP is built around a durable shared object model:</w:t>
+      </w:r>
+    </w:p>
+    <w:p>
+      <w:pPr>
+        <w:pStyle w:val="Compact"/>
+        <w:numPr>
+          <w:ilvl w:val="0"/>
+          <w:numId w:val="1030"/>
+        </w:numPr>
+      </w:pPr>
+      <w:r>
+        <w:rPr>
+          <w:rStyle w:val="VerbatimChar"/>
+        </w:rPr>
+        <w:t xml:space="preserve">Accounts</w:t>
+      </w:r>
+      <w:r>
+        <w:t xml:space="preserve"> </w:t>
+      </w:r>
+      <w:r>
+        <w:t xml:space="preserve">represent customer organisations, prospects, partners, distributors, resellers, and strategic relationships</w:t>
+      </w:r>
+    </w:p>
+    <w:p>
+      <w:pPr>
+        <w:pStyle w:val="Compact"/>
+        <w:numPr>
+          <w:ilvl w:val="0"/>
+          <w:numId w:val="1030"/>
+        </w:numPr>
+      </w:pPr>
+      <w:r>
+        <w:rPr>
+          <w:rStyle w:val="VerbatimChar"/>
+        </w:rPr>
+        <w:t xml:space="preserve">Contacts</w:t>
+      </w:r>
+      <w:r>
+        <w:t xml:space="preserve"> </w:t>
+      </w:r>
+      <w:r>
+        <w:t xml:space="preserve">represent individual people, roles, influence maps, communication preferences, and relationship history</w:t>
+      </w:r>
+    </w:p>
+    <w:p>
+      <w:pPr>
+        <w:pStyle w:val="Compact"/>
+        <w:numPr>
+          <w:ilvl w:val="0"/>
+          <w:numId w:val="1030"/>
+        </w:numPr>
+      </w:pPr>
+      <w:r>
+        <w:rPr>
+          <w:rStyle w:val="VerbatimChar"/>
+        </w:rPr>
+        <w:t xml:space="preserve">Leads</w:t>
+      </w:r>
+      <w:r>
+        <w:t xml:space="preserve"> </w:t>
+      </w:r>
+      <w:r>
+        <w:t xml:space="preserve">represent early-stage demand signals and qualification workflows before account and opportunity maturity</w:t>
+      </w:r>
+    </w:p>
+    <w:p>
+      <w:pPr>
+        <w:pStyle w:val="Compact"/>
+        <w:numPr>
+          <w:ilvl w:val="0"/>
+          <w:numId w:val="1030"/>
+        </w:numPr>
+      </w:pPr>
+      <w:r>
+        <w:rPr>
+          <w:rStyle w:val="VerbatimChar"/>
+        </w:rPr>
+        <w:t xml:space="preserve">Opportunities</w:t>
+      </w:r>
+      <w:r>
+        <w:t xml:space="preserve"> </w:t>
+      </w:r>
+      <w:r>
+        <w:t xml:space="preserve">represent governed revenue pursuits with stage, value, probability, competition, forecast category, and next-step discipline</w:t>
+      </w:r>
+    </w:p>
+    <w:p>
+      <w:pPr>
+        <w:pStyle w:val="Compact"/>
+        <w:numPr>
+          <w:ilvl w:val="0"/>
+          <w:numId w:val="1030"/>
+        </w:numPr>
+      </w:pPr>
+      <w:r>
+        <w:rPr>
+          <w:rStyle w:val="VerbatimChar"/>
+        </w:rPr>
+        <w:t xml:space="preserve">Cases</w:t>
+      </w:r>
+      <w:r>
+        <w:t xml:space="preserve"> </w:t>
+      </w:r>
+      <w:r>
+        <w:t xml:space="preserve">represent service issues, complaints, requests, and commitments requiring ownership, response, and resolution tracking</w:t>
+      </w:r>
+    </w:p>
+    <w:p>
+      <w:pPr>
+        <w:pStyle w:val="Compact"/>
+        <w:numPr>
+          <w:ilvl w:val="0"/>
+          <w:numId w:val="1030"/>
+        </w:numPr>
+      </w:pPr>
+      <w:r>
+        <w:rPr>
+          <w:rStyle w:val="VerbatimChar"/>
+        </w:rPr>
+        <w:t xml:space="preserve">Activities</w:t>
+      </w:r>
+      <w:r>
+        <w:t xml:space="preserve"> </w:t>
+      </w:r>
+      <w:r>
+        <w:t xml:space="preserve">represent calls, meetings, tasks, emails, visits, field actions, follow-ups, and collaboration records tied to customer context</w:t>
+      </w:r>
+    </w:p>
+    <w:p>
+      <w:pPr>
+        <w:pStyle w:val="FirstParagraph"/>
+      </w:pPr>
+      <w:r>
+        <w:t xml:space="preserve">This object model gives Longhorn ERP a usable customer memory across sales, service, and partner-facing teams.</w:t>
+      </w:r>
+    </w:p>
+    <w:bookmarkEnd w:id="115"/>
+    <w:bookmarkStart w:id="116" w:name="revenue-outcomes"/>
+    <w:p>
+      <w:pPr>
+        <w:pStyle w:val="Heading2"/>
+      </w:pPr>
+      <w:r>
+        <w:t xml:space="preserve">Revenue Outcomes</w:t>
+      </w:r>
+    </w:p>
+    <w:p>
+      <w:pPr>
+        <w:pStyle w:val="FirstParagraph"/>
+      </w:pPr>
+      <w:r>
+        <w:rPr>
+          <w:rStyle w:val="VerbatimChar"/>
+        </w:rPr>
+        <w:t xml:space="preserve">SALES_CRM</w:t>
+      </w:r>
+      <w:r>
+        <w:t xml:space="preserve"> </w:t>
+      </w:r>
+      <w:r>
+        <w:t xml:space="preserve">must support measurable revenue excellence, including:</w:t>
+      </w:r>
+    </w:p>
+    <w:p>
+      <w:pPr>
+        <w:pStyle w:val="Compact"/>
+        <w:numPr>
+          <w:ilvl w:val="0"/>
+          <w:numId w:val="1031"/>
+        </w:numPr>
+      </w:pPr>
+      <w:r>
+        <w:t xml:space="preserve">better lead-to-opportunity and opportunity-to-order conversion</w:t>
+      </w:r>
+    </w:p>
+    <w:p>
+      <w:pPr>
+        <w:pStyle w:val="Compact"/>
+        <w:numPr>
+          <w:ilvl w:val="0"/>
+          <w:numId w:val="1031"/>
+        </w:numPr>
+      </w:pPr>
+      <w:r>
+        <w:t xml:space="preserve">stronger forecast quality and pipeline predictability</w:t>
+      </w:r>
+    </w:p>
+    <w:p>
+      <w:pPr>
+        <w:pStyle w:val="Compact"/>
+        <w:numPr>
+          <w:ilvl w:val="0"/>
+          <w:numId w:val="1031"/>
+        </w:numPr>
+      </w:pPr>
+      <w:r>
+        <w:t xml:space="preserve">clearer account planning for strategic and growth accounts</w:t>
+      </w:r>
+    </w:p>
+    <w:p>
+      <w:pPr>
+        <w:pStyle w:val="Compact"/>
+        <w:numPr>
+          <w:ilvl w:val="0"/>
+          <w:numId w:val="1031"/>
+        </w:numPr>
+      </w:pPr>
+      <w:r>
+        <w:t xml:space="preserve">segmentation and prioritisation so teams focus on the right customers, prospects, territories, and channels</w:t>
+      </w:r>
+    </w:p>
+    <w:p>
+      <w:pPr>
+        <w:pStyle w:val="Compact"/>
+        <w:numPr>
+          <w:ilvl w:val="0"/>
+          <w:numId w:val="1031"/>
+        </w:numPr>
+      </w:pPr>
+      <w:r>
+        <w:t xml:space="preserve">quote-to-cash coordination so quotations, approvals, commercial follow-up, order conversion, and downstream ERP execution remain connected</w:t>
+      </w:r>
+    </w:p>
+    <w:p>
+      <w:pPr>
+        <w:pStyle w:val="Compact"/>
+        <w:numPr>
+          <w:ilvl w:val="0"/>
+          <w:numId w:val="1031"/>
+        </w:numPr>
+      </w:pPr>
+      <w:r>
+        <w:t xml:space="preserve">channel and partner readiness so indirect sales models can be managed with structure rather than side spreadsheets and messaging threads</w:t>
+      </w:r>
+    </w:p>
+    <w:p>
+      <w:pPr>
+        <w:pStyle w:val="FirstParagraph"/>
+      </w:pPr>
+      <w:r>
+        <w:t xml:space="preserve">The goal is not only more pipeline visibility. The goal is more repeatable revenue execution.</w:t>
+      </w:r>
+    </w:p>
+    <w:bookmarkEnd w:id="116"/>
+    <w:bookmarkStart w:id="117" w:name="service-and-retention-outcomes"/>
+    <w:p>
+      <w:pPr>
+        <w:pStyle w:val="Heading2"/>
+      </w:pPr>
+      <w:r>
+        <w:t xml:space="preserve">Service and Retention Outcomes</w:t>
+      </w:r>
+    </w:p>
+    <w:p>
+      <w:pPr>
+        <w:pStyle w:val="FirstParagraph"/>
+      </w:pPr>
+      <w:r>
+        <w:t xml:space="preserve">CRM must also support service excellence and customer retention. Longhorn ERP should position</w:t>
+      </w:r>
+      <w:r>
+        <w:t xml:space="preserve"> </w:t>
+      </w:r>
+      <w:r>
+        <w:rPr>
+          <w:rStyle w:val="VerbatimChar"/>
+        </w:rPr>
+        <w:t xml:space="preserve">SALES_CRM</w:t>
+      </w:r>
+      <w:r>
+        <w:t xml:space="preserve"> </w:t>
+      </w:r>
+      <w:r>
+        <w:t xml:space="preserve">to deliver:</w:t>
+      </w:r>
+    </w:p>
+    <w:p>
+      <w:pPr>
+        <w:pStyle w:val="Compact"/>
+        <w:numPr>
+          <w:ilvl w:val="0"/>
+          <w:numId w:val="1032"/>
+        </w:numPr>
+      </w:pPr>
+      <w:r>
+        <w:t xml:space="preserve">governed case intake, assignment, escalation, and closure</w:t>
+      </w:r>
+    </w:p>
+    <w:p>
+      <w:pPr>
+        <w:pStyle w:val="Compact"/>
+        <w:numPr>
+          <w:ilvl w:val="0"/>
+          <w:numId w:val="1032"/>
+        </w:numPr>
+      </w:pPr>
+      <w:r>
+        <w:t xml:space="preserve">SLA discipline with response and resolution visibility</w:t>
+      </w:r>
+    </w:p>
+    <w:p>
+      <w:pPr>
+        <w:pStyle w:val="Compact"/>
+        <w:numPr>
+          <w:ilvl w:val="0"/>
+          <w:numId w:val="1032"/>
+        </w:numPr>
+      </w:pPr>
+      <w:r>
+        <w:t xml:space="preserve">full activity history so customer commitments are visible and auditable</w:t>
+      </w:r>
+    </w:p>
+    <w:p>
+      <w:pPr>
+        <w:pStyle w:val="Compact"/>
+        <w:numPr>
+          <w:ilvl w:val="0"/>
+          <w:numId w:val="1032"/>
+        </w:numPr>
+      </w:pPr>
+      <w:r>
+        <w:t xml:space="preserve">retention support through issue pattern visibility, relationship risk awareness, and coordinated follow-up</w:t>
+      </w:r>
+    </w:p>
+    <w:p>
+      <w:pPr>
+        <w:pStyle w:val="Compact"/>
+        <w:numPr>
+          <w:ilvl w:val="0"/>
+          <w:numId w:val="1032"/>
+        </w:numPr>
+      </w:pPr>
+      <w:r>
+        <w:t xml:space="preserve">a common working surface for commercial, support, and account teams when customer outcomes cross departmental lines</w:t>
+      </w:r>
+    </w:p>
+    <w:p>
+      <w:pPr>
+        <w:pStyle w:val="FirstParagraph"/>
+      </w:pPr>
+      <w:r>
+        <w:t xml:space="preserve">This makes CRM relevant after the sale, not only before it.</w:t>
+      </w:r>
+    </w:p>
+    <w:bookmarkEnd w:id="117"/>
+    <w:bookmarkStart w:id="118" w:name="operating-model-implications"/>
+    <w:p>
+      <w:pPr>
+        <w:pStyle w:val="Heading2"/>
+      </w:pPr>
+      <w:r>
+        <w:t xml:space="preserve">Operating-Model Implications</w:t>
+      </w:r>
+    </w:p>
+    <w:p>
+      <w:pPr>
+        <w:pStyle w:val="FirstParagraph"/>
+      </w:pPr>
+      <w:r>
+        <w:t xml:space="preserve">To compete seriously, Longhorn ERP should support CRM working methods that go beyond simple pipeline boards:</w:t>
+      </w:r>
+    </w:p>
+    <w:p>
+      <w:pPr>
+        <w:pStyle w:val="Compact"/>
+        <w:numPr>
+          <w:ilvl w:val="0"/>
+          <w:numId w:val="1033"/>
+        </w:numPr>
+      </w:pPr>
+      <w:r>
+        <w:t xml:space="preserve">account planning and relationship mapping for named or strategic accounts</w:t>
+      </w:r>
+    </w:p>
+    <w:p>
+      <w:pPr>
+        <w:pStyle w:val="Compact"/>
+        <w:numPr>
+          <w:ilvl w:val="0"/>
+          <w:numId w:val="1033"/>
+        </w:numPr>
+      </w:pPr>
+      <w:r>
+        <w:t xml:space="preserve">segmentation models for customer value, industry, geography, route-to-market, and service priority</w:t>
+      </w:r>
+    </w:p>
+    <w:p>
+      <w:pPr>
+        <w:pStyle w:val="Compact"/>
+        <w:numPr>
+          <w:ilvl w:val="0"/>
+          <w:numId w:val="1033"/>
+        </w:numPr>
+      </w:pPr>
+      <w:r>
+        <w:t xml:space="preserve">prioritisation models for sellers, account managers, field agents, and support teams</w:t>
+      </w:r>
+    </w:p>
+    <w:p>
+      <w:pPr>
+        <w:pStyle w:val="Compact"/>
+        <w:numPr>
+          <w:ilvl w:val="0"/>
+          <w:numId w:val="1033"/>
+        </w:numPr>
+      </w:pPr>
+      <w:r>
+        <w:t xml:space="preserve">activity governance so important customer interactions are captured consistently</w:t>
+      </w:r>
+    </w:p>
+    <w:p>
+      <w:pPr>
+        <w:pStyle w:val="Compact"/>
+        <w:numPr>
+          <w:ilvl w:val="0"/>
+          <w:numId w:val="1033"/>
+        </w:numPr>
+      </w:pPr>
+      <w:r>
+        <w:t xml:space="preserve">partner and channel workflows where distributors, agents, dealers, or resellers shape revenue execution</w:t>
+      </w:r>
+    </w:p>
+    <w:p>
+      <w:pPr>
+        <w:pStyle w:val="FirstParagraph"/>
+      </w:pPr>
+      <w:r>
+        <w:t xml:space="preserve">These capabilities are especially important for African organisations that combine direct sales, field sales, distributor channels, mobile-first engagement, and service-heavy customer relationships.</w:t>
+      </w:r>
+    </w:p>
+    <w:bookmarkEnd w:id="118"/>
+    <w:bookmarkStart w:id="119" w:name="longhorn-erp-product-direction"/>
+    <w:p>
+      <w:pPr>
+        <w:pStyle w:val="Heading2"/>
+      </w:pPr>
+      <w:r>
+        <w:t xml:space="preserve">Longhorn ERP Product Direction</w:t>
+      </w:r>
+    </w:p>
+    <w:p>
+      <w:pPr>
+        <w:pStyle w:val="FirstParagraph"/>
+      </w:pPr>
+      <w:r>
+        <w:t xml:space="preserve">The Longhorn ERP architecture should remain additive and coherent:</w:t>
+      </w:r>
+    </w:p>
+    <w:p>
+      <w:pPr>
+        <w:pStyle w:val="Compact"/>
+        <w:numPr>
+          <w:ilvl w:val="0"/>
+          <w:numId w:val="1034"/>
+        </w:numPr>
+      </w:pPr>
+      <w:r>
+        <w:rPr>
+          <w:rStyle w:val="VerbatimChar"/>
+        </w:rPr>
+        <w:t xml:space="preserve">SALES_CRM</w:t>
+      </w:r>
+      <w:r>
+        <w:t xml:space="preserve"> </w:t>
+      </w:r>
+      <w:r>
+        <w:t xml:space="preserve">becomes the front-office relationship and engagement layer</w:t>
+      </w:r>
+    </w:p>
+    <w:p>
+      <w:pPr>
+        <w:pStyle w:val="Compact"/>
+        <w:numPr>
+          <w:ilvl w:val="0"/>
+          <w:numId w:val="1034"/>
+        </w:numPr>
+      </w:pPr>
+      <w:r>
+        <w:rPr>
+          <w:rStyle w:val="VerbatimChar"/>
+        </w:rPr>
+        <w:t xml:space="preserve">SALES</w:t>
+      </w:r>
+      <w:r>
+        <w:t xml:space="preserve"> </w:t>
+      </w:r>
+      <w:r>
+        <w:t xml:space="preserve">remains the core commercial transaction layer for quotations, sales orders, delivery, invoicing, and receivables handoff</w:t>
+      </w:r>
+    </w:p>
+    <w:p>
+      <w:pPr>
+        <w:pStyle w:val="Compact"/>
+        <w:numPr>
+          <w:ilvl w:val="0"/>
+          <w:numId w:val="1034"/>
+        </w:numPr>
+      </w:pPr>
+      <w:r>
+        <w:rPr>
+          <w:rStyle w:val="VerbatimChar"/>
+        </w:rPr>
+        <w:t xml:space="preserve">ACCOUNTING</w:t>
+      </w:r>
+      <w:r>
+        <w:t xml:space="preserve"> </w:t>
+      </w:r>
+      <w:r>
+        <w:t xml:space="preserve">remains the financial source of truth</w:t>
+      </w:r>
+    </w:p>
+    <w:p>
+      <w:pPr>
+        <w:pStyle w:val="Compact"/>
+        <w:numPr>
+          <w:ilvl w:val="0"/>
+          <w:numId w:val="1034"/>
+        </w:numPr>
+      </w:pPr>
+      <w:r>
+        <w:rPr>
+          <w:rStyle w:val="VerbatimChar"/>
+        </w:rPr>
+        <w:t xml:space="preserve">PROJECTS</w:t>
+      </w:r>
+      <w:r>
+        <w:t xml:space="preserve">,</w:t>
+      </w:r>
+      <w:r>
+        <w:t xml:space="preserve"> </w:t>
+      </w:r>
+      <w:r>
+        <w:rPr>
+          <w:rStyle w:val="VerbatimChar"/>
+        </w:rPr>
+        <w:t xml:space="preserve">TRANSPORTATION</w:t>
+      </w:r>
+      <w:r>
+        <w:t xml:space="preserve">,</w:t>
+      </w:r>
+      <w:r>
+        <w:t xml:space="preserve"> </w:t>
+      </w:r>
+      <w:r>
+        <w:rPr>
+          <w:rStyle w:val="VerbatimChar"/>
+        </w:rPr>
+        <w:t xml:space="preserve">INVENTORY</w:t>
+      </w:r>
+      <w:r>
+        <w:t xml:space="preserve">, and other execution modules remain responsible for downstream operational fulfilment where relevant</w:t>
+      </w:r>
+    </w:p>
+    <w:p>
+      <w:pPr>
+        <w:pStyle w:val="FirstParagraph"/>
+      </w:pPr>
+      <w:r>
+        <w:t xml:space="preserve">This gives Longhorn ERP a credible CRM posture without collapsing customer engagement, operational execution, and accounting into one ambiguous workflow surface.</w:t>
+      </w:r>
+    </w:p>
+    <w:bookmarkEnd w:id="119"/>
+    <w:bookmarkStart w:id="120" w:name="strategic-outcome"/>
+    <w:p>
+      <w:pPr>
+        <w:pStyle w:val="Heading2"/>
+      </w:pPr>
+      <w:r>
+        <w:t xml:space="preserve">Strategic Outcome</w:t>
+      </w:r>
+    </w:p>
+    <w:p>
+      <w:pPr>
+        <w:pStyle w:val="FirstParagraph"/>
+      </w:pPr>
+      <w:r>
+        <w:t xml:space="preserve">Longhorn ERP should be able to say that it supports the full customer lifecycle:</w:t>
+      </w:r>
+    </w:p>
+    <w:p>
+      <w:pPr>
+        <w:pStyle w:val="Compact"/>
+        <w:numPr>
+          <w:ilvl w:val="0"/>
+          <w:numId w:val="1035"/>
+        </w:numPr>
+      </w:pPr>
+      <w:r>
+        <w:t xml:space="preserve">identify and qualify demand</w:t>
+      </w:r>
+    </w:p>
+    <w:p>
+      <w:pPr>
+        <w:pStyle w:val="Compact"/>
+        <w:numPr>
+          <w:ilvl w:val="0"/>
+          <w:numId w:val="1035"/>
+        </w:numPr>
+      </w:pPr>
+      <w:r>
+        <w:t xml:space="preserve">pursue and forecast revenue</w:t>
+      </w:r>
+    </w:p>
+    <w:p>
+      <w:pPr>
+        <w:pStyle w:val="Compact"/>
+        <w:numPr>
+          <w:ilvl w:val="0"/>
+          <w:numId w:val="1035"/>
+        </w:numPr>
+      </w:pPr>
+      <w:r>
+        <w:t xml:space="preserve">convert quotations into executable business</w:t>
+      </w:r>
+    </w:p>
+    <w:p>
+      <w:pPr>
+        <w:pStyle w:val="Compact"/>
+        <w:numPr>
+          <w:ilvl w:val="0"/>
+          <w:numId w:val="1035"/>
+        </w:numPr>
+      </w:pPr>
+      <w:r>
+        <w:t xml:space="preserve">coordinate fulfilment through ERP modules</w:t>
+      </w:r>
+    </w:p>
+    <w:p>
+      <w:pPr>
+        <w:pStyle w:val="Compact"/>
+        <w:numPr>
+          <w:ilvl w:val="0"/>
+          <w:numId w:val="1035"/>
+        </w:numPr>
+      </w:pPr>
+      <w:r>
+        <w:t xml:space="preserve">resolve service issues with SLA discipline</w:t>
+      </w:r>
+    </w:p>
+    <w:p>
+      <w:pPr>
+        <w:pStyle w:val="Compact"/>
+        <w:numPr>
+          <w:ilvl w:val="0"/>
+          <w:numId w:val="1035"/>
+        </w:numPr>
+      </w:pPr>
+      <w:r>
+        <w:t xml:space="preserve">retain and grow customer value through informed account management</w:t>
+      </w:r>
+    </w:p>
+    <w:p>
+      <w:pPr>
+        <w:pStyle w:val="FirstParagraph"/>
+      </w:pPr>
+      <w:r>
+        <w:t xml:space="preserve">That is the standard required for a world-class ERP with a serious CRM capability.</w:t>
+      </w:r>
+    </w:p>
+    <w:bookmarkEnd w:id="120"/>
+    <w:bookmarkEnd w:id="121"/>
     <w:sectPr>
       <w:footerReference r:id="rId9" w:type="default"/>
       <w:headerReference r:id="rId10" w:type="default"/>
@@ -10761,6 +11712,9 @@
     <w:abstractNumId w:val="991"/>
   </w:num>
   <w:num w:numId="1024">
+    <w:abstractNumId w:val="991"/>
+  </w:num>
+  <w:num w:numId="1025">
     <w:abstractNumId w:val="99411"/>
     <w:lvlOverride w:ilvl="0">
       <w:startOverride w:val="1"/>
@@ -10790,10 +11744,34 @@
       <w:startOverride w:val="1"/>
     </w:lvlOverride>
   </w:num>
-  <w:num w:numId="1025">
+  <w:num w:numId="1026">
     <w:abstractNumId w:val="991"/>
   </w:num>
-  <w:num w:numId="1026">
+  <w:num w:numId="1027">
+    <w:abstractNumId w:val="991"/>
+  </w:num>
+  <w:num w:numId="1028">
+    <w:abstractNumId w:val="991"/>
+  </w:num>
+  <w:num w:numId="1029">
+    <w:abstractNumId w:val="991"/>
+  </w:num>
+  <w:num w:numId="1030">
+    <w:abstractNumId w:val="991"/>
+  </w:num>
+  <w:num w:numId="1031">
+    <w:abstractNumId w:val="991"/>
+  </w:num>
+  <w:num w:numId="1032">
+    <w:abstractNumId w:val="991"/>
+  </w:num>
+  <w:num w:numId="1033">
+    <w:abstractNumId w:val="991"/>
+  </w:num>
+  <w:num w:numId="1034">
+    <w:abstractNumId w:val="991"/>
+  </w:num>
+  <w:num w:numId="1035">
     <w:abstractNumId w:val="991"/>
   </w:num>
 </w:numbering>

</xml_diff>